<commit_message>
Update handover documents after GitHub upload
</commit_message>
<xml_diff>
--- a/docs/BAO_CAO_PHAN_TICH_THIET_KE.docx
+++ b/docs/BAO_CAO_PHAN_TICH_THIET_KE.docx
@@ -6313,7 +6313,7 @@
                 <w:b w:val="0"/>
                 <w:sz w:val="20"/>
               </w:rPr>
-              <w:t>Chưa chạy trên GitHub</w:t>
+              <w:t>Chưa xác minh kết quả trên GitHub</w:t>
             </w:r>
           </w:p>
         </w:tc>
@@ -6330,7 +6330,7 @@
                 <w:b w:val="0"/>
                 <w:sz w:val="20"/>
               </w:rPr>
-              <w:t>Đã có workflow test/build; chưa push repository</w:t>
+              <w:t>Đã có workflow test/build; xem tab Actions của repository để theo dõi</w:t>
             </w:r>
           </w:p>
         </w:tc>
@@ -7454,7 +7454,7 @@
         <w:jc w:val="both"/>
       </w:pPr>
       <w:r>
-        <w:t>Quy trình phát triển và trình diễn cốt lõi chạy được trên môi trường hiện tại, có Docker và hướng dẫn tái lập. Mã nguồn và tài liệu được lưu trong checkout; chưa được push lên GitHub hoặc triển khai công khai. Cấu hình môi trường cloud được lưu nháp để người dùng xem và publish; việc publish và phục hồi ở task mới là bước riêng, chưa được tuyên bố đã kiểm chứng.</w:t>
+        <w:t>Quy trình phát triển và trình diễn cốt lõi chạy được trên môi trường hiện tại, có Docker và hướng dẫn tái lập. Mã nguồn và tài liệu được lưu trong checkout và đã đẩy lên nhánh main của repository GitHub tunato2807-del/ptpmhdtuong theo yêu cầu người dùng. Ứng dụng chưa được triển khai thành dịch vụ công khai. Cấu hình môi trường cloud được lưu nháp để người dùng xem và publish; việc publish và phục hồi ở task mới là bước riêng, chưa được tuyên bố đã kiểm chứng.</w:t>
       </w:r>
     </w:p>
     <w:sectPr>

</xml_diff>

<commit_message>
Redesign customer experience with real photography and accessible motion
</commit_message>
<xml_diff>
--- a/docs/BAO_CAO_PHAN_TICH_THIET_KE.docx
+++ b/docs/BAO_CAO_PHAN_TICH_THIET_KE.docx
@@ -4075,7 +4075,7 @@
                 <w:b w:val="0"/>
                 <w:sz w:val="20"/>
               </w:rPr>
-              <w:t>Hero minh họa local, dịch vụ với giá/thời lượng, chi nhánh, stylist, CTA đặt lịch</w:t>
+              <w:t>Hero ảnh chụp local, chọn chi nhánh nhanh, dịch vụ có bộ lọc, bộ sưu tập cuộn ngang, stylist, CTA đặt lịch</w:t>
             </w:r>
           </w:p>
         </w:tc>
@@ -4339,7 +4339,7 @@
         <w:jc w:val="both"/>
       </w:pPr>
       <w:r>
-        <w:t>Màu chủ đạo xanh đậm #24332b, kem #f7f7f2, cam đất #bd6946. Không phụ thuộc font hoặc ảnh từ CDN. Dùng label/fieldset phù hợp, focus bàn phím, aria-live cho khung giờ, xác nhận thao tác quan trọng và chế độ in phiếu. Bảng rộng cuộn trong vùng riêng, không làm tràn cả trang trên mobile.</w:t>
+        <w:t>Giao diện khách hàng dùng nền kem #f8f7f4, chữ than #222321, cam đất #bd4c2f, font Be Vietnam Pro và ảnh chụp WebP local. Không gian vận hành giữ xanh đậm #24332b và cam đất #bd6946. Không phụ thuộc font hoặc ảnh từ CDN. Chuyển động hỗ trợ reduced motion; menu mobile và bộ lọc có trạng thái truy cập. Chi tiết bản thiết kế mới tại Giao diện khách hàng. Dùng label/fieldset phù hợp, focus bàn phím, aria-live cho khung giờ, xác nhận thao tác quan trọng và chế độ in phiếu. Bảng rộng cuộn trong vùng riêng, không làm tràn cả trang trên mobile.</w:t>
       </w:r>
     </w:p>
     <w:p>
@@ -6240,7 +6240,60 @@
                 <w:b w:val="0"/>
                 <w:sz w:val="20"/>
               </w:rPr>
-              <w:t>Desktop 1440 px, mobile 390 px, tablet 768 px; không tràn ngang toàn trang; menu mobile hoạt động</w:t>
+              <w:t>Giao diện khách hàng 320/360/390/768/1024/1440 px; không tràn ngang; menu mobile/Escape hoạt động</w:t>
+            </w:r>
+          </w:p>
+        </w:tc>
+      </w:tr>
+      <w:tr>
+        <w:tc>
+          <w:tcPr>
+            <w:tcW w:type="dxa" w:w="3061"/>
+          </w:tcPr>
+          <w:p>
+            <w:pPr>
+              <w:spacing w:line="252" w:lineRule="auto" w:after="80"/>
+            </w:pPr>
+            <w:r>
+              <w:rPr>
+                <w:b w:val="0"/>
+                <w:sz w:val="20"/>
+              </w:rPr>
+              <w:t>Customer UI smoke</w:t>
+            </w:r>
+          </w:p>
+        </w:tc>
+        <w:tc>
+          <w:tcPr>
+            <w:tcW w:type="dxa" w:w="3061"/>
+          </w:tcPr>
+          <w:p>
+            <w:pPr>
+              <w:spacing w:line="252" w:lineRule="auto" w:after="80"/>
+            </w:pPr>
+            <w:r>
+              <w:rPr>
+                <w:b w:val="0"/>
+                <w:sz w:val="20"/>
+              </w:rPr>
+              <w:t>Đạt</w:t>
+            </w:r>
+          </w:p>
+        </w:tc>
+        <w:tc>
+          <w:tcPr>
+            <w:tcW w:type="dxa" w:w="3061"/>
+          </w:tcPr>
+          <w:p>
+            <w:pPr>
+              <w:spacing w:line="252" w:lineRule="auto" w:after="80"/>
+            </w:pPr>
+            <w:r>
+              <w:rPr>
+                <w:b w:val="0"/>
+                <w:sz w:val="20"/>
+              </w:rPr>
+              <w:t>Bộ lọc, bộ sưu tập, preselect dịch vụ/stylist/chi nhánh, đăng nhập giữ lựa chọn, reduced motion, không JavaScript, ảnh/font local</w:t>
             </w:r>
           </w:p>
         </w:tc>
@@ -6465,6 +6518,14 @@
       </w:pPr>
       <w:r>
         <w:t>Các kiểm thử ban đầu phát hiện lỗi tên alias aggregate khi tính trung bình và thiếu savepoint khi bắt đánh giá trùng. Mã đã sửa và bộ test chạy lại thành công. Sau khi đổi tên 80 cột sang tiếng Việt không dấu, 35 kiểm thử và browser smoke đã chạy lại thành công; dữ liệu và kiểu dữ liệu PostgreSQL được đối chiếu trước/sau migration. Build Docker online ban đầu gặp DNS trong container; giải pháp dùng wheel tải trên host và cài offline đã build thành công. Đây là chẩn đoán và xử lý lỗi môi trường, không phải thay đổi phiên bản để né test.</w:t>
+      </w:r>
+    </w:p>
+    <w:p>
+      <w:pPr>
+        <w:jc w:val="both"/>
+      </w:pPr>
+      <w:r>
+        <w:t>Sau thiết kế lại giao diện, script check thu thập static trước khi chạy Django tests để manifest luôn chứa CSS, ảnh và font mới. Workflow GitHub tạo virtualenv trước khi gọi script này. Bộ UI smoke mới kiểm tra độc lập tương tác khách hàng; kết quả chi tiết ở docs/validation/customer-redesign.txt.</w:t>
       </w:r>
     </w:p>
     <w:p>
@@ -7367,7 +7428,7 @@
       <w:r>
         <w:drawing>
           <wp:inline xmlns:a="http://schemas.openxmlformats.org/drawingml/2006/main" xmlns:pic="http://schemas.openxmlformats.org/drawingml/2006/picture">
-            <wp:extent cx="2810156" cy="6839998"/>
+            <wp:extent cx="5760000" cy="4000000"/>
             <wp:docPr id="8" name="Picture 8"/>
             <wp:cNvGraphicFramePr>
               <a:graphicFrameLocks noChangeAspect="1"/>
@@ -7376,7 +7437,7 @@
               <a:graphicData uri="http://schemas.openxmlformats.org/drawingml/2006/picture">
                 <pic:pic>
                   <pic:nvPicPr>
-                    <pic:cNvPr id="0" name="home-desktop.png"/>
+                    <pic:cNvPr id="0" name="home-desktop-top.png"/>
                     <pic:cNvPicPr/>
                   </pic:nvPicPr>
                   <pic:blipFill>
@@ -7388,7 +7449,7 @@
                   <pic:spPr>
                     <a:xfrm>
                       <a:off x="0" y="0"/>
-                      <a:ext cx="2810156" cy="6839998"/>
+                      <a:ext cx="5760000" cy="4000000"/>
                     </a:xfrm>
                     <a:prstGeom prst="rect"/>
                   </pic:spPr>
@@ -7463,7 +7524,7 @@
       <w:r>
         <w:drawing>
           <wp:inline xmlns:a="http://schemas.openxmlformats.org/drawingml/2006/main" xmlns:pic="http://schemas.openxmlformats.org/drawingml/2006/picture">
-            <wp:extent cx="4849630" cy="6839999"/>
+            <wp:extent cx="4545269" cy="6839999"/>
             <wp:docPr id="10" name="Picture 10"/>
             <wp:cNvGraphicFramePr>
               <a:graphicFrameLocks noChangeAspect="1"/>
@@ -7484,7 +7545,7 @@
                   <pic:spPr>
                     <a:xfrm>
                       <a:off x="0" y="0"/>
-                      <a:ext cx="4849630" cy="6839999"/>
+                      <a:ext cx="4545269" cy="6839999"/>
                     </a:xfrm>
                     <a:prstGeom prst="rect"/>
                   </pic:spPr>
@@ -14361,8 +14422,698 @@
         <w:t>Các ràng buộc khoảng thời gian, check constraint và unique theo nhiều cột vẫn được mô tả trong 02-THIET-KE.md và định nghĩa trong salon/models.py.</w:t>
       </w:r>
     </w:p>
+    <w:p>
+      <w:r>
+        <w:br w:type="page"/>
+      </w:r>
+    </w:p>
+    <w:p>
+      <w:pPr>
+        <w:pStyle w:val="Heading1"/>
+      </w:pPr>
+      <w:r>
+        <w:t>Giao diện khách hàng</w:t>
+      </w:r>
+    </w:p>
+    <w:p>
+      <w:pPr>
+        <w:pStyle w:val="Heading2"/>
+      </w:pPr>
+      <w:r>
+        <w:t>1. Định hướng</w:t>
+      </w:r>
+    </w:p>
+    <w:p>
+      <w:pPr>
+        <w:jc w:val="both"/>
+      </w:pPr>
+      <w:r>
+        <w:t>Yêu cầu: tham khảo Fresha và 30Shine, giao diện tự nhiên, dùng ảnh chụp thật và có chuyển động. Hai địa chỉ được người dùng cung cấp:</w:t>
+      </w:r>
+    </w:p>
+    <w:p>
+      <w:pPr>
+        <w:pStyle w:val="ListBullet"/>
+      </w:pPr>
+      <w:r>
+        <w:t>https://www.fresha.com/lp/en/bt/hair-salons/in/vietnam</w:t>
+      </w:r>
+    </w:p>
+    <w:p>
+      <w:pPr>
+        <w:pStyle w:val="ListBullet"/>
+      </w:pPr>
+      <w:r>
+        <w:t>https://30shine.com/</w:t>
+      </w:r>
+    </w:p>
+    <w:p>
+      <w:pPr>
+        <w:jc w:val="both"/>
+      </w:pPr>
+      <w:r>
+        <w:t>Môi trường cloud trả HTTP 403 tại proxy khi truy cập hai tên miền trong lần thực hiện này. Vì vậy bản thiết kế chưa được đối chiếu trực tiếp với phiên bản hiện tại của hai website. Không sao chép logo, nội dung đánh giá hoặc ảnh của hai thương hiệu. Hướng thiết kế sử dụng thẻ dịch vụ dễ khám phá, ảnh barber lớn, thanh chọn chi nhánh và đường dẫn đặt lịch rõ ràng.</w:t>
+      </w:r>
+    </w:p>
+    <w:p>
+      <w:pPr>
+        <w:pStyle w:val="Heading2"/>
+      </w:pPr>
+      <w:r>
+        <w:t>2. Thiết kế đã triển khai</w:t>
+      </w:r>
+    </w:p>
+    <w:p>
+      <w:pPr>
+        <w:pStyle w:val="ListBullet"/>
+      </w:pPr>
+      <w:r>
+        <w:t>Nhận diện GENTLEMAN: nền kem #f8f7f4, chữ than #222321, cam đất #bd4c2f, vùng bộ sưu tập xanh xám nhạt. Font Be Vietnam Pro lưu trong dự án, hỗ trợ đầy đủ dấu tiếng Việt.</w:t>
+      </w:r>
+    </w:p>
+    <w:p>
+      <w:pPr>
+        <w:pStyle w:val="ListBullet"/>
+      </w:pPr>
+      <w:r>
+        <w:t>Trang chủ: hero ảnh thật, thanh đặt lịch nhanh theo chi nhánh, dịch vụ có bộ lọc, bộ sưu tập phong cách kéo ngang, thông tin chi nhánh, đội ngũ stylist, hướng dẫn ba bước và lời mời đặt lịch.</w:t>
+      </w:r>
+    </w:p>
+    <w:p>
+      <w:pPr>
+        <w:pStyle w:val="ListBullet"/>
+      </w:pPr>
+      <w:r>
+        <w:t>Thẻ dịch vụ dùng tên, giá, thời lượng thực từ PostgreSQL. Nút chọn dịch vụ chuyển vào biểu mẫu với dịch vụ đã được chọn. Chọn stylist chuyển cả chi nhánh và stylist tương ứng. Khách chưa đăng nhập được chuyển qua đăng nhập, giữ URL đặt lịch.</w:t>
+      </w:r>
+    </w:p>
+    <w:p>
+      <w:pPr>
+        <w:pStyle w:val="ListBullet"/>
+      </w:pPr>
+      <w:r>
+        <w:t>Ảnh stock là ảnh minh họa hoạt động barber; không nhận là ảnh thật của chi nhánh hoặc chân dung nhân viên trong dữ liệu mẫu. Tên stylist được trình bày với chữ viết tắt riêng. Chỉ số đánh giá lấy từ database; chế độ demo ghi rõ dữ liệu mẫu.</w:t>
+      </w:r>
+    </w:p>
+    <w:p>
+      <w:pPr>
+        <w:pStyle w:val="ListBullet"/>
+      </w:pPr>
+      <w:r>
+        <w:t>Trang đặt lịch: ba phần rõ ràng, thẻ tóm tắt có ảnh, lựa chọn dịch vụ, khung giờ và tổng tiền cập nhật theo luồng hiện có. Không hiển thị CTA nổi che biểu mẫu trên trang này.</w:t>
+      </w:r>
+    </w:p>
+    <w:p>
+      <w:pPr>
+        <w:pStyle w:val="ListBullet"/>
+      </w:pPr>
+      <w:r>
+        <w:t>Đăng nhập, đăng ký, lịch cá nhân, chi tiết và hóa đơn dùng chung nhận diện khách hàng. CSS mới được giới hạn trong .customer-app, giữ không gian vận hành riêng.</w:t>
+      </w:r>
+    </w:p>
+    <w:p>
+      <w:pPr>
+        <w:pStyle w:val="Heading2"/>
+      </w:pPr>
+      <w:r>
+        <w:t>3. Chuyển động và khả năng sử dụng</w:t>
+      </w:r>
+    </w:p>
+    <w:p>
+      <w:pPr>
+        <w:pStyle w:val="ListBullet"/>
+      </w:pPr>
+      <w:r>
+        <w:t>Ảnh hero xuất hiện nhẹ; các phần tiếp theo hiện dần khi cuộn bằng IntersectionObserver.</w:t>
+      </w:r>
+    </w:p>
+    <w:p>
+      <w:pPr>
+        <w:pStyle w:val="ListBullet"/>
+      </w:pPr>
+      <w:r>
+        <w:t>Ảnh dịch vụ/phong cách phóng nhẹ khi hover; nút và thẻ có chuyển tiếp ngắn.</w:t>
+      </w:r>
+    </w:p>
+    <w:p>
+      <w:pPr>
+        <w:pStyle w:val="ListBullet"/>
+      </w:pPr>
+      <w:r>
+        <w:t>Bộ sưu tập hỗ trợ nút trước/sau, kéo ngang tự nhiên, scroll snap và phím mũi tên khi vùng bộ sưu tập được focus. Không tự chạy liên tục.</w:t>
+      </w:r>
+    </w:p>
+    <w:p>
+      <w:pPr>
+        <w:pStyle w:val="ListBullet"/>
+      </w:pPr>
+      <w:r>
+        <w:t>Menu mobile có aria-expanded, đóng bằng Escape hoặc khi chọn liên kết; Escape trả focus về nút menu.</w:t>
+      </w:r>
+    </w:p>
+    <w:p>
+      <w:pPr>
+        <w:pStyle w:val="ListBullet"/>
+      </w:pPr>
+      <w:r>
+        <w:t>prefers-reduced-motion: reduce tắt chuyển động và hiển thị ngay các phần nội dung, kể cả khi đổi tùy chọn trong phiên.</w:t>
+      </w:r>
+    </w:p>
+    <w:p>
+      <w:pPr>
+        <w:pStyle w:val="ListBullet"/>
+      </w:pPr>
+      <w:r>
+        <w:t>Không có JavaScript: menu và toàn bộ dịch vụ vẫn đọc được, liên kết vẫn hoạt động; bộ lọc và nút cuộn tăng cường được ẩn. Chọn giờ đặt lịch vẫn cần JavaScript như bản trước.</w:t>
+      </w:r>
+    </w:p>
+    <w:p>
+      <w:pPr>
+        <w:pStyle w:val="ListBullet"/>
+      </w:pPr>
+      <w:r>
+        <w:t>Ảnh WebP, có kích thước khai báo, lazy loading dưới phần đầu; ảnh hero ưu tiên tải. Sáu ảnh tổng khoảng 300 KB. Font và ảnh được phục vụ từ static local, không cần CDN khi khách mở trang.</w:t>
+      </w:r>
+    </w:p>
+    <w:p>
+      <w:pPr>
+        <w:pStyle w:val="Heading2"/>
+      </w:pPr>
+      <w:r>
+        <w:t>4. Mã nguồn và kiểm tra</w:t>
+      </w:r>
+    </w:p>
+    <w:tbl>
+      <w:tblPr>
+        <w:tblStyle w:val="TableGrid"/>
+        <w:tblW w:type="auto" w:w="0"/>
+        <w:tblLook w:firstColumn="1" w:firstRow="1" w:lastColumn="0" w:lastRow="0" w:noHBand="0" w:noVBand="1" w:val="04A0"/>
+      </w:tblPr>
+      <w:tblGrid>
+        <w:gridCol w:w="4592"/>
+        <w:gridCol w:w="4592"/>
+      </w:tblGrid>
+      <w:tr>
+        <w:tc>
+          <w:tcPr>
+            <w:tcW w:type="dxa" w:w="4592"/>
+          </w:tcPr>
+          <w:p>
+            <w:pPr>
+              <w:spacing w:line="252" w:lineRule="auto" w:after="80"/>
+            </w:pPr>
+            <w:r>
+              <w:rPr>
+                <w:b/>
+                <w:sz w:val="20"/>
+              </w:rPr>
+              <w:t>Thành phần</w:t>
+            </w:r>
+          </w:p>
+        </w:tc>
+        <w:tc>
+          <w:tcPr>
+            <w:tcW w:type="dxa" w:w="4592"/>
+          </w:tcPr>
+          <w:p>
+            <w:pPr>
+              <w:spacing w:line="252" w:lineRule="auto" w:after="80"/>
+            </w:pPr>
+            <w:r>
+              <w:rPr>
+                <w:b/>
+                <w:sz w:val="20"/>
+              </w:rPr>
+              <w:t>Vị trí</w:t>
+            </w:r>
+          </w:p>
+        </w:tc>
+      </w:tr>
+      <w:tr>
+        <w:tc>
+          <w:tcPr>
+            <w:tcW w:type="dxa" w:w="4592"/>
+          </w:tcPr>
+          <w:p>
+            <w:pPr>
+              <w:spacing w:line="252" w:lineRule="auto" w:after="80"/>
+            </w:pPr>
+            <w:r>
+              <w:rPr>
+                <w:b w:val="0"/>
+                <w:sz w:val="20"/>
+              </w:rPr>
+              <w:t>Bố cục/header/footer</w:t>
+            </w:r>
+          </w:p>
+        </w:tc>
+        <w:tc>
+          <w:tcPr>
+            <w:tcW w:type="dxa" w:w="4592"/>
+          </w:tcPr>
+          <w:p>
+            <w:pPr>
+              <w:spacing w:line="252" w:lineRule="auto" w:after="80"/>
+            </w:pPr>
+            <w:r>
+              <w:rPr>
+                <w:b w:val="0"/>
+                <w:sz w:val="20"/>
+              </w:rPr>
+              <w:t>templates/base.html</w:t>
+            </w:r>
+          </w:p>
+        </w:tc>
+      </w:tr>
+      <w:tr>
+        <w:tc>
+          <w:tcPr>
+            <w:tcW w:type="dxa" w:w="4592"/>
+          </w:tcPr>
+          <w:p>
+            <w:pPr>
+              <w:spacing w:line="252" w:lineRule="auto" w:after="80"/>
+            </w:pPr>
+            <w:r>
+              <w:rPr>
+                <w:b w:val="0"/>
+                <w:sz w:val="20"/>
+              </w:rPr>
+              <w:t>Trang chủ</w:t>
+            </w:r>
+          </w:p>
+        </w:tc>
+        <w:tc>
+          <w:tcPr>
+            <w:tcW w:type="dxa" w:w="4592"/>
+          </w:tcPr>
+          <w:p>
+            <w:pPr>
+              <w:spacing w:line="252" w:lineRule="auto" w:after="80"/>
+            </w:pPr>
+            <w:r>
+              <w:rPr>
+                <w:b w:val="0"/>
+                <w:sz w:val="20"/>
+              </w:rPr>
+              <w:t>templates/public/home.html</w:t>
+            </w:r>
+          </w:p>
+        </w:tc>
+      </w:tr>
+      <w:tr>
+        <w:tc>
+          <w:tcPr>
+            <w:tcW w:type="dxa" w:w="4592"/>
+          </w:tcPr>
+          <w:p>
+            <w:pPr>
+              <w:spacing w:line="252" w:lineRule="auto" w:after="80"/>
+            </w:pPr>
+            <w:r>
+              <w:rPr>
+                <w:b w:val="0"/>
+                <w:sz w:val="20"/>
+              </w:rPr>
+              <w:t>Trang đặt lịch</w:t>
+            </w:r>
+          </w:p>
+        </w:tc>
+        <w:tc>
+          <w:tcPr>
+            <w:tcW w:type="dxa" w:w="4592"/>
+          </w:tcPr>
+          <w:p>
+            <w:pPr>
+              <w:spacing w:line="252" w:lineRule="auto" w:after="80"/>
+            </w:pPr>
+            <w:r>
+              <w:rPr>
+                <w:b w:val="0"/>
+                <w:sz w:val="20"/>
+              </w:rPr>
+              <w:t>templates/public/booking.html</w:t>
+            </w:r>
+          </w:p>
+        </w:tc>
+      </w:tr>
+      <w:tr>
+        <w:tc>
+          <w:tcPr>
+            <w:tcW w:type="dxa" w:w="4592"/>
+          </w:tcPr>
+          <w:p>
+            <w:pPr>
+              <w:spacing w:line="252" w:lineRule="auto" w:after="80"/>
+            </w:pPr>
+            <w:r>
+              <w:rPr>
+                <w:b w:val="0"/>
+                <w:sz w:val="20"/>
+              </w:rPr>
+              <w:t>Giao diện</w:t>
+            </w:r>
+          </w:p>
+        </w:tc>
+        <w:tc>
+          <w:tcPr>
+            <w:tcW w:type="dxa" w:w="4592"/>
+          </w:tcPr>
+          <w:p>
+            <w:pPr>
+              <w:spacing w:line="252" w:lineRule="auto" w:after="80"/>
+            </w:pPr>
+            <w:r>
+              <w:rPr>
+                <w:b w:val="0"/>
+                <w:sz w:val="20"/>
+              </w:rPr>
+              <w:t>static/css/customer.css</w:t>
+            </w:r>
+          </w:p>
+        </w:tc>
+      </w:tr>
+      <w:tr>
+        <w:tc>
+          <w:tcPr>
+            <w:tcW w:type="dxa" w:w="4592"/>
+          </w:tcPr>
+          <w:p>
+            <w:pPr>
+              <w:spacing w:line="252" w:lineRule="auto" w:after="80"/>
+            </w:pPr>
+            <w:r>
+              <w:rPr>
+                <w:b w:val="0"/>
+                <w:sz w:val="20"/>
+              </w:rPr>
+              <w:t>Tương tác</w:t>
+            </w:r>
+          </w:p>
+        </w:tc>
+        <w:tc>
+          <w:tcPr>
+            <w:tcW w:type="dxa" w:w="4592"/>
+          </w:tcPr>
+          <w:p>
+            <w:pPr>
+              <w:spacing w:line="252" w:lineRule="auto" w:after="80"/>
+            </w:pPr>
+            <w:r>
+              <w:rPr>
+                <w:b w:val="0"/>
+                <w:sz w:val="20"/>
+              </w:rPr>
+              <w:t>static/js/customer.js</w:t>
+            </w:r>
+          </w:p>
+        </w:tc>
+      </w:tr>
+      <w:tr>
+        <w:tc>
+          <w:tcPr>
+            <w:tcW w:type="dxa" w:w="4592"/>
+          </w:tcPr>
+          <w:p>
+            <w:pPr>
+              <w:spacing w:line="252" w:lineRule="auto" w:after="80"/>
+            </w:pPr>
+            <w:r>
+              <w:rPr>
+                <w:b w:val="0"/>
+                <w:sz w:val="20"/>
+              </w:rPr>
+              <w:t>Ảnh chụp</w:t>
+            </w:r>
+          </w:p>
+        </w:tc>
+        <w:tc>
+          <w:tcPr>
+            <w:tcW w:type="dxa" w:w="4592"/>
+          </w:tcPr>
+          <w:p>
+            <w:pPr>
+              <w:spacing w:line="252" w:lineRule="auto" w:after="80"/>
+            </w:pPr>
+            <w:r>
+              <w:rPr>
+                <w:b w:val="0"/>
+                <w:sz w:val="20"/>
+              </w:rPr>
+              <w:t>static/images/photos/</w:t>
+            </w:r>
+          </w:p>
+        </w:tc>
+      </w:tr>
+      <w:tr>
+        <w:tc>
+          <w:tcPr>
+            <w:tcW w:type="dxa" w:w="4592"/>
+          </w:tcPr>
+          <w:p>
+            <w:pPr>
+              <w:spacing w:line="252" w:lineRule="auto" w:after="80"/>
+            </w:pPr>
+            <w:r>
+              <w:rPr>
+                <w:b w:val="0"/>
+                <w:sz w:val="20"/>
+              </w:rPr>
+              <w:t>Font</w:t>
+            </w:r>
+          </w:p>
+        </w:tc>
+        <w:tc>
+          <w:tcPr>
+            <w:tcW w:type="dxa" w:w="4592"/>
+          </w:tcPr>
+          <w:p>
+            <w:pPr>
+              <w:spacing w:line="252" w:lineRule="auto" w:after="80"/>
+            </w:pPr>
+            <w:r>
+              <w:rPr>
+                <w:b w:val="0"/>
+                <w:sz w:val="20"/>
+              </w:rPr>
+              <w:t>static/fonts/</w:t>
+            </w:r>
+          </w:p>
+        </w:tc>
+      </w:tr>
+      <w:tr>
+        <w:tc>
+          <w:tcPr>
+            <w:tcW w:type="dxa" w:w="4592"/>
+          </w:tcPr>
+          <w:p>
+            <w:pPr>
+              <w:spacing w:line="252" w:lineRule="auto" w:after="80"/>
+            </w:pPr>
+            <w:r>
+              <w:rPr>
+                <w:b w:val="0"/>
+                <w:sz w:val="20"/>
+              </w:rPr>
+              <w:t>Nguồn tài nguyên</w:t>
+            </w:r>
+          </w:p>
+        </w:tc>
+        <w:tc>
+          <w:tcPr>
+            <w:tcW w:type="dxa" w:w="4592"/>
+          </w:tcPr>
+          <w:p>
+            <w:pPr>
+              <w:spacing w:line="252" w:lineRule="auto" w:after="80"/>
+            </w:pPr>
+            <w:r>
+              <w:rPr>
+                <w:b w:val="0"/>
+                <w:sz w:val="20"/>
+              </w:rPr>
+              <w:t>docs/NGUON-TAI-NGUYEN.md</w:t>
+            </w:r>
+          </w:p>
+        </w:tc>
+      </w:tr>
+      <w:tr>
+        <w:tc>
+          <w:tcPr>
+            <w:tcW w:type="dxa" w:w="4592"/>
+          </w:tcPr>
+          <w:p>
+            <w:pPr>
+              <w:spacing w:line="252" w:lineRule="auto" w:after="80"/>
+            </w:pPr>
+            <w:r>
+              <w:rPr>
+                <w:b w:val="0"/>
+                <w:sz w:val="20"/>
+              </w:rPr>
+              <w:t>Kiểm thử giao diện</w:t>
+            </w:r>
+          </w:p>
+        </w:tc>
+        <w:tc>
+          <w:tcPr>
+            <w:tcW w:type="dxa" w:w="4592"/>
+          </w:tcPr>
+          <w:p>
+            <w:pPr>
+              <w:spacing w:line="252" w:lineRule="auto" w:after="80"/>
+            </w:pPr>
+            <w:r>
+              <w:rPr>
+                <w:b w:val="0"/>
+                <w:sz w:val="20"/>
+              </w:rPr>
+              <w:t>scripts/customer_ui_smoke.py</w:t>
+            </w:r>
+          </w:p>
+        </w:tc>
+      </w:tr>
+    </w:tbl>
+    <w:p/>
+    <w:p>
+      <w:pPr>
+        <w:jc w:val="both"/>
+      </w:pPr>
+      <w:r>
+        <w:t>Chạy ứng dụng với dữ liệu demo rồi thực thi:</w:t>
+      </w:r>
+    </w:p>
+    <w:p>
+      <w:pPr>
+        <w:spacing w:line="252" w:lineRule="auto"/>
+        <w:ind w:left="170"/>
+      </w:pPr>
+      <w:r>
+        <w:rPr>
+          <w:rFonts w:ascii="Consolas" w:hAnsi="Consolas"/>
+          <w:sz w:val="18"/>
+        </w:rPr>
+        <w:t>BROWSER_EXECUTABLE=/tmp/chromium .venv/bin/python scripts/customer_ui_smoke.py</w:t>
+        <w:br/>
+        <w:t>BROWSER_EXECUTABLE=/tmp/chromium .venv/bin/python scripts/browser_smoke.py</w:t>
+        <w:br/>
+        <w:t>bash scripts/check.sh</w:t>
+      </w:r>
+    </w:p>
+    <w:p>
+      <w:pPr>
+        <w:jc w:val="both"/>
+      </w:pPr>
+      <w:r>
+        <w:t>Đường dẫn Chromium ở trên dành cho môi trường cloud hiện tại. Máy cá nhân có thể bỏ biến BROWSER_EXECUTABLE sau khi cài Chromium theo README. Kiểm thử giao diện kiểm tra bộ lọc, cuộn bộ sưu tập, menu, dữ liệu chọn sẵn sau đăng nhập, khung giờ, ảnh/font local, reduced motion, không JavaScript và bố cục từ 320 đến 1440 px. Script giao diện chỉ đọc dữ liệu và đăng nhập tài khoản demo, không tạo lịch hẹn. Script workflow tạo và xóa đúng dữ liệu kiểm thử của nó.</w:t>
+      </w:r>
+    </w:p>
+    <w:p>
+      <w:r>
+        <w:drawing>
+          <wp:inline xmlns:a="http://schemas.openxmlformats.org/drawingml/2006/main" xmlns:pic="http://schemas.openxmlformats.org/drawingml/2006/picture">
+            <wp:extent cx="5760000" cy="4000000"/>
+            <wp:docPr id="12" name="Picture 12"/>
+            <wp:cNvGraphicFramePr>
+              <a:graphicFrameLocks noChangeAspect="1"/>
+            </wp:cNvGraphicFramePr>
+            <a:graphic>
+              <a:graphicData uri="http://schemas.openxmlformats.org/drawingml/2006/picture">
+                <pic:pic>
+                  <pic:nvPicPr>
+                    <pic:cNvPr id="0" name="home-desktop-top.png"/>
+                    <pic:cNvPicPr/>
+                  </pic:nvPicPr>
+                  <pic:blipFill>
+                    <a:blip r:embed="rId16"/>
+                    <a:stretch>
+                      <a:fillRect/>
+                    </a:stretch>
+                  </pic:blipFill>
+                  <pic:spPr>
+                    <a:xfrm>
+                      <a:off x="0" y="0"/>
+                      <a:ext cx="5760000" cy="4000000"/>
+                    </a:xfrm>
+                    <a:prstGeom prst="rect"/>
+                  </pic:spPr>
+                </pic:pic>
+              </a:graphicData>
+            </a:graphic>
+          </wp:inline>
+        </w:drawing>
+      </w:r>
+    </w:p>
+    <w:p>
+      <w:pPr>
+        <w:jc w:val="center"/>
+      </w:pPr>
+      <w:r>
+        <w:rPr>
+          <w:i/>
+          <w:sz w:val="20"/>
+        </w:rPr>
+        <w:t>Trang chủ mới trên desktop</w:t>
+      </w:r>
+    </w:p>
+    <w:p>
+      <w:r>
+        <w:drawing>
+          <wp:inline xmlns:a="http://schemas.openxmlformats.org/drawingml/2006/main" xmlns:pic="http://schemas.openxmlformats.org/drawingml/2006/picture">
+            <wp:extent cx="3160663" cy="6839999"/>
+            <wp:docPr id="13" name="Picture 13"/>
+            <wp:cNvGraphicFramePr>
+              <a:graphicFrameLocks noChangeAspect="1"/>
+            </wp:cNvGraphicFramePr>
+            <a:graphic>
+              <a:graphicData uri="http://schemas.openxmlformats.org/drawingml/2006/picture">
+                <pic:pic>
+                  <pic:nvPicPr>
+                    <pic:cNvPr id="0" name="home-mobile-top.png"/>
+                    <pic:cNvPicPr/>
+                  </pic:nvPicPr>
+                  <pic:blipFill>
+                    <a:blip r:embed="rId20"/>
+                    <a:stretch>
+                      <a:fillRect/>
+                    </a:stretch>
+                  </pic:blipFill>
+                  <pic:spPr>
+                    <a:xfrm>
+                      <a:off x="0" y="0"/>
+                      <a:ext cx="3160663" cy="6839999"/>
+                    </a:xfrm>
+                    <a:prstGeom prst="rect"/>
+                  </pic:spPr>
+                </pic:pic>
+              </a:graphicData>
+            </a:graphic>
+          </wp:inline>
+        </w:drawing>
+      </w:r>
+    </w:p>
+    <w:p>
+      <w:pPr>
+        <w:jc w:val="center"/>
+      </w:pPr>
+      <w:r>
+        <w:rPr>
+          <w:i/>
+          <w:sz w:val="20"/>
+        </w:rPr>
+        <w:t>Trang chủ mới trên điện thoại</w:t>
+      </w:r>
+    </w:p>
+    <w:p>
+      <w:pPr>
+        <w:jc w:val="both"/>
+      </w:pPr>
+      <w:r>
+        <w:t>Bản chụp toàn trang ở docs/screenshots/home-desktop.png và docs/screenshots/home-mobile.png; biểu mẫu mobile ở docs/screenshots/booking-mobile.png.</w:t>
+      </w:r>
+    </w:p>
     <w:sectPr>
-      <w:footerReference w:type="default" r:id="rId20"/>
+      <w:footerReference w:type="default" r:id="rId21"/>
       <w:pgSz w:w="11906" w:h="16838"/>
       <w:pgMar w:top="1361" w:right="1191" w:bottom="1361" w:left="1531" w:header="720" w:footer="720" w:gutter="0"/>
       <w:cols w:space="720"/>

</xml_diff>

<commit_message>
Replace Django Admin with custom management and remove Docker setup
</commit_message>
<xml_diff>
--- a/docs/BAO_CAO_PHAN_TICH_THIET_KE.docx
+++ b/docs/BAO_CAO_PHAN_TICH_THIET_KE.docx
@@ -487,7 +487,7 @@
                 <w:b w:val="0"/>
                 <w:sz w:val="20"/>
               </w:rPr>
-              <w:t>Toàn hệ thống; Django Admin cần quyền staff/superuser tương ứng</w:t>
+              <w:t>Toàn hệ thống; cổng quản trị riêng kiểm tra vai trò manager</w:t>
             </w:r>
           </w:p>
         </w:tc>
@@ -1421,7 +1421,7 @@
                 <w:b w:val="0"/>
                 <w:sz w:val="20"/>
               </w:rPr>
-              <w:t>Health endpoint kiểm tra DB, Docker healthcheck</w:t>
+              <w:t>Health endpoint và lệnh check_database kiểm tra PostgreSQL</w:t>
             </w:r>
           </w:p>
         </w:tc>
@@ -1580,7 +1580,7 @@
                 <w:b w:val="0"/>
                 <w:sz w:val="20"/>
               </w:rPr>
-              <w:t>Requirements ghim phiên bản, setup script, Compose</w:t>
+              <w:t>Requirements ghim phiên bản, setup/start đa nền tảng</w:t>
             </w:r>
           </w:p>
         </w:tc>
@@ -1597,7 +1597,7 @@
                 <w:b w:val="0"/>
                 <w:sz w:val="20"/>
               </w:rPr>
-              <w:t>Docker image dùng nhánh major; production nên khóa digest đã duyệt</w:t>
+              <w:t>Cần cài và cấu hình PostgreSQL trên máy đích</w:t>
             </w:r>
           </w:p>
         </w:tc>
@@ -1745,7 +1745,7 @@
         <w:jc w:val="both"/>
       </w:pPr>
       <w:r>
-        <w:t>Quản trị mở Admin, chọn stylist, bắt đầu và kết thúc. Ca phải trong một ngày và giờ mở cửa; PostgreSQL từ chối ca chồng lấn. Khi sửa ca, không được bỏ phạm vi chứa lịch đang đặt. Không cho xóa ca qua Admin; có thể điều chỉnh khi không ảnh hưởng lịch đang hoạt động.</w:t>
+        <w:t>Quản trị mở Thiết lập &amp; nhân sự → Ca làm, chọn stylist, bắt đầu và kết thúc. Ca phải trong một ngày và giờ mở cửa; PostgreSQL từ chối ca chồng lấn. Khi sửa ca, không được bỏ phạm vi chứa lịch đang đặt. Chỉ xóa ca khi không còn lịch hẹn đang cần phục vụ trong ca; mọi thao tác ghi dữ liệu qua cổng quản trị riêng.</w:t>
       </w:r>
     </w:p>
     <w:p>
@@ -1777,7 +1777,7 @@
         <w:jc w:val="both"/>
       </w:pPr>
       <w:r>
-        <w:t>Bao gồm website khách hàng, cổng điều hành, quản trị danh mục, database migration, dữ liệu mẫu, bộ kiểm thử, Docker và tài liệu. Không bao gồm mobile native, mạng xã hội, SMS/email bên ngoài, thanh toán ngân hàng thật, sản phẩm kho, hoa hồng/lương, thuế, voucher, hoàn tiền, AI và HA. Các nội dung này là hướng phát triển sau, không được mô tả là đã thực hiện.</w:t>
+        <w:t>Bao gồm website khách hàng, cổng điều hành, quản trị danh mục, database migration, dữ liệu mẫu, bộ kiểm thử, hướng dẫn chạy trực tiếp và tài liệu. Không bao gồm mobile native, mạng xã hội, SMS/email bên ngoài, thanh toán ngân hàng thật, sản phẩm kho, hoa hồng/lương, thuế, voucher, hoàn tiền, AI và HA. Các nội dung này là hướng phát triển sau, không được mô tả là đã thực hiện.</w:t>
       </w:r>
     </w:p>
     <w:p>
@@ -2304,7 +2304,7 @@
         <w:pStyle w:val="ListBullet"/>
       </w:pPr>
       <w:r>
-        <w:t>admin.py: giao diện quản trị nguồn lực; lịch và hóa đơn chỉ đọc để tránh bỏ qua nghiệp vụ.</w:t>
+        <w:t>management_views.py: cổng CRUD riêng, phân quyền manager, khóa khi thay đổi nguồn lực; profile_views.py: hồ sơ và đổi mật khẩu. Lịch và hóa đơn giữ luồng nghiệp vụ riêng.</w:t>
       </w:r>
     </w:p>
     <w:p>
@@ -2432,7 +2432,7 @@
         <w:jc w:val="both"/>
       </w:pPr>
       <w:r>
-        <w:t>PostgreSQL lưu Unicode bằng varchar/text, thời gian bằng timestamptz. Tất cả bảng nghiệp vụ có khóa chính bigint, đặt tên theo đối tượng: manguoidung, machinhanh, malichhen… Các trường bắt buộc không nhận NULL trừ khi ghi rõ. Tên bảng thực tế có tiền tố salon_. Các cột trong 12 bảng nghiệp vụ dùng tiếng Việt viết liền không dấu qua db_column, ví dụ hoten, sodienthoai, thoigianbatdau. Django còn quản lý các bảng auth, group, permission, session và admin log theo quy ước framework. Xem 05-TEN-COT-DU-LIEU.md để đối chiếu đầy đủ 80 cột với tên thuộc tính Python; kiểu dữ liệu không thay đổi.</w:t>
+        <w:t>PostgreSQL lưu Unicode bằng varchar/text, thời gian bằng timestamptz. Tất cả bảng nghiệp vụ có khóa chính bigint, đặt tên theo đối tượng: manguoidung, machinhanh, malichhen… Các trường bắt buộc không nhận NULL trừ khi ghi rõ. Tên bảng thực tế có tiền tố salon_. Các cột trong 12 bảng nghiệp vụ dùng tiếng Việt viết liền không dấu qua db_column, ví dụ hoten, sodienthoai, thoigianbatdau. Django còn quản lý các bảng auth, group, permission và session theo quy ước framework. Xem 05-TEN-COT-DU-LIEU.md để đối chiếu đầy đủ 80 cột với tên thuộc tính Python; kiểu dữ liệu không thay đổi.</w:t>
       </w:r>
     </w:p>
     <w:p>
@@ -2714,7 +2714,7 @@
                 <w:b w:val="0"/>
                 <w:sz w:val="20"/>
               </w:rPr>
-              <w:t>Stylist thuộc một chi nhánh; không đổi chi nhánh lịch sử qua Admin</w:t>
+              <w:t>Stylist thuộc một chi nhánh; không đổi chi nhánh lịch sử qua cổng quản trị riêng</w:t>
             </w:r>
           </w:p>
         </w:tc>
@@ -3241,7 +3241,7 @@
         <w:jc w:val="both"/>
       </w:pPr>
       <w:r>
-        <w:t>Các chỉnh sửa danh mục qua Admin dành cho quản trị viên. Ràng buộc snapshot giữ nguyên lịch cũ. Việc cập nhật ca làm đồng thời với một lệnh đặt cần khóa cùng chi nhánh trong bước lưu Admin; form vẫn kiểm tra lại các lịch đã có. Không hỗ trợ sửa lịch trực tiếp bằng SQL như một luồng vận hành.</w:t>
+        <w:t>Các chỉnh sửa danh mục qua cổng quản trị riêng dành cho quản trị viên. Ràng buộc snapshot giữ nguyên lịch cũ. Việc cập nhật ca làm đồng thời với một lệnh đặt cần khóa cùng chi nhánh trong bước lưu có transaction của cổng quản trị riêng; form vẫn kiểm tra lại các lịch đã có. Không hỗ trợ sửa lịch trực tiếp bằng SQL như một luồng vận hành.</w:t>
       </w:r>
     </w:p>
     <w:p>
@@ -3954,7 +3954,7 @@
       <w:r>
         <w:drawing>
           <wp:inline xmlns:a="http://schemas.openxmlformats.org/drawingml/2006/main" xmlns:pic="http://schemas.openxmlformats.org/drawingml/2006/picture">
-            <wp:extent cx="5760000" cy="2740408"/>
+            <wp:extent cx="5760000" cy="3269388"/>
             <wp:docPr id="7" name="Picture 7"/>
             <wp:cNvGraphicFramePr>
               <a:graphicFrameLocks noChangeAspect="1"/>
@@ -3975,7 +3975,7 @@
                   <pic:spPr>
                     <a:xfrm>
                       <a:off x="0" y="0"/>
-                      <a:ext cx="5760000" cy="2740408"/>
+                      <a:ext cx="5760000" cy="3269388"/>
                     </a:xfrm>
                     <a:prstGeom prst="rect"/>
                   </pic:spPr>
@@ -4310,7 +4310,7 @@
                 <w:b w:val="0"/>
                 <w:sz w:val="20"/>
               </w:rPr>
-              <w:t>Admin</w:t>
+              <w:t>Thiết lập riêng</w:t>
             </w:r>
           </w:p>
         </w:tc>
@@ -4327,7 +4327,43 @@
                 <w:b w:val="0"/>
                 <w:sz w:val="20"/>
               </w:rPr>
-              <w:t>Danh mục, tài khoản, ca làm; view-only lịch, hóa đơn, đánh giá, audit</w:t>
+              <w:t>Thêm/sửa/xóa tài khoản, dịch vụ, chi nhánh, stylist, ghế và ca làm; bảo vệ lịch sử</w:t>
+            </w:r>
+          </w:p>
+        </w:tc>
+      </w:tr>
+      <w:tr>
+        <w:tc>
+          <w:tcPr>
+            <w:tcW w:type="dxa" w:w="4592"/>
+          </w:tcPr>
+          <w:p>
+            <w:pPr>
+              <w:spacing w:line="252" w:lineRule="auto" w:after="80"/>
+            </w:pPr>
+            <w:r>
+              <w:rPr>
+                <w:b w:val="0"/>
+                <w:sz w:val="20"/>
+              </w:rPr>
+              <w:t>Trang cá nhân</w:t>
+            </w:r>
+          </w:p>
+        </w:tc>
+        <w:tc>
+          <w:tcPr>
+            <w:tcW w:type="dxa" w:w="4592"/>
+          </w:tcPr>
+          <w:p>
+            <w:pPr>
+              <w:spacing w:line="252" w:lineRule="auto" w:after="80"/>
+            </w:pPr>
+            <w:r>
+              <w:rPr>
+                <w:b w:val="0"/>
+                <w:sz w:val="20"/>
+              </w:rPr>
+              <w:t>Sửa thông tin liên hệ, đổi mật khẩu có xác nhận mật khẩu hiện tại</w:t>
             </w:r>
           </w:p>
         </w:tc>
@@ -5114,6 +5150,22 @@
       </w:r>
     </w:p>
     <w:p>
+      <w:pPr>
+        <w:pStyle w:val="Heading2"/>
+      </w:pPr>
+      <w:r>
+        <w:t>9. Quản trị riêng và hồ sơ</w:t>
+      </w:r>
+    </w:p>
+    <w:p>
+      <w:pPr>
+        <w:jc w:val="both"/>
+      </w:pPr>
+      <w:r>
+        <w:t>Màn hình /quan-ly/thiet-lap/ thay giao diện quản trị mặc định. manager_required kiểm tra vai trò ở mỗi request; profile chỉ cập nhật người đang đăng nhập. CRUD thay đổi trong transaction, khóa chi nhánh theo thứ tự và ghi audit. GET không xóa; POST yêu cầu CSRF và xác nhận. Chi tiết tại Quản trị riêng.</w:t>
+      </w:r>
+    </w:p>
+    <w:p>
       <w:r>
         <w:br w:type="page"/>
       </w:r>
@@ -5123,7 +5175,7 @@
         <w:pStyle w:val="Heading1"/>
       </w:pPr>
       <w:r>
-        <w:t>Triển khai và trình diễn</w:t>
+        <w:t>Triển khai và chạy trực tiếp</w:t>
       </w:r>
     </w:p>
     <w:p>
@@ -5131,7 +5183,7 @@
         <w:pStyle w:val="Heading2"/>
       </w:pPr>
       <w:r>
-        <w:t>1. Cài đặt môi trường phát triển</w:t>
+        <w:t>1. Điều kiện</w:t>
       </w:r>
     </w:p>
     <w:p>
@@ -5139,7 +5191,31 @@
         <w:jc w:val="both"/>
       </w:pPr>
       <w:r>
-        <w:t>Từ thư mục repository với Python 3.12 và Docker Compose v2:</w:t>
+        <w:t>Python 3.12–3.14 64-bit và PostgreSQL 17. pgAdmin dùng để tạo database và quản lý tài khoản PostgreSQL; ứng dụng kết nối trực tiếp qua host/port trong .env. Không cần công cụ container. Đọc README để làm theo từng bước bằng PowerShell trên VS Code.</w:t>
+      </w:r>
+    </w:p>
+    <w:p>
+      <w:pPr>
+        <w:jc w:val="both"/>
+      </w:pPr>
+      <w:r>
+        <w:t>Trong pgAdmin: kết nối server → Databases → Create → Database, đặt tên gentleman, owner là tài khoản PostgreSQL của bạn. Tài khoản migration cần quyền tạo bảng và extension btree_gist. Các bảng ứng dụng không tạo bằng tay.</w:t>
+      </w:r>
+    </w:p>
+    <w:p>
+      <w:pPr>
+        <w:pStyle w:val="Heading2"/>
+      </w:pPr>
+      <w:r>
+        <w:t>2. Windows / VS Code</w:t>
+      </w:r>
+    </w:p>
+    <w:p>
+      <w:pPr>
+        <w:jc w:val="both"/>
+      </w:pPr>
+      <w:r>
+        <w:t>Mở đúng thư mục có manage.py. Trong terminal PowerShell:</w:t>
       </w:r>
     </w:p>
     <w:p>
@@ -5152,9 +5228,13 @@
           <w:rFonts w:ascii="Consolas" w:hAnsi="Consolas"/>
           <w:sz w:val="18"/>
         </w:rPr>
-        <w:t>bash scripts/setup.sh</w:t>
+        <w:t>python --version</w:t>
         <w:br/>
-        <w:t>bash scripts/start.sh</w:t>
+        <w:t>python -m venv .venv</w:t>
+        <w:br/>
+        <w:t>.\.venv\Scripts\python.exe -m pip install -r requirements.txt</w:t>
+        <w:br/>
+        <w:t>Copy-Item .env.example .env</w:t>
       </w:r>
     </w:p>
     <w:p>
@@ -5162,23 +5242,7 @@
         <w:jc w:val="both"/>
       </w:pPr>
       <w:r>
-        <w:t>Script setup tạo .local trước khi Docker tạo bind mount, tránh thư mục cha thuộc root. PostgreSQL service dùng port 5432 chỉ bind loopback. Nếu cổng đang bận, cấu hình POSTGRES_PORT đồng nhất cho Compose và Django (qua .env hoặc environment). Tệp .env không tự thực thi shell.</w:t>
-      </w:r>
-    </w:p>
-    <w:p>
-      <w:pPr>
-        <w:jc w:val="both"/>
-      </w:pPr>
-      <w:r>
-        <w:t>Khi đã có database ngoài, không cần container db: điền POSTGRES_* và chạy lần lượt pip, migrate, collectstatic. Quyền quản trị CSDL cần tạo extension btree_gist lần đầu; quyền chạy test cần tạo database test. Không chuyển sang SQLite vì ứng dụng dùng các ràng buộc PostgreSQL để chống xung đột.</w:t>
-      </w:r>
-    </w:p>
-    <w:p>
-      <w:pPr>
-        <w:pStyle w:val="Heading3"/>
-      </w:pPr>
-      <w:r>
-        <w:t>Bản Docker</w:t>
+        <w:t>Chỉ sao chép khi chưa có .env. Giữ file cấu hình cũ khi cập nhật mã. Điền tên database, username, mật khẩu PostgreSQL và port thực tế vào .env. Username thường là postgres, không phải tên database gentleman. Mật khẩu PostgreSQL khác mật khẩu tài khoản web và mật khẩu mở ứng dụng pgAdmin.</w:t>
       </w:r>
     </w:p>
     <w:p>
@@ -5191,13 +5255,15 @@
           <w:rFonts w:ascii="Consolas" w:hAnsi="Consolas"/>
           <w:sz w:val="18"/>
         </w:rPr>
-        <w:t>mkdir -p .local</w:t>
+        <w:t>.\.venv\Scripts\python.exe manage.py check_database</w:t>
         <w:br/>
-        <w:t>docker compose up -d --build --wait</w:t>
+        <w:t>.\.venv\Scripts\python.exe manage.py migrate</w:t>
         <w:br/>
-        <w:t>docker compose exec web python manage.py seed_demo</w:t>
+        <w:t>.\.venv\Scripts\python.exe manage.py seed_demo</w:t>
         <w:br/>
-        <w:t>docker compose logs --tail=50 web</w:t>
+        <w:t>.\.venv\Scripts\python.exe manage.py collectstatic --noinput</w:t>
+        <w:br/>
+        <w:t>.\.venv\Scripts\python.exe manage.py runserver</w:t>
       </w:r>
     </w:p>
     <w:p>
@@ -5205,36 +5271,7 @@
         <w:jc w:val="both"/>
       </w:pPr>
       <w:r>
-        <w:t>Một số cloud sandbox không có DNS/proxy bên trong build container. Khi đó bash scripts/build-cloud.sh tải wheel qua pip trên host với TLS bình thường, sau đó build bằng PIP_NO_INDEX=1 từ wheel local. Script đã kiểm chứng cho Linux/Python 3.12 cùng kiến trúc CPU với image; không tắt TLS hoặc bỏ kiểm tra checksum. Sau build dùng docker compose up -d web.</w:t>
-      </w:r>
-    </w:p>
-    <w:p>
-      <w:pPr>
-        <w:pStyle w:val="Heading3"/>
-      </w:pPr>
-      <w:r>
-        <w:t>Các lệnh hằng ngày</w:t>
-      </w:r>
-    </w:p>
-    <w:p>
-      <w:pPr>
-        <w:spacing w:line="252" w:lineRule="auto"/>
-        <w:ind w:left="170"/>
-      </w:pPr>
-      <w:r>
-        <w:rPr>
-          <w:rFonts w:ascii="Consolas" w:hAnsi="Consolas"/>
-          <w:sz w:val="18"/>
-        </w:rPr>
-        <w:t>.venv/bin/python manage.py test salon.tests --noinput</w:t>
-        <w:br/>
-        <w:t>.venv/bin/python manage.py seed_demo</w:t>
-        <w:br/>
-        <w:t>.venv/bin/python manage.py createsuperuser</w:t>
-        <w:br/>
-        <w:t>.venv/bin/python manage.py collectstatic --noinput</w:t>
-        <w:br/>
-        <w:t>docker compose stop</w:t>
+        <w:t>Mở http://127.0.0.1:8000/ trên máy cá nhân. Ctrl+C dừng web. Những lần sau chỉ cần PostgreSQL đang chạy và lệnh runserver. Trong VS Code chọn interpreter .venv/Scripts/python.exe; F5 cấu hình GENTLEMAN: Django cũng chạy được sau khi đã cài dependencies và cấu hình DB.</w:t>
       </w:r>
     </w:p>
     <w:p>
@@ -5242,15 +5279,15 @@
         <w:jc w:val="both"/>
       </w:pPr>
       <w:r>
-        <w:t>seed_demo idempotent: không đặt lại mật khẩu, không nhân đôi lịch mẫu; bổ sung ca cho ngày hiện tại và 30 ngày tới. Lịch mẫu có thời điểm tương đối ở lần nạp đầu; sau nhiều ngày, tổng quan có thể không có lịch mẫu hôm nay nhưng lịch sử vẫn còn. Không xóa dữ liệu để làm mới demo; có thể đặt lịch mới qua giao diện. Không chạy docker compose down -v hoặc xóa .local/pgdata nếu chưa có backup.</w:t>
+        <w:t>Lệnh hỗ trợ tương đương: python scripts/dev.py setup, python scripts/dev.py start, python scripts/dev.py check. Chúng gọi trực tiếp Python và không quản lý dịch vụ database. Setup tạo .env mẫu và dừng nếu thiếu file, không tự đoán mật khẩu.</w:t>
       </w:r>
     </w:p>
     <w:p>
       <w:pPr>
-        <w:pStyle w:val="Heading3"/>
+        <w:pStyle w:val="Heading2"/>
       </w:pPr>
       <w:r>
-        <w:t>Nâng cấp bản đã cài sang tên cột tiếng Việt</w:t>
+        <w:t>3. Linux / macOS và môi trường cloud</w:t>
       </w:r>
     </w:p>
     <w:p>
@@ -5258,7 +5295,15 @@
         <w:jc w:val="both"/>
       </w:pPr>
       <w:r>
-        <w:t>Dừng tiến trình web cũ, cập nhật mã nguồn và chạy .venv/bin/python manage.py migrate --noinput, sau đó khởi động lại bằng bash scripts/start.sh. Migration 0002_vietnamese_column_names đổi tên 80 cột tại chỗ, giữ nguyên kiểu dữ liệu và dữ liệu hiện có. Không xóa database, không sửa migration 0001 đã có và không nạp lại dữ liệu để thực hiện đổi tên. Với Docker, rebuild và khởi động web để entrypoint chạy migration trước khi bật Gunicorn. Xem bảng đối chiếu tại 05-TEN-COT-DU-LIEU.md.</w:t>
+        <w:t>Dùng PostgreSQL đang có, cấu hình .env, rồi chạy python3 scripts/dev.py setup và python3 scripts/dev.py start. Có các wrapper bash trong scripts. Cổng web tùy chọn: --port 8001; host tùy chọn cho môi trường phát triển được quản lý: --host 0.0.0.0. Mặc định loopback.</w:t>
+      </w:r>
+    </w:p>
+    <w:p>
+      <w:pPr>
+        <w:jc w:val="both"/>
+      </w:pPr>
+      <w:r>
+        <w:t>Mỗi cloud task đã cách ly, dùng checkout /workspace/ptpmhdtuong; không tạo Git worktree khi chưa có yêu cầu. Không giả định process cũ còn chạy. Cấu hình môi trường cloud có hướng dẫn khởi động PostgreSQL native đã chuẩn bị bên ngoài repository. Các binary database và dữ liệu cloud không được đóng gói vào ZIP mã nguồn.</w:t>
       </w:r>
     </w:p>
     <w:p>
@@ -5266,71 +5311,23 @@
         <w:pStyle w:val="Heading2"/>
       </w:pPr>
       <w:r>
-        <w:t>2. Kịch bản bảo vệ đồ án khoảng 10 phút</w:t>
+        <w:t>4. Nâng cấp và bảo toàn dữ liệu</w:t>
       </w:r>
     </w:p>
     <w:p>
       <w:pPr>
-        <w:pStyle w:val="ListNumber"/>
+        <w:jc w:val="both"/>
       </w:pPr>
       <w:r>
-        <w:t>Giới thiệu vấn đề chờ đợi, trùng lịch và đối soát doanh thu; chỉ ra ba vai trò.</w:t>
+        <w:t>Dừng web, giữ .env và database, cập nhật mã, cài lại requirements, migrate, collectstatic và khởi động lại. Không nạp lại demo để nâng cấp. Bản quản trị riêng không thêm bảng/cột hoặc migration mới. Migration 0002 đổi tên 80 cột nghiệp vụ sang tiếng Việt không dấu, giữ kiểu dữ liệu và dữ liệu. Không sửa migration 0001 đã áp dụng.</w:t>
       </w:r>
     </w:p>
     <w:p>
       <w:pPr>
-        <w:pStyle w:val="ListNumber"/>
+        <w:jc w:val="both"/>
       </w:pPr>
       <w:r>
-        <w:t>Mở trang chủ, xem ba chi nhánh và bảng giá dịch vụ.</w:t>
-      </w:r>
-    </w:p>
-    <w:p>
-      <w:pPr>
-        <w:pStyle w:val="ListNumber"/>
-      </w:pPr>
-      <w:r>
-        <w:t>Đăng nhập khachhang, chọn combo, stylist và ngày; chỉ ra thời lượng ảnh hưởng giờ trống; đặt và xem mã lịch.</w:t>
-      </w:r>
-    </w:p>
-    <w:p>
-      <w:pPr>
-        <w:pStyle w:val="ListNumber"/>
-      </w:pPr>
-      <w:r>
-        <w:t>Mở hai cửa sổ/khách khác nhau cùng chọn một stylist/giờ. Xác nhận một lịch rồi thử lịch còn lại; giải thích server kiểm tra lại khi ghi và DB có exclusion constraint. Có bộ test concurrency thay cho biểu diễn thủ công nếu không muốn tạo nhiều dữ liệu.</w:t>
-      </w:r>
-    </w:p>
-    <w:p>
-      <w:pPr>
-        <w:pStyle w:val="ListNumber"/>
-      </w:pPr>
-      <w:r>
-        <w:t>Tạo một lịch trong ngày, đăng nhập letan tại Quận 1, check-in ghế trống, bắt đầu, chọn thẻ mô phỏng và xác nhận. Mở/in phiếu dịch vụ nội bộ.</w:t>
-      </w:r>
-    </w:p>
-    <w:p>
-      <w:pPr>
-        <w:pStyle w:val="ListNumber"/>
-      </w:pPr>
-      <w:r>
-        <w:t>Trở lại đúng tài khoản khách, đánh giá sau hoàn thành; thử thanh toán/đánh giá lặp để thấy bị chặn.</w:t>
-      </w:r>
-    </w:p>
-    <w:p>
-      <w:pPr>
-        <w:pStyle w:val="ListNumber"/>
-      </w:pPr>
-      <w:r>
-        <w:t>Đăng nhập admin, xem toàn chuỗi, lọc chi nhánh/ngày, báo cáo và CSV; mở quản trị ca làm, dịch vụ.</w:t>
-      </w:r>
-    </w:p>
-    <w:p>
-      <w:pPr>
-        <w:pStyle w:val="ListNumber"/>
-      </w:pPr>
-      <w:r>
-        <w:t>Đối chiếu kết quả test, ERD, sequence và điểm mở rộng. Nêu rõ dữ liệu và thanh toán là mẫu/mô phỏng.</w:t>
+        <w:t>seed_demo chỉ DEBUG=1, không đổi mật khẩu tài khoản đã có và không nhân đôi lịch mẫu. Chạy lại có thể bổ sung ca làm cho hiện tại và 30 ngày tới. Lịch mẫu cũ vẫn giữ ngày gốc; tạo lịch mới để trình diễn ở ngày hiện tại.</w:t>
       </w:r>
     </w:p>
     <w:p>
@@ -5338,7 +5335,7 @@
         <w:pStyle w:val="Heading2"/>
       </w:pPr>
       <w:r>
-        <w:t>3. Cấu hình production cần hoàn tất</w:t>
+        <w:t>5. Sử dụng cổng quản lý riêng</w:t>
       </w:r>
     </w:p>
     <w:p>
@@ -5346,47 +5343,7 @@
         <w:jc w:val="both"/>
       </w:pPr>
       <w:r>
-        <w:t>Không coi bản demo đã được vận hành công khai. Trước public deployment:</w:t>
-      </w:r>
-    </w:p>
-    <w:p>
-      <w:pPr>
-        <w:pStyle w:val="ListBullet"/>
-      </w:pPr>
-      <w:r>
-        <w:t>Dùng database riêng và mật khẩu đủ mạnh; không nạp seed demo; tạo quản trị viên riêng và phân role/quyền qua Admin.</w:t>
-      </w:r>
-    </w:p>
-    <w:p>
-      <w:pPr>
-        <w:pStyle w:val="ListBullet"/>
-      </w:pPr>
-      <w:r>
-        <w:t>Đặt DJANGO_DEBUG=0, DJANGO_SECRET_KEY riêng, DJANGO_ALLOWED_HOSTS theo domain; có thể thêm DJANGO_CSRF_TRUSTED_ORIGINS cho origin HTTPS hợp lệ. Secrets đi qua cơ chế secure settings của hạ tầng, không ghi vào repository.</w:t>
-      </w:r>
-    </w:p>
-    <w:p>
-      <w:pPr>
-        <w:pStyle w:val="ListBullet"/>
-      </w:pPr>
-      <w:r>
-        <w:t>Chạy Gunicorn sau reverse proxy HTTPS. Cookies secure và HSTS bật trong chế độ production. Cấu hình trusted proxy header chỉ khi proxy do mình quản lý; nếu chưa trust proxy, kết nối backend HTTPS hoặc cấu hình redirect ở proxy phù hợp.</w:t>
-      </w:r>
-    </w:p>
-    <w:p>
-      <w:pPr>
-        <w:pStyle w:val="ListBullet"/>
-      </w:pPr>
-      <w:r>
-        <w:t>Chạy migrate/collectstatic trước khi chuyển traffic, cấp user DB quyền cần thiết rồi thu hồi quyền superuser/CREATEDB ở tài khoản runtime. Tạo extension bằng tài khoản migration có quyền.</w:t>
-      </w:r>
-    </w:p>
-    <w:p>
-      <w:pPr>
-        <w:pStyle w:val="ListBullet"/>
-      </w:pPr>
-      <w:r>
-        <w:t>Bổ sung rate limiting đăng nhập, password reset/email xác minh, backup định kỳ, restore test, logging/monitoring và đo tải. Không đưa database ra Internet.</w:t>
+        <w:t>Đăng nhập admin → Thiết lập &amp; nhân sự (/quan-ly/thiet-lap/). Quản lý trực tiếp dịch vụ, chi nhánh, stylist, ghế, ca làm và tài khoản. Có tìm kiếm, phân trang, tạo, sửa và xác nhận xóa. Quyền dựa vào vai trò manager. Không cần bật staff/superuser hoặc truy cập trang quản trị có sẵn của framework.</w:t>
       </w:r>
     </w:p>
     <w:p>
@@ -5394,7 +5351,15 @@
         <w:jc w:val="both"/>
       </w:pPr>
       <w:r>
-        <w:t>Ví dụ kiểm tra cấu hình (cần các biến production hợp lệ): python manage.py check --deploy. Đây là kiểm tra cấu hình, không thay thế kiểm tra bảo mật độc lập hoặc nghiệm thu triển khai thực tế.</w:t>
+        <w:t>Mọi người đăng nhập đều có trang /tai-khoan/ để sửa họ tên/điện thoại/email và đổi mật khẩu. Đổi mật khẩu yêu cầu mật khẩu hiện tại và giữ phiên đăng nhập hiện tại. Vai trò, điểm và quyền không sửa từ trang cá nhân.</w:t>
+      </w:r>
+    </w:p>
+    <w:p>
+      <w:pPr>
+        <w:jc w:val="both"/>
+      </w:pPr>
+      <w:r>
+        <w:t>Bản ghi gắn với lịch sử được bảo vệ. Ca làm có lịch hẹn không được xóa/thu hẹp; ghế/stylist có lịch đang hoạt động không ngừng đột ngột; chi nhánh không được đổi giờ làm mất phạm vi phục vụ. Giá danh mục mới không sửa snapshot trong lịch cũ.</w:t>
       </w:r>
     </w:p>
     <w:p>
@@ -5402,22 +5367,387 @@
         <w:pStyle w:val="Heading2"/>
       </w:pPr>
       <w:r>
-        <w:t>4. Sao lưu và phục hồi</w:t>
+        <w:t>6. Xử lý lỗi thường gặp</w:t>
       </w:r>
     </w:p>
+    <w:tbl>
+      <w:tblPr>
+        <w:tblStyle w:val="TableGrid"/>
+        <w:tblW w:type="auto" w:w="0"/>
+        <w:tblLook w:firstColumn="1" w:firstRow="1" w:lastColumn="0" w:lastRow="0" w:noHBand="0" w:noVBand="1" w:val="04A0"/>
+      </w:tblPr>
+      <w:tblGrid>
+        <w:gridCol w:w="4592"/>
+        <w:gridCol w:w="4592"/>
+      </w:tblGrid>
+      <w:tr>
+        <w:tc>
+          <w:tcPr>
+            <w:tcW w:type="dxa" w:w="4592"/>
+          </w:tcPr>
+          <w:p>
+            <w:pPr>
+              <w:spacing w:line="252" w:lineRule="auto" w:after="80"/>
+            </w:pPr>
+            <w:r>
+              <w:rPr>
+                <w:b/>
+                <w:sz w:val="20"/>
+              </w:rPr>
+              <w:t>Thông báo</w:t>
+            </w:r>
+          </w:p>
+        </w:tc>
+        <w:tc>
+          <w:tcPr>
+            <w:tcW w:type="dxa" w:w="4592"/>
+          </w:tcPr>
+          <w:p>
+            <w:pPr>
+              <w:spacing w:line="252" w:lineRule="auto" w:after="80"/>
+            </w:pPr>
+            <w:r>
+              <w:rPr>
+                <w:b/>
+                <w:sz w:val="20"/>
+              </w:rPr>
+              <w:t>Kiểm tra</w:t>
+            </w:r>
+          </w:p>
+        </w:tc>
+      </w:tr>
+      <w:tr>
+        <w:tc>
+          <w:tcPr>
+            <w:tcW w:type="dxa" w:w="4592"/>
+          </w:tcPr>
+          <w:p>
+            <w:pPr>
+              <w:spacing w:line="252" w:lineRule="auto" w:after="80"/>
+            </w:pPr>
+            <w:r>
+              <w:rPr>
+                <w:b w:val="0"/>
+                <w:sz w:val="20"/>
+              </w:rPr>
+              <w:t>Không nhận lệnh py</w:t>
+            </w:r>
+          </w:p>
+        </w:tc>
+        <w:tc>
+          <w:tcPr>
+            <w:tcW w:type="dxa" w:w="4592"/>
+          </w:tcPr>
+          <w:p>
+            <w:pPr>
+              <w:spacing w:line="252" w:lineRule="auto" w:after="80"/>
+            </w:pPr>
+            <w:r>
+              <w:rPr>
+                <w:b w:val="0"/>
+                <w:sz w:val="20"/>
+              </w:rPr>
+              <w:t>Dùng python, hoặc VS Code → Python: Create Environment → Venv</w:t>
+            </w:r>
+          </w:p>
+        </w:tc>
+      </w:tr>
+      <w:tr>
+        <w:tc>
+          <w:tcPr>
+            <w:tcW w:type="dxa" w:w="4592"/>
+          </w:tcPr>
+          <w:p>
+            <w:pPr>
+              <w:spacing w:line="252" w:lineRule="auto" w:after="80"/>
+            </w:pPr>
+            <w:r>
+              <w:rPr>
+                <w:b w:val="0"/>
+                <w:sz w:val="20"/>
+              </w:rPr>
+              <w:t>Không nhận python</w:t>
+            </w:r>
+          </w:p>
+        </w:tc>
+        <w:tc>
+          <w:tcPr>
+            <w:tcW w:type="dxa" w:w="4592"/>
+          </w:tcPr>
+          <w:p>
+            <w:pPr>
+              <w:spacing w:line="252" w:lineRule="auto" w:after="80"/>
+            </w:pPr>
+            <w:r>
+              <w:rPr>
+                <w:b w:val="0"/>
+                <w:sz w:val="20"/>
+              </w:rPr>
+              <w:t>Chọn interpreter trong VS Code; kiểm tra cài đặt/PATH của Python</w:t>
+            </w:r>
+          </w:p>
+        </w:tc>
+      </w:tr>
+      <w:tr>
+        <w:tc>
+          <w:tcPr>
+            <w:tcW w:type="dxa" w:w="4592"/>
+          </w:tcPr>
+          <w:p>
+            <w:pPr>
+              <w:spacing w:line="252" w:lineRule="auto" w:after="80"/>
+            </w:pPr>
+            <w:r>
+              <w:rPr>
+                <w:b w:val="0"/>
+                <w:sz w:val="20"/>
+              </w:rPr>
+              <w:t>Password authentication failed</w:t>
+            </w:r>
+          </w:p>
+        </w:tc>
+        <w:tc>
+          <w:tcPr>
+            <w:tcW w:type="dxa" w:w="4592"/>
+          </w:tcPr>
+          <w:p>
+            <w:pPr>
+              <w:spacing w:line="252" w:lineRule="auto" w:after="80"/>
+            </w:pPr>
+            <w:r>
+              <w:rPr>
+                <w:b w:val="0"/>
+                <w:sz w:val="20"/>
+              </w:rPr>
+              <w:t>Sửa đúng .env, đúng username/password PostgreSQL; không sửa .env.example</w:t>
+            </w:r>
+          </w:p>
+        </w:tc>
+      </w:tr>
+      <w:tr>
+        <w:tc>
+          <w:tcPr>
+            <w:tcW w:type="dxa" w:w="4592"/>
+          </w:tcPr>
+          <w:p>
+            <w:pPr>
+              <w:spacing w:line="252" w:lineRule="auto" w:after="80"/>
+            </w:pPr>
+            <w:r>
+              <w:rPr>
+                <w:b w:val="0"/>
+                <w:sz w:val="20"/>
+              </w:rPr>
+              <w:t>Vẫn dùng username cũ</w:t>
+            </w:r>
+          </w:p>
+        </w:tc>
+        <w:tc>
+          <w:tcPr>
+            <w:tcW w:type="dxa" w:w="4592"/>
+          </w:tcPr>
+          <w:p>
+            <w:pPr>
+              <w:spacing w:line="252" w:lineRule="auto" w:after="80"/>
+            </w:pPr>
+            <w:r>
+              <w:rPr>
+                <w:b w:val="0"/>
+                <w:sz w:val="20"/>
+              </w:rPr>
+              <w:t>Kiểm tra biến môi trường POSTGRES_USER/POSTGRES_PASSWORD đang ghi đè file; không in mật khẩu ra terminal</w:t>
+            </w:r>
+          </w:p>
+        </w:tc>
+      </w:tr>
+      <w:tr>
+        <w:tc>
+          <w:tcPr>
+            <w:tcW w:type="dxa" w:w="4592"/>
+          </w:tcPr>
+          <w:p>
+            <w:pPr>
+              <w:spacing w:line="252" w:lineRule="auto" w:after="80"/>
+            </w:pPr>
+            <w:r>
+              <w:rPr>
+                <w:b w:val="0"/>
+                <w:sz w:val="20"/>
+              </w:rPr>
+              <w:t>Connection refused</w:t>
+            </w:r>
+          </w:p>
+        </w:tc>
+        <w:tc>
+          <w:tcPr>
+            <w:tcW w:type="dxa" w:w="4592"/>
+          </w:tcPr>
+          <w:p>
+            <w:pPr>
+              <w:spacing w:line="252" w:lineRule="auto" w:after="80"/>
+            </w:pPr>
+            <w:r>
+              <w:rPr>
+                <w:b w:val="0"/>
+                <w:sz w:val="20"/>
+              </w:rPr>
+              <w:t>Kiểm tra dịch vụ PostgreSQL, host và port</w:t>
+            </w:r>
+          </w:p>
+        </w:tc>
+      </w:tr>
+      <w:tr>
+        <w:tc>
+          <w:tcPr>
+            <w:tcW w:type="dxa" w:w="4592"/>
+          </w:tcPr>
+          <w:p>
+            <w:pPr>
+              <w:spacing w:line="252" w:lineRule="auto" w:after="80"/>
+            </w:pPr>
+            <w:r>
+              <w:rPr>
+                <w:b w:val="0"/>
+                <w:sz w:val="20"/>
+              </w:rPr>
+              <w:t>Database does not exist</w:t>
+            </w:r>
+          </w:p>
+        </w:tc>
+        <w:tc>
+          <w:tcPr>
+            <w:tcW w:type="dxa" w:w="4592"/>
+          </w:tcPr>
+          <w:p>
+            <w:pPr>
+              <w:spacing w:line="252" w:lineRule="auto" w:after="80"/>
+            </w:pPr>
+            <w:r>
+              <w:rPr>
+                <w:b w:val="0"/>
+                <w:sz w:val="20"/>
+              </w:rPr>
+              <w:t>Tạo database gentleman trong pgAdmin</w:t>
+            </w:r>
+          </w:p>
+        </w:tc>
+      </w:tr>
+      <w:tr>
+        <w:tc>
+          <w:tcPr>
+            <w:tcW w:type="dxa" w:w="4592"/>
+          </w:tcPr>
+          <w:p>
+            <w:pPr>
+              <w:spacing w:line="252" w:lineRule="auto" w:after="80"/>
+            </w:pPr>
+            <w:r>
+              <w:rPr>
+                <w:b w:val="0"/>
+                <w:sz w:val="20"/>
+              </w:rPr>
+              <w:t>Permission denied for extension</w:t>
+            </w:r>
+          </w:p>
+        </w:tc>
+        <w:tc>
+          <w:tcPr>
+            <w:tcW w:type="dxa" w:w="4592"/>
+          </w:tcPr>
+          <w:p>
+            <w:pPr>
+              <w:spacing w:line="252" w:lineRule="auto" w:after="80"/>
+            </w:pPr>
+            <w:r>
+              <w:rPr>
+                <w:b w:val="0"/>
+                <w:sz w:val="20"/>
+              </w:rPr>
+              <w:t>Nhờ tài khoản quản trị PostgreSQL tạo btree_gist trong database đích hoặc cấp quyền thích hợp</w:t>
+            </w:r>
+          </w:p>
+        </w:tc>
+      </w:tr>
+      <w:tr>
+        <w:tc>
+          <w:tcPr>
+            <w:tcW w:type="dxa" w:w="4592"/>
+          </w:tcPr>
+          <w:p>
+            <w:pPr>
+              <w:spacing w:line="252" w:lineRule="auto" w:after="80"/>
+            </w:pPr>
+            <w:r>
+              <w:rPr>
+                <w:b w:val="0"/>
+                <w:sz w:val="20"/>
+              </w:rPr>
+              <w:t>Missing staticfiles manifest entry</w:t>
+            </w:r>
+          </w:p>
+        </w:tc>
+        <w:tc>
+          <w:tcPr>
+            <w:tcW w:type="dxa" w:w="4592"/>
+          </w:tcPr>
+          <w:p>
+            <w:pPr>
+              <w:spacing w:line="252" w:lineRule="auto" w:after="80"/>
+            </w:pPr>
+            <w:r>
+              <w:rPr>
+                <w:b w:val="0"/>
+                <w:sz w:val="20"/>
+              </w:rPr>
+              <w:t>Chạy collectstatic sau khi cập nhật mã</w:t>
+            </w:r>
+          </w:p>
+        </w:tc>
+      </w:tr>
+      <w:tr>
+        <w:tc>
+          <w:tcPr>
+            <w:tcW w:type="dxa" w:w="4592"/>
+          </w:tcPr>
+          <w:p>
+            <w:pPr>
+              <w:spacing w:line="252" w:lineRule="auto" w:after="80"/>
+            </w:pPr>
+            <w:r>
+              <w:rPr>
+                <w:b w:val="0"/>
+                <w:sz w:val="20"/>
+              </w:rPr>
+              <w:t>Cổng 8000 bận</w:t>
+            </w:r>
+          </w:p>
+        </w:tc>
+        <w:tc>
+          <w:tcPr>
+            <w:tcW w:type="dxa" w:w="4592"/>
+          </w:tcPr>
+          <w:p>
+            <w:pPr>
+              <w:spacing w:line="252" w:lineRule="auto" w:after="80"/>
+            </w:pPr>
+            <w:r>
+              <w:rPr>
+                <w:b w:val="0"/>
+                <w:sz w:val="20"/>
+              </w:rPr>
+              <w:t>Dùng runserver 8001 hoặc dev.py start --port 8001</w:t>
+            </w:r>
+          </w:p>
+        </w:tc>
+      </w:tr>
+    </w:tbl>
+    <w:p/>
     <w:p>
       <w:pPr>
-        <w:spacing w:line="252" w:lineRule="auto"/>
-        <w:ind w:left="170"/>
+        <w:pStyle w:val="Heading2"/>
       </w:pPr>
       <w:r>
-        <w:rPr>
-          <w:rFonts w:ascii="Consolas" w:hAnsi="Consolas"/>
-          <w:sz w:val="18"/>
-        </w:rPr>
-        <w:t>mkdir -p .local/backups</w:t>
-        <w:br/>
-        <w:t>docker compose exec -T db pg_dump -U gentleman -d gentleman -Fc &gt; .local/backups/gentleman.dump</w:t>
+        <w:t>7. Backup và giới hạn</w:t>
       </w:r>
     </w:p>
     <w:p>
@@ -5425,15 +5755,7 @@
         <w:jc w:val="both"/>
       </w:pPr>
       <w:r>
-        <w:t>Lệnh ví dụ giả định tên DB/user mặc định; dùng tên đã cấu hình nếu khác. Backup chứa dữ liệu cá nhân, cần giữ ngoài Git, hạn chế quyền và mã hóa theo hạ tầng. Khôi phục vào database riêng để kiểm tra trước khi tác động database đang dùng. Quy trình khôi phục thực tế chưa được nghiệm thu trong phạm vi lần build này.</w:t>
-      </w:r>
-    </w:p>
-    <w:p>
-      <w:pPr>
-        <w:pStyle w:val="Heading2"/>
-      </w:pPr>
-      <w:r>
-        <w:t>5. Bảo trì và mở rộng</w:t>
+        <w:t>Dùng chức năng Backup/Restore của pgAdmin. Hoặc khi PostgreSQL client nằm trong PATH: pg_dump -h 127.0.0.1 -U postgres -d gentleman -Fc -f gentleman.dump; công cụ hỏi mật khẩu riêng. Không đưa backup/mật khẩu vào Git. Chỉ thử restore vào database riêng trước khi dùng với dữ liệu thật. Việc xóa mã nguồn không xóa dữ liệu của máy chủ PostgreSQL.</w:t>
       </w:r>
     </w:p>
     <w:p>
@@ -5441,71 +5763,7 @@
         <w:jc w:val="both"/>
       </w:pPr>
       <w:r>
-        <w:t>Muốn thêm VNPay/MoMo cần tách PaymentTransaction, trạng thái pending/success/failure, chữ ký callback, idempotency key, đối soát và chính sách hoàn tiền; không đổi tên MockPayment rồi coi là thanh toán thật. Muốn thông báo email/SMS cần transactional outbox và worker. Muốn đổi lịch cần một use case nguyên tử kiểm tra lịch mới và giữ lịch cũ khi thất bại. Muốn stylist chuyển chi nhánh cần lịch sử phân công thay vì sửa FK của nhân sự đang có lịch sử.</w:t>
-      </w:r>
-    </w:p>
-    <w:p>
-      <w:pPr>
-        <w:pStyle w:val="Heading2"/>
-      </w:pPr>
-      <w:r>
-        <w:t>6. Tài liệu tham khảo kỹ thuật</w:t>
-      </w:r>
-    </w:p>
-    <w:p>
-      <w:pPr>
-        <w:pStyle w:val="ListNumber"/>
-      </w:pPr>
-      <w:r>
-        <w:t>Django Software Foundation, Django 5.2 documentation: https://docs.djangoproject.com/en/5.2/</w:t>
-      </w:r>
-    </w:p>
-    <w:p>
-      <w:pPr>
-        <w:pStyle w:val="ListNumber"/>
-      </w:pPr>
-      <w:r>
-        <w:t>Django PostgreSQL constraints: https://docs.djangoproject.com/en/5.2/ref/contrib/postgres/constraints/</w:t>
-      </w:r>
-    </w:p>
-    <w:p>
-      <w:pPr>
-        <w:pStyle w:val="ListNumber"/>
-      </w:pPr>
-      <w:r>
-        <w:t>PostgreSQL, Range Types: https://www.postgresql.org/docs/17/rangetypes.html</w:t>
-      </w:r>
-    </w:p>
-    <w:p>
-      <w:pPr>
-        <w:pStyle w:val="ListNumber"/>
-      </w:pPr>
-      <w:r>
-        <w:t>PostgreSQL, Explicit Locking: https://www.postgresql.org/docs/17/explicit-locking.html</w:t>
-      </w:r>
-    </w:p>
-    <w:p>
-      <w:pPr>
-        <w:pStyle w:val="ListNumber"/>
-      </w:pPr>
-      <w:r>
-        <w:t>Docker Compose documentation: https://docs.docker.com/compose/</w:t>
-      </w:r>
-    </w:p>
-    <w:p>
-      <w:pPr>
-        <w:pStyle w:val="ListNumber"/>
-      </w:pPr>
-      <w:r>
-        <w:t>Playwright Python documentation: https://playwright.dev/python/</w:t>
-      </w:r>
-    </w:p>
-    <w:p>
-      <w:pPr>
-        <w:jc w:val="both"/>
-      </w:pPr>
-      <w:r>
-        <w:t>Các liên kết là nguồn tham chiếu kỹ thuật của công nghệ triển khai, không phải số liệu khảo sát doanh nghiệp. Tài liệu đầu vào do người dùng cung cấp là cơ sở phạm vi nghiệp vụ.</w:t>
+        <w:t>Đây là bản phát triển/trình diễn. Runserver không phải dịch vụ production. Triển khai công khai cần máy chủ ứng dụng phù hợp, HTTPS, secret riêng, cấu hình host, backup và giám sát; chưa được tuyên bố đã thực hiện.</w:t>
       </w:r>
     </w:p>
     <w:p>
@@ -5534,7 +5792,7 @@
         <w:jc w:val="both"/>
       </w:pPr>
       <w:r>
-        <w:t>Python 3.12.14, Django 5.2.18, psycopg 3.3.6, PostgreSQL 17 (image postgres:17-alpine), Gunicorn 26.2.0. Kiểm thử nghiệp vụ dùng PostgreSQL thực, không thay bằng SQLite hoặc mock database. Browser smoke dùng Playwright 1.62.0 và Chromium headless cài riêng.</w:t>
+        <w:t>Python 3.12.14, Django 5.2.18, psycopg 3.3.6, PostgreSQL 17.11 native (Debian 17.11-0+deb13u1). Kiểm thử nghiệp vụ dùng PostgreSQL thực, không thay bằng SQLite hoặc mock database. Browser smoke dùng Playwright 1.62.0 và Chromium headless cài riêng.</w:t>
       </w:r>
     </w:p>
     <w:p>
@@ -5623,7 +5881,7 @@
                 <w:b w:val="0"/>
                 <w:sz w:val="20"/>
               </w:rPr>
-              <w:t>bash scripts/setup.sh chạy lại</w:t>
+              <w:t>python scripts/dev.py setup --no-demo</w:t>
             </w:r>
           </w:p>
         </w:tc>
@@ -5657,7 +5915,7 @@
                 <w:b w:val="0"/>
                 <w:sz w:val="20"/>
               </w:rPr>
-              <w:t>Không có migration mới; vẫn 3 chi nhánh, 6 stylist, 6 dịch vụ, 102 lịch mẫu; không nhân đôi dữ liệu</w:t>
+              <w:t>Cài dependencies, kiểm tra PostgreSQL native, không có migration mới, collectstatic thành công; không nạp lại dữ liệu</w:t>
             </w:r>
           </w:p>
         </w:tc>
@@ -5816,7 +6074,7 @@
                 <w:b w:val="0"/>
                 <w:sz w:val="20"/>
               </w:rPr>
-              <w:t>35 test đã thực thi, 0 failed, 0 errors, 0 skipped</w:t>
+              <w:t>53 test đã thực thi, 0 failed, 0 errors, 0 skipped</w:t>
             </w:r>
           </w:p>
         </w:tc>
@@ -5975,7 +6233,7 @@
                 <w:b w:val="0"/>
                 <w:sz w:val="20"/>
               </w:rPr>
-              <w:t>Bật DB, kiểm tra migration, khởi động Django; health và trang chủ phản hồi thành công</w:t>
+              <w:t>Dùng PostgreSQL native đang chạy, kiểm tra migration và bật Django; không quản lý database qua container</w:t>
             </w:r>
           </w:p>
         </w:tc>
@@ -5994,7 +6252,7 @@
                 <w:b w:val="0"/>
                 <w:sz w:val="20"/>
               </w:rPr>
-              <w:t>Docker image</w:t>
+              <w:t>Browser smoke local</w:t>
             </w:r>
           </w:p>
         </w:tc>
@@ -6028,7 +6286,7 @@
                 <w:b w:val="0"/>
                 <w:sz w:val="20"/>
               </w:rPr>
-              <w:t>Build bằng wheelhouse trên cloud; artifact tải qua HTTPS, pip không tắt TLS</w:t>
+              <w:t>Đi hết đăng ký/đặt/hủy/check-in/phục vụ/thanh toán mô phỏng/hóa đơn/đánh giá/CSV</w:t>
             </w:r>
           </w:p>
         </w:tc>
@@ -6047,7 +6305,7 @@
                 <w:b w:val="0"/>
                 <w:sz w:val="20"/>
               </w:rPr>
-              <w:t>Gunicorn + WhiteNoise + PostgreSQL</w:t>
+              <w:t>Responsive</w:t>
             </w:r>
           </w:p>
         </w:tc>
@@ -6081,7 +6339,7 @@
                 <w:b w:val="0"/>
                 <w:sz w:val="20"/>
               </w:rPr>
-              <w:t>Container web chạy 2 workers, /health/ trả database postgresql, trang và static phục vụ được</w:t>
+              <w:t>Giao diện khách hàng 320/360/390/768/1024/1440 px; không tràn ngang; menu mobile/Escape hoạt động</w:t>
             </w:r>
           </w:p>
         </w:tc>
@@ -6100,7 +6358,7 @@
                 <w:b w:val="0"/>
                 <w:sz w:val="20"/>
               </w:rPr>
-              <w:t>Browser smoke local</w:t>
+              <w:t>Customer UI smoke</w:t>
             </w:r>
           </w:p>
         </w:tc>
@@ -6134,7 +6392,7 @@
                 <w:b w:val="0"/>
                 <w:sz w:val="20"/>
               </w:rPr>
-              <w:t>Đi hết đăng ký/đặt/hủy/check-in/phục vụ/thanh toán mô phỏng/hóa đơn/đánh giá/CSV</w:t>
+              <w:t>Bộ lọc, bộ sưu tập, preselect dịch vụ/stylist/chi nhánh, đăng nhập giữ lựa chọn, reduced motion, không JavaScript, ảnh/font local</w:t>
             </w:r>
           </w:p>
         </w:tc>
@@ -6153,7 +6411,7 @@
                 <w:b w:val="0"/>
                 <w:sz w:val="20"/>
               </w:rPr>
-              <w:t>Browser smoke qua web container</w:t>
+              <w:t>Quản trị và hồ sơ</w:t>
             </w:r>
           </w:p>
         </w:tc>
@@ -6187,7 +6445,7 @@
                 <w:b w:val="0"/>
                 <w:sz w:val="20"/>
               </w:rPr>
-              <w:t>Cùng luồng nghiệp vụ qua Gunicorn/WhiteNoise</w:t>
+              <w:t>Tạo/sửa/xóa sáu nhóm, phân quyền manager, xác nhận xóa, sửa hồ sơ, xác thực mật khẩu hiện tại, đăng nhập lại; 320–1440 px</w:t>
             </w:r>
           </w:p>
         </w:tc>
@@ -6206,7 +6464,7 @@
                 <w:b w:val="0"/>
                 <w:sz w:val="20"/>
               </w:rPr>
-              <w:t>Responsive</w:t>
+              <w:t>Schema</w:t>
             </w:r>
           </w:p>
         </w:tc>
@@ -6240,7 +6498,7 @@
                 <w:b w:val="0"/>
                 <w:sz w:val="20"/>
               </w:rPr>
-              <w:t>Giao diện khách hàng 320/360/390/768/1024/1440 px; không tràn ngang; menu mobile/Escape hoạt động</w:t>
+              <w:t>Không có migration mới; 80 tên cột tiếng Việt và kiểu dữ liệu giữ nguyên</w:t>
             </w:r>
           </w:p>
         </w:tc>
@@ -6259,7 +6517,7 @@
                 <w:b w:val="0"/>
                 <w:sz w:val="20"/>
               </w:rPr>
-              <w:t>Customer UI smoke</w:t>
+              <w:t>JavaScript</w:t>
             </w:r>
           </w:p>
         </w:tc>
@@ -6293,7 +6551,7 @@
                 <w:b w:val="0"/>
                 <w:sz w:val="20"/>
               </w:rPr>
-              <w:t>Bộ lọc, bộ sưu tập, preselect dịch vụ/stylist/chi nhánh, đăng nhập giữ lựa chọn, reduced motion, không JavaScript, ảnh/font local</w:t>
+              <w:t>Không có pageerror trong luồng browser smoke</w:t>
             </w:r>
           </w:p>
         </w:tc>
@@ -6312,7 +6570,7 @@
                 <w:b w:val="0"/>
                 <w:sz w:val="20"/>
               </w:rPr>
-              <w:t>JavaScript</w:t>
+              <w:t>check --deploy --fail-level WARNING</w:t>
             </w:r>
           </w:p>
         </w:tc>
@@ -6329,7 +6587,7 @@
                 <w:b w:val="0"/>
                 <w:sz w:val="20"/>
               </w:rPr>
-              <w:t>Đạt</w:t>
+              <w:t>Đạt với cấu hình production thử nghiệm</w:t>
             </w:r>
           </w:p>
         </w:tc>
@@ -6346,7 +6604,7 @@
                 <w:b w:val="0"/>
                 <w:sz w:val="20"/>
               </w:rPr>
-              <w:t>Không có pageerror trong luồng browser smoke</w:t>
+              <w:t>DEBUG=0 và secret ngẫu nhiên tạm thời; không phải bằng chứng đã bật HTTPS hoặc public deployment</w:t>
             </w:r>
           </w:p>
         </w:tc>
@@ -6365,7 +6623,7 @@
                 <w:b w:val="0"/>
                 <w:sz w:val="20"/>
               </w:rPr>
-              <w:t>check --deploy --fail-level WARNING</w:t>
+              <w:t>GitHub Actions</w:t>
             </w:r>
           </w:p>
         </w:tc>
@@ -6382,7 +6640,7 @@
                 <w:b w:val="0"/>
                 <w:sz w:val="20"/>
               </w:rPr>
-              <w:t>Đạt với cấu hình production thử nghiệm</w:t>
+              <w:t>Chưa xác minh kết quả trên GitHub</w:t>
             </w:r>
           </w:p>
         </w:tc>
@@ -6399,7 +6657,7 @@
                 <w:b w:val="0"/>
                 <w:sz w:val="20"/>
               </w:rPr>
-              <w:t>DEBUG=0 và secret ngẫu nhiên tạm thời; không phải bằng chứng đã bật HTTPS hoặc public deployment</w:t>
+              <w:t>Đã có workflow test/build; xem tab Actions của repository để theo dõi</w:t>
             </w:r>
           </w:p>
         </w:tc>
@@ -6418,60 +6676,7 @@
                 <w:b w:val="0"/>
                 <w:sz w:val="20"/>
               </w:rPr>
-              <w:t>GitHub Actions</w:t>
-            </w:r>
-          </w:p>
-        </w:tc>
-        <w:tc>
-          <w:tcPr>
-            <w:tcW w:type="dxa" w:w="3061"/>
-          </w:tcPr>
-          <w:p>
-            <w:pPr>
-              <w:spacing w:line="252" w:lineRule="auto" w:after="80"/>
-            </w:pPr>
-            <w:r>
-              <w:rPr>
-                <w:b w:val="0"/>
-                <w:sz w:val="20"/>
-              </w:rPr>
-              <w:t>Chưa xác minh kết quả trên GitHub</w:t>
-            </w:r>
-          </w:p>
-        </w:tc>
-        <w:tc>
-          <w:tcPr>
-            <w:tcW w:type="dxa" w:w="3061"/>
-          </w:tcPr>
-          <w:p>
-            <w:pPr>
-              <w:spacing w:line="252" w:lineRule="auto" w:after="80"/>
-            </w:pPr>
-            <w:r>
-              <w:rPr>
-                <w:b w:val="0"/>
-                <w:sz w:val="20"/>
-              </w:rPr>
-              <w:t>Đã có workflow test/build; xem tab Actions của repository để theo dõi</w:t>
-            </w:r>
-          </w:p>
-        </w:tc>
-      </w:tr>
-      <w:tr>
-        <w:tc>
-          <w:tcPr>
-            <w:tcW w:type="dxa" w:w="3061"/>
-          </w:tcPr>
-          <w:p>
-            <w:pPr>
-              <w:spacing w:line="252" w:lineRule="auto" w:after="80"/>
-            </w:pPr>
-            <w:r>
-              <w:rPr>
-                <w:b w:val="0"/>
-                <w:sz w:val="20"/>
-              </w:rPr>
-              <w:t>Thanh toán thật, SMS/email, tải lớn, restore backup</w:t>
+              <w:t>Thanh toán thật, SMS/email, tải lớn, restore production</w:t>
             </w:r>
           </w:p>
         </w:tc>
@@ -6517,7 +6722,7 @@
         <w:jc w:val="both"/>
       </w:pPr>
       <w:r>
-        <w:t>Các kiểm thử ban đầu phát hiện lỗi tên alias aggregate khi tính trung bình và thiếu savepoint khi bắt đánh giá trùng. Mã đã sửa và bộ test chạy lại thành công. Sau khi đổi tên 80 cột sang tiếng Việt không dấu, 35 kiểm thử và browser smoke đã chạy lại thành công; dữ liệu và kiểu dữ liệu PostgreSQL được đối chiếu trước/sau migration. Build Docker online ban đầu gặp DNS trong container; giải pháp dùng wheel tải trên host và cài offline đã build thành công. Đây là chẩn đoán và xử lý lỗi môi trường, không phải thay đổi phiên bản để né test.</w:t>
+        <w:t>Bản quản trị riêng được kiểm tra trên PostgreSQL native, ứng dụng kết nối trực tiếp qua TCP. Chuyển dữ liệu cloud sang database native bằng pg_dump/pg_restore có backup; đối chiếu số dòng và SHA256 nội dung của cả 12 bảng trước/sau trùng nhau. Database nguồn được giữ nguyên. Đây là kiểm chứng chuyển môi trường phát triển, không thay cho diễn tập khôi phục production.</w:t>
       </w:r>
     </w:p>
     <w:p>
@@ -6525,7 +6730,7 @@
         <w:jc w:val="both"/>
       </w:pPr>
       <w:r>
-        <w:t>Sau thiết kế lại giao diện, script check thu thập static trước khi chạy Django tests để manifest luôn chứa CSS, ảnh và font mới. Workflow GitHub tạo virtualenv trước khi gọi script này. Bộ UI smoke mới kiểm tra độc lập tương tác khách hàng; kết quả chi tiết ở docs/validation/customer-redesign.txt.</w:t>
+        <w:t>Bộ test mới phát hiện trường hợp ca làm có giờ kết thúc trước giờ bắt đầu khiến TSTZRANGE lỗi ngay trong bước kiểm tra form. Mã đã sửa: trả lỗi theo trường trước khi gửi khoảng không hợp lệ xuống PostgreSQL. Test đồng thời đóng hẳn connection của từng worker trước khi kết thúc để runner dọn được database test. Toàn bộ tests và bước dọn database chạy lại thành công. Script check thu thập static trước tests để manifest có đủ tài nguyên mới. Kết quả tại docs/validation/custom-management.txt.</w:t>
       </w:r>
     </w:p>
     <w:p>
@@ -7108,7 +7313,7 @@
                 <w:b w:val="0"/>
                 <w:sz w:val="20"/>
               </w:rPr>
-              <w:t>Không sửa ca làm mất phạm vi phục vụ lịch đã đặt</w:t>
+              <w:t>Không sửa/xóa ca làm mất phạm vi phục vụ lịch đã đặt; từ chối ca đảo giờ/trùng giờ</w:t>
             </w:r>
           </w:p>
         </w:tc>
@@ -7126,6 +7331,112 @@
                 <w:sz w:val="20"/>
               </w:rPr>
               <w:t>FR09</w:t>
+            </w:r>
+          </w:p>
+        </w:tc>
+      </w:tr>
+      <w:tr>
+        <w:tc>
+          <w:tcPr>
+            <w:tcW w:type="dxa" w:w="3061"/>
+          </w:tcPr>
+          <w:p>
+            <w:pPr>
+              <w:spacing w:line="252" w:lineRule="auto" w:after="80"/>
+            </w:pPr>
+            <w:r>
+              <w:rPr>
+                <w:b w:val="0"/>
+                <w:sz w:val="20"/>
+              </w:rPr>
+              <w:t>CRUD riêng</w:t>
+            </w:r>
+          </w:p>
+        </w:tc>
+        <w:tc>
+          <w:tcPr>
+            <w:tcW w:type="dxa" w:w="3061"/>
+          </w:tcPr>
+          <w:p>
+            <w:pPr>
+              <w:spacing w:line="252" w:lineRule="auto" w:after="80"/>
+            </w:pPr>
+            <w:r>
+              <w:rPr>
+                <w:b w:val="0"/>
+                <w:sz w:val="20"/>
+              </w:rPr>
+              <w:t>Sáu nhóm tài nguyên, chặn khách/lễ tân, không cần staff/superuser, FK PROTECT và CSRF</w:t>
+            </w:r>
+          </w:p>
+        </w:tc>
+        <w:tc>
+          <w:tcPr>
+            <w:tcW w:type="dxa" w:w="3061"/>
+          </w:tcPr>
+          <w:p>
+            <w:pPr>
+              <w:spacing w:line="252" w:lineRule="auto" w:after="80"/>
+            </w:pPr>
+            <w:r>
+              <w:rPr>
+                <w:b w:val="0"/>
+                <w:sz w:val="20"/>
+              </w:rPr>
+              <w:t>FR09, FR12</w:t>
+            </w:r>
+          </w:p>
+        </w:tc>
+      </w:tr>
+      <w:tr>
+        <w:tc>
+          <w:tcPr>
+            <w:tcW w:type="dxa" w:w="3061"/>
+          </w:tcPr>
+          <w:p>
+            <w:pPr>
+              <w:spacing w:line="252" w:lineRule="auto" w:after="80"/>
+            </w:pPr>
+            <w:r>
+              <w:rPr>
+                <w:b w:val="0"/>
+                <w:sz w:val="20"/>
+              </w:rPr>
+              <w:t>Cá nhân</w:t>
+            </w:r>
+          </w:p>
+        </w:tc>
+        <w:tc>
+          <w:tcPr>
+            <w:tcW w:type="dxa" w:w="3061"/>
+          </w:tcPr>
+          <w:p>
+            <w:pPr>
+              <w:spacing w:line="252" w:lineRule="auto" w:after="80"/>
+            </w:pPr>
+            <w:r>
+              <w:rPr>
+                <w:b w:val="0"/>
+                <w:sz w:val="20"/>
+              </w:rPr>
+              <w:t>Chỉ sửa thông tin liên hệ của mình, không sửa vai trò/điểm; đổi mật khẩu cần mật khẩu hiện tại và giữ phiên</w:t>
+            </w:r>
+          </w:p>
+        </w:tc>
+        <w:tc>
+          <w:tcPr>
+            <w:tcW w:type="dxa" w:w="3061"/>
+          </w:tcPr>
+          <w:p>
+            <w:pPr>
+              <w:spacing w:line="252" w:lineRule="auto" w:after="80"/>
+            </w:pPr>
+            <w:r>
+              <w:rPr>
+                <w:b w:val="0"/>
+                <w:sz w:val="20"/>
+              </w:rPr>
+              <w:t>FR01</w:t>
             </w:r>
           </w:p>
         </w:tc>
@@ -7476,7 +7787,7 @@
       <w:r>
         <w:drawing>
           <wp:inline xmlns:a="http://schemas.openxmlformats.org/drawingml/2006/main" xmlns:pic="http://schemas.openxmlformats.org/drawingml/2006/picture">
-            <wp:extent cx="4742224" cy="6839999"/>
+            <wp:extent cx="5760000" cy="6732000"/>
             <wp:docPr id="9" name="Picture 9"/>
             <wp:cNvGraphicFramePr>
               <a:graphicFrameLocks noChangeAspect="1"/>
@@ -7497,7 +7808,7 @@
                   <pic:spPr>
                     <a:xfrm>
                       <a:off x="0" y="0"/>
-                      <a:ext cx="4742224" cy="6839999"/>
+                      <a:ext cx="5760000" cy="6732000"/>
                     </a:xfrm>
                     <a:prstGeom prst="rect"/>
                   </pic:spPr>
@@ -7524,7 +7835,7 @@
       <w:r>
         <w:drawing>
           <wp:inline xmlns:a="http://schemas.openxmlformats.org/drawingml/2006/main" xmlns:pic="http://schemas.openxmlformats.org/drawingml/2006/picture">
-            <wp:extent cx="4545269" cy="6839999"/>
+            <wp:extent cx="4383444" cy="6839999"/>
             <wp:docPr id="10" name="Picture 10"/>
             <wp:cNvGraphicFramePr>
               <a:graphicFrameLocks noChangeAspect="1"/>
@@ -7545,7 +7856,7 @@
                   <pic:spPr>
                     <a:xfrm>
                       <a:off x="0" y="0"/>
-                      <a:ext cx="4545269" cy="6839999"/>
+                      <a:ext cx="4383444" cy="6839999"/>
                     </a:xfrm>
                     <a:prstGeom prst="rect"/>
                   </pic:spPr>
@@ -7572,7 +7883,7 @@
       <w:r>
         <w:drawing>
           <wp:inline xmlns:a="http://schemas.openxmlformats.org/drawingml/2006/main" xmlns:pic="http://schemas.openxmlformats.org/drawingml/2006/picture">
-            <wp:extent cx="1266065" cy="6839997"/>
+            <wp:extent cx="1539296" cy="6840000"/>
             <wp:docPr id="11" name="Picture 11"/>
             <wp:cNvGraphicFramePr>
               <a:graphicFrameLocks noChangeAspect="1"/>
@@ -7593,7 +7904,7 @@
                   <pic:spPr>
                     <a:xfrm>
                       <a:off x="0" y="0"/>
-                      <a:ext cx="1266065" cy="6839997"/>
+                      <a:ext cx="1539296" cy="6840000"/>
                     </a:xfrm>
                     <a:prstGeom prst="rect"/>
                   </pic:spPr>
@@ -7637,7 +7948,7 @@
         <w:jc w:val="both"/>
       </w:pPr>
       <w:r>
-        <w:t>Quy trình phát triển và trình diễn cốt lõi chạy được trên môi trường hiện tại, có Docker và hướng dẫn tái lập. Mã nguồn và tài liệu được lưu trong checkout và đã đẩy lên nhánh main của repository GitHub tunato2807-del/ptpmhdtuong theo yêu cầu người dùng. Ứng dụng chưa được triển khai thành dịch vụ công khai. Cấu hình môi trường cloud được lưu nháp để người dùng xem và publish; việc publish và phục hồi ở task mới là bước riêng, chưa được tuyên bố đã kiểm chứng.</w:t>
+        <w:t>Quy trình phát triển và trình diễn cốt lõi chạy trực tiếp với Python và PostgreSQL native, có hướng dẫn VS Code/Windows và script đa nền tảng. Mã nguồn và tài liệu được lưu trong checkout và đã đẩy lên nhánh main của repository GitHub tunato2807-del/ptpmhdtuong theo yêu cầu người dùng. Ứng dụng chưa được triển khai thành dịch vụ công khai. Cấu hình môi trường cloud được lưu nháp để người dùng xem và publish; việc publish và phục hồi ở task mới là bước riêng, chưa được tuyên bố đã kiểm chứng.</w:t>
       </w:r>
     </w:p>
     <w:p>
@@ -15112,8 +15423,589 @@
         <w:t>Bản chụp toàn trang ở docs/screenshots/home-desktop.png và docs/screenshots/home-mobile.png; biểu mẫu mobile ở docs/screenshots/booking-mobile.png.</w:t>
       </w:r>
     </w:p>
+    <w:p>
+      <w:r>
+        <w:br w:type="page"/>
+      </w:r>
+    </w:p>
+    <w:p>
+      <w:pPr>
+        <w:pStyle w:val="Heading1"/>
+      </w:pPr>
+      <w:r>
+        <w:t>Cổng quản trị riêng và trang cá nhân</w:t>
+      </w:r>
+    </w:p>
+    <w:p>
+      <w:pPr>
+        <w:pStyle w:val="Heading2"/>
+      </w:pPr>
+      <w:r>
+        <w:t>1. Phạm vi</w:t>
+      </w:r>
+    </w:p>
+    <w:p>
+      <w:pPr>
+        <w:jc w:val="both"/>
+      </w:pPr>
+      <w:r>
+        <w:t>Toàn bộ thao tác danh mục và nhân sự dùng template/view/form của GENTLEMAN, cùng nhận diện với cổng vận hành. Ứng dụng quản trị có sẵn của Django đã được gỡ khỏi INSTALLED_APPS và URL; /admin/ trả 404. File salon/admin.py được loại bỏ. Django auth/session/CSRF vẫn được dùng để xác thực và bảo vệ dữ liệu.</w:t>
+      </w:r>
+    </w:p>
+    <w:p>
+      <w:pPr>
+        <w:jc w:val="both"/>
+      </w:pPr>
+      <w:r>
+        <w:t>Các file cấu hình container, wheelhouse build và script build liên quan đã được loại khỏi dự án. Dependencies không còn Gunicorn; các script setup/start/check chỉ dùng Python và kết nối PostgreSQL có sẵn. Có hướng dẫn Windows/VS Code, không yêu cầu launcher py hoặc kích hoạt môi trường ảo bằng PowerShell.</w:t>
+      </w:r>
+    </w:p>
+    <w:p>
+      <w:pPr>
+        <w:pStyle w:val="Heading2"/>
+      </w:pPr>
+      <w:r>
+        <w:t>2. Các màn hình mới</w:t>
+      </w:r>
+    </w:p>
+    <w:tbl>
+      <w:tblPr>
+        <w:tblStyle w:val="TableGrid"/>
+        <w:tblW w:type="auto" w:w="0"/>
+        <w:tblLook w:firstColumn="1" w:firstRow="1" w:lastColumn="0" w:lastRow="0" w:noHBand="0" w:noVBand="1" w:val="04A0"/>
+      </w:tblPr>
+      <w:tblGrid>
+        <w:gridCol w:w="4592"/>
+        <w:gridCol w:w="4592"/>
+      </w:tblGrid>
+      <w:tr>
+        <w:tc>
+          <w:tcPr>
+            <w:tcW w:type="dxa" w:w="4592"/>
+          </w:tcPr>
+          <w:p>
+            <w:pPr>
+              <w:spacing w:line="252" w:lineRule="auto" w:after="80"/>
+            </w:pPr>
+            <w:r>
+              <w:rPr>
+                <w:b/>
+                <w:sz w:val="20"/>
+              </w:rPr>
+              <w:t>Đường dẫn</w:t>
+            </w:r>
+          </w:p>
+        </w:tc>
+        <w:tc>
+          <w:tcPr>
+            <w:tcW w:type="dxa" w:w="4592"/>
+          </w:tcPr>
+          <w:p>
+            <w:pPr>
+              <w:spacing w:line="252" w:lineRule="auto" w:after="80"/>
+            </w:pPr>
+            <w:r>
+              <w:rPr>
+                <w:b/>
+                <w:sz w:val="20"/>
+              </w:rPr>
+              <w:t>Mục đích</w:t>
+            </w:r>
+          </w:p>
+        </w:tc>
+      </w:tr>
+      <w:tr>
+        <w:tc>
+          <w:tcPr>
+            <w:tcW w:type="dxa" w:w="4592"/>
+          </w:tcPr>
+          <w:p>
+            <w:pPr>
+              <w:spacing w:line="252" w:lineRule="auto" w:after="80"/>
+            </w:pPr>
+            <w:r>
+              <w:rPr>
+                <w:b w:val="0"/>
+                <w:sz w:val="20"/>
+              </w:rPr>
+              <w:t>/tai-khoan/</w:t>
+            </w:r>
+          </w:p>
+        </w:tc>
+        <w:tc>
+          <w:tcPr>
+            <w:tcW w:type="dxa" w:w="4592"/>
+          </w:tcPr>
+          <w:p>
+            <w:pPr>
+              <w:spacing w:line="252" w:lineRule="auto" w:after="80"/>
+            </w:pPr>
+            <w:r>
+              <w:rPr>
+                <w:b w:val="0"/>
+                <w:sz w:val="20"/>
+              </w:rPr>
+              <w:t>Hồ sơ và đổi mật khẩu cho mọi người đăng nhập</w:t>
+            </w:r>
+          </w:p>
+        </w:tc>
+      </w:tr>
+      <w:tr>
+        <w:tc>
+          <w:tcPr>
+            <w:tcW w:type="dxa" w:w="4592"/>
+          </w:tcPr>
+          <w:p>
+            <w:pPr>
+              <w:spacing w:line="252" w:lineRule="auto" w:after="80"/>
+            </w:pPr>
+            <w:r>
+              <w:rPr>
+                <w:b w:val="0"/>
+                <w:sz w:val="20"/>
+              </w:rPr>
+              <w:t>/quan-ly/thiet-lap/</w:t>
+            </w:r>
+          </w:p>
+        </w:tc>
+        <w:tc>
+          <w:tcPr>
+            <w:tcW w:type="dxa" w:w="4592"/>
+          </w:tcPr>
+          <w:p>
+            <w:pPr>
+              <w:spacing w:line="252" w:lineRule="auto" w:after="80"/>
+            </w:pPr>
+            <w:r>
+              <w:rPr>
+                <w:b w:val="0"/>
+                <w:sz w:val="20"/>
+              </w:rPr>
+              <w:t>Sáu nhóm tài nguyên, số bản ghi và liên kết quản lý</w:t>
+            </w:r>
+          </w:p>
+        </w:tc>
+      </w:tr>
+      <w:tr>
+        <w:tc>
+          <w:tcPr>
+            <w:tcW w:type="dxa" w:w="4592"/>
+          </w:tcPr>
+          <w:p>
+            <w:pPr>
+              <w:spacing w:line="252" w:lineRule="auto" w:after="80"/>
+            </w:pPr>
+            <w:r>
+              <w:rPr>
+                <w:b w:val="0"/>
+                <w:sz w:val="20"/>
+              </w:rPr>
+              <w:t>/quan-ly/thiet-lap/{nhom}/</w:t>
+            </w:r>
+          </w:p>
+        </w:tc>
+        <w:tc>
+          <w:tcPr>
+            <w:tcW w:type="dxa" w:w="4592"/>
+          </w:tcPr>
+          <w:p>
+            <w:pPr>
+              <w:spacing w:line="252" w:lineRule="auto" w:after="80"/>
+            </w:pPr>
+            <w:r>
+              <w:rPr>
+                <w:b w:val="0"/>
+                <w:sz w:val="20"/>
+              </w:rPr>
+              <w:t>Tìm kiếm, phân trang, sửa/xóa từng bản ghi</w:t>
+            </w:r>
+          </w:p>
+        </w:tc>
+      </w:tr>
+      <w:tr>
+        <w:tc>
+          <w:tcPr>
+            <w:tcW w:type="dxa" w:w="4592"/>
+          </w:tcPr>
+          <w:p>
+            <w:pPr>
+              <w:spacing w:line="252" w:lineRule="auto" w:after="80"/>
+            </w:pPr>
+            <w:r>
+              <w:rPr>
+                <w:b w:val="0"/>
+                <w:sz w:val="20"/>
+              </w:rPr>
+              <w:t>/quan-ly/thiet-lap/{nhom}/them/</w:t>
+            </w:r>
+          </w:p>
+        </w:tc>
+        <w:tc>
+          <w:tcPr>
+            <w:tcW w:type="dxa" w:w="4592"/>
+          </w:tcPr>
+          <w:p>
+            <w:pPr>
+              <w:spacing w:line="252" w:lineRule="auto" w:after="80"/>
+            </w:pPr>
+            <w:r>
+              <w:rPr>
+                <w:b w:val="0"/>
+                <w:sz w:val="20"/>
+              </w:rPr>
+              <w:t>Tạo mới</w:t>
+            </w:r>
+          </w:p>
+        </w:tc>
+      </w:tr>
+      <w:tr>
+        <w:tc>
+          <w:tcPr>
+            <w:tcW w:type="dxa" w:w="4592"/>
+          </w:tcPr>
+          <w:p>
+            <w:pPr>
+              <w:spacing w:line="252" w:lineRule="auto" w:after="80"/>
+            </w:pPr>
+            <w:r>
+              <w:rPr>
+                <w:b w:val="0"/>
+                <w:sz w:val="20"/>
+              </w:rPr>
+              <w:t>/quan-ly/thiet-lap/{nhom}/{id}/sua/</w:t>
+            </w:r>
+          </w:p>
+        </w:tc>
+        <w:tc>
+          <w:tcPr>
+            <w:tcW w:type="dxa" w:w="4592"/>
+          </w:tcPr>
+          <w:p>
+            <w:pPr>
+              <w:spacing w:line="252" w:lineRule="auto" w:after="80"/>
+            </w:pPr>
+            <w:r>
+              <w:rPr>
+                <w:b w:val="0"/>
+                <w:sz w:val="20"/>
+              </w:rPr>
+              <w:t>Chỉnh sửa</w:t>
+            </w:r>
+          </w:p>
+        </w:tc>
+      </w:tr>
+      <w:tr>
+        <w:tc>
+          <w:tcPr>
+            <w:tcW w:type="dxa" w:w="4592"/>
+          </w:tcPr>
+          <w:p>
+            <w:pPr>
+              <w:spacing w:line="252" w:lineRule="auto" w:after="80"/>
+            </w:pPr>
+            <w:r>
+              <w:rPr>
+                <w:b w:val="0"/>
+                <w:sz w:val="20"/>
+              </w:rPr>
+              <w:t>/quan-ly/thiet-lap/{nhom}/{id}/xoa/</w:t>
+            </w:r>
+          </w:p>
+        </w:tc>
+        <w:tc>
+          <w:tcPr>
+            <w:tcW w:type="dxa" w:w="4592"/>
+          </w:tcPr>
+          <w:p>
+            <w:pPr>
+              <w:spacing w:line="252" w:lineRule="auto" w:after="80"/>
+            </w:pPr>
+            <w:r>
+              <w:rPr>
+                <w:b w:val="0"/>
+                <w:sz w:val="20"/>
+              </w:rPr>
+              <w:t>Xác nhận và thực hiện xóa bằng POST</w:t>
+            </w:r>
+          </w:p>
+        </w:tc>
+      </w:tr>
+    </w:tbl>
+    <w:p/>
+    <w:p>
+      <w:pPr>
+        <w:jc w:val="both"/>
+      </w:pPr>
+      <w:r>
+        <w:t>Nhóm: dich-vu, chi-nhanh, stylist, ghe, ca-lam, tai-khoan. Các nút trên trang vận hành dẫn thẳng vào nhóm liên quan. Màn hình có lỗi nhập liệu theo trường, thông báo kết quả, đường quay lại và xác nhận xóa.</w:t>
+      </w:r>
+    </w:p>
+    <w:p>
+      <w:pPr>
+        <w:pStyle w:val="Heading2"/>
+      </w:pPr>
+      <w:r>
+        <w:t>3. Quyền và kiểm tra dữ liệu</w:t>
+      </w:r>
+    </w:p>
+    <w:p>
+      <w:pPr>
+        <w:pStyle w:val="ListBullet"/>
+      </w:pPr>
+      <w:r>
+        <w:t>Chỉ vai trò manager truy cập CRUD; cờ staff/superuser không cấp quyền qua cổng này. Lễ tân và khách bị trả 403 ở server khi cố mở hoặc gửi POST tới URL quản trị.</w:t>
+      </w:r>
+    </w:p>
+    <w:p>
+      <w:pPr>
+        <w:pStyle w:val="ListBullet"/>
+      </w:pPr>
+      <w:r>
+        <w:t>Trang cá nhân lấy người dùng từ phiên đăng nhập. Form chỉ nhận họ tên, điện thoại, email. Các giá trị gửi thêm như role, points, password hoặc ID người khác không được lưu.</w:t>
+      </w:r>
+    </w:p>
+    <w:p>
+      <w:pPr>
+        <w:pStyle w:val="ListBullet"/>
+      </w:pPr>
+      <w:r>
+        <w:t>Đổi mật khẩu dùng PasswordChangeForm, xác nhận mật khẩu hiện tại, kiểm tra chất lượng và lưu hash; cập nhật session auth hash cho thiết bị hiện tại.</w:t>
+      </w:r>
+    </w:p>
+    <w:p>
+      <w:pPr>
+        <w:pStyle w:val="ListBullet"/>
+      </w:pPr>
+      <w:r>
+        <w:t>Tạo tài khoản yêu cầu mật khẩu; sửa có thể giữ mật khẩu cũ bằng cách để trống. Không hiển thị mật khẩu/hash, điểm hoặc quyền kỹ thuật trong form. Tự đổi mật khẩu qua trang cá nhân.</w:t>
+      </w:r>
+    </w:p>
+    <w:p>
+      <w:pPr>
+        <w:pStyle w:val="ListBullet"/>
+      </w:pPr>
+      <w:r>
+        <w:t>Không khóa, hạ quyền hoặc xóa chính tài khoản quản trị đang đăng nhập; hệ thống giữ ít nhất một manager hoạt động. Lễ tân cần chi nhánh phụ trách đang hoạt động. Khách đã có lịch hẹn giữ vai trò khách để bảo toàn lịch sử.</w:t>
+      </w:r>
+    </w:p>
+    <w:p>
+      <w:pPr>
+        <w:pStyle w:val="ListBullet"/>
+      </w:pPr>
+      <w:r>
+        <w:t>Stylist/ghế giữ chi nhánh khi sửa. Ca làm phải trong một ngày, trong giờ mở cửa, không trùng và không bỏ rơi lịch đã đặt. Ngừng stylist/ghế/chi nhánh bị chặn khi còn lịch đang cần phục vụ.</w:t>
+      </w:r>
+    </w:p>
+    <w:p>
+      <w:pPr>
+        <w:pStyle w:val="ListBullet"/>
+      </w:pPr>
+      <w:r>
+        <w:t>Xóa cần tick xác nhận và POST/CSRF. FK PROTECT giữ lịch sử. Không xóa ca đang bao phủ lịch hoạt động. GET chỉ hiển thị bước xác nhận.</w:t>
+      </w:r>
+    </w:p>
+    <w:p>
+      <w:pPr>
+        <w:pStyle w:val="ListBullet"/>
+      </w:pPr>
+      <w:r>
+        <w:t>Giao dịch quản lý dùng advisory lock và khóa chi nhánh cùng thứ tự với booking/checkout, sau đó mới khóa tài khoản; tránh chỉnh ca làm đồng thời với việc đặt lịch gây mất phạm vi phục vụ. Có AuditLog cho tạo/sửa/xóa, cập nhật hồ sơ và đổi mật khẩu, không ghi nội dung mật khẩu.</w:t>
+      </w:r>
+    </w:p>
+    <w:p>
+      <w:pPr>
+        <w:pStyle w:val="Heading2"/>
+      </w:pPr>
+      <w:r>
+        <w:t>4. Dữ liệu và nâng cấp</w:t>
+      </w:r>
+    </w:p>
+    <w:p>
+      <w:pPr>
+        <w:jc w:val="both"/>
+      </w:pPr>
+      <w:r>
+        <w:t>Giữ 12 bảng nghiệp vụ, 80 tên cột tiếng Việt và các kiểu PostgreSQL hiện có. Không có migration schema mới. Tên Python vẫn ánh xạ bằng db_column. Các bảng kỹ thuật cũ nếu đã tồn tại không bị drop hoặc xóa dữ liệu khi gỡ trang quản trị có sẵn.</w:t>
+      </w:r>
+    </w:p>
+    <w:p>
+      <w:pPr>
+        <w:jc w:val="both"/>
+      </w:pPr>
+      <w:r>
+        <w:t>Khi nâng cấp chỉ cài requirements mới, migrate, collectstatic và khởi động web. Giữ .env/database, không chạy lại seed chỉ để cập nhật tính năng.</w:t>
+      </w:r>
+    </w:p>
+    <w:p>
+      <w:pPr>
+        <w:pStyle w:val="Heading2"/>
+      </w:pPr>
+      <w:r>
+        <w:t>5. Kiểm chứng</w:t>
+      </w:r>
+    </w:p>
+    <w:p>
+      <w:pPr>
+        <w:jc w:val="both"/>
+      </w:pPr>
+      <w:r>
+        <w:t>53 tests PostgreSQL: 35 test trước và 18 test mới cho quyền CRUD, tạo/sửa/xóa sáu nhóm, xóa có xác nhận, chống sửa trường ẩn, CSRF, snapshot, ca làm, giờ mở cửa, tài khoản cá nhân và mật khẩu. Browser smoke quản trị đi qua sáu nhóm bằng thao tác thực, kiểm tra bố cục 320–1440 px, đổi mật khẩu và đăng nhập lại; tự dọn dữ liệu của mình.</w:t>
+      </w:r>
+    </w:p>
+    <w:p>
+      <w:r>
+        <w:drawing>
+          <wp:inline xmlns:a="http://schemas.openxmlformats.org/drawingml/2006/main" xmlns:pic="http://schemas.openxmlformats.org/drawingml/2006/picture">
+            <wp:extent cx="5760000" cy="4000000"/>
+            <wp:docPr id="14" name="Picture 14"/>
+            <wp:cNvGraphicFramePr>
+              <a:graphicFrameLocks noChangeAspect="1"/>
+            </wp:cNvGraphicFramePr>
+            <a:graphic>
+              <a:graphicData uri="http://schemas.openxmlformats.org/drawingml/2006/picture">
+                <pic:pic>
+                  <pic:nvPicPr>
+                    <pic:cNvPr id="0" name="management-desktop.png"/>
+                    <pic:cNvPicPr/>
+                  </pic:nvPicPr>
+                  <pic:blipFill>
+                    <a:blip r:embed="rId21"/>
+                    <a:stretch>
+                      <a:fillRect/>
+                    </a:stretch>
+                  </pic:blipFill>
+                  <pic:spPr>
+                    <a:xfrm>
+                      <a:off x="0" y="0"/>
+                      <a:ext cx="5760000" cy="4000000"/>
+                    </a:xfrm>
+                    <a:prstGeom prst="rect"/>
+                  </pic:spPr>
+                </pic:pic>
+              </a:graphicData>
+            </a:graphic>
+          </wp:inline>
+        </w:drawing>
+      </w:r>
+    </w:p>
+    <w:p>
+      <w:pPr>
+        <w:jc w:val="center"/>
+      </w:pPr>
+      <w:r>
+        <w:rPr>
+          <w:i/>
+          <w:sz w:val="20"/>
+        </w:rPr>
+        <w:t>Cổng quản lý riêng</w:t>
+      </w:r>
+    </w:p>
+    <w:p>
+      <w:r>
+        <w:drawing>
+          <wp:inline xmlns:a="http://schemas.openxmlformats.org/drawingml/2006/main" xmlns:pic="http://schemas.openxmlformats.org/drawingml/2006/picture">
+            <wp:extent cx="5760000" cy="4000000"/>
+            <wp:docPr id="15" name="Picture 15"/>
+            <wp:cNvGraphicFramePr>
+              <a:graphicFrameLocks noChangeAspect="1"/>
+            </wp:cNvGraphicFramePr>
+            <a:graphic>
+              <a:graphicData uri="http://schemas.openxmlformats.org/drawingml/2006/picture">
+                <pic:pic>
+                  <pic:nvPicPr>
+                    <pic:cNvPr id="0" name="management-services.png"/>
+                    <pic:cNvPicPr/>
+                  </pic:nvPicPr>
+                  <pic:blipFill>
+                    <a:blip r:embed="rId22"/>
+                    <a:stretch>
+                      <a:fillRect/>
+                    </a:stretch>
+                  </pic:blipFill>
+                  <pic:spPr>
+                    <a:xfrm>
+                      <a:off x="0" y="0"/>
+                      <a:ext cx="5760000" cy="4000000"/>
+                    </a:xfrm>
+                    <a:prstGeom prst="rect"/>
+                  </pic:spPr>
+                </pic:pic>
+              </a:graphicData>
+            </a:graphic>
+          </wp:inline>
+        </w:drawing>
+      </w:r>
+    </w:p>
+    <w:p>
+      <w:pPr>
+        <w:jc w:val="center"/>
+      </w:pPr>
+      <w:r>
+        <w:rPr>
+          <w:i/>
+          <w:sz w:val="20"/>
+        </w:rPr>
+        <w:t>Danh sách dịch vụ có sửa và xóa</w:t>
+      </w:r>
+    </w:p>
+    <w:p>
+      <w:r>
+        <w:drawing>
+          <wp:inline xmlns:a="http://schemas.openxmlformats.org/drawingml/2006/main" xmlns:pic="http://schemas.openxmlformats.org/drawingml/2006/picture">
+            <wp:extent cx="5301184" cy="6840000"/>
+            <wp:docPr id="16" name="Picture 16"/>
+            <wp:cNvGraphicFramePr>
+              <a:graphicFrameLocks noChangeAspect="1"/>
+            </wp:cNvGraphicFramePr>
+            <a:graphic>
+              <a:graphicData uri="http://schemas.openxmlformats.org/drawingml/2006/picture">
+                <pic:pic>
+                  <pic:nvPicPr>
+                    <pic:cNvPr id="0" name="profile-desktop.png"/>
+                    <pic:cNvPicPr/>
+                  </pic:nvPicPr>
+                  <pic:blipFill>
+                    <a:blip r:embed="rId23"/>
+                    <a:stretch>
+                      <a:fillRect/>
+                    </a:stretch>
+                  </pic:blipFill>
+                  <pic:spPr>
+                    <a:xfrm>
+                      <a:off x="0" y="0"/>
+                      <a:ext cx="5301184" cy="6840000"/>
+                    </a:xfrm>
+                    <a:prstGeom prst="rect"/>
+                  </pic:spPr>
+                </pic:pic>
+              </a:graphicData>
+            </a:graphic>
+          </wp:inline>
+        </w:drawing>
+      </w:r>
+    </w:p>
+    <w:p>
+      <w:pPr>
+        <w:jc w:val="center"/>
+      </w:pPr>
+      <w:r>
+        <w:rPr>
+          <w:i/>
+          <w:sz w:val="20"/>
+        </w:rPr>
+        <w:t>Trang cá nhân chỉnh sửa được</w:t>
+      </w:r>
+    </w:p>
+    <w:p>
+      <w:pPr>
+        <w:jc w:val="both"/>
+      </w:pPr>
+      <w:r>
+        <w:t>Ảnh mobile riêng ở screenshots/management-mobile.png và screenshots/profile-mobile.png. Dữ liệu trong ảnh là dữ liệu trình diễn.</w:t>
+      </w:r>
+    </w:p>
     <w:sectPr>
-      <w:footerReference w:type="default" r:id="rId21"/>
+      <w:footerReference w:type="default" r:id="rId24"/>
       <w:pgSz w:w="11906" w:h="16838"/>
       <w:pgMar w:top="1361" w:right="1191" w:bottom="1361" w:left="1531" w:header="720" w:footer="720" w:gutter="0"/>
       <w:cols w:space="720"/>

</xml_diff>

<commit_message>
Complete account recovery, operations reporting, loyalty ledger and verified database backups
</commit_message>
<xml_diff>
--- a/docs/BAO_CAO_PHAN_TICH_THIET_KE.docx
+++ b/docs/BAO_CAO_PHAN_TICH_THIET_KE.docx
@@ -1099,7 +1099,7 @@
                 <w:b w:val="0"/>
                 <w:sz w:val="20"/>
               </w:rPr>
-              <w:t>Tổng từ hóa đơn đã thanh toán theo ngày thanh toán, lọc chi nhánh, xuất CSV</w:t>
+              <w:t>Thực thu sau giảm, theo ngày thanh toán; lọc chi nhánh; Excel/PDF/CSV</w:t>
             </w:r>
           </w:p>
         </w:tc>
@@ -1206,6 +1206,430 @@
                 <w:sz w:val="20"/>
               </w:rPr>
               <w:t>Phải chọn khách trong phạm vi cho phép, ghi đúng người tạo trong nhật ký</w:t>
+            </w:r>
+          </w:p>
+        </w:tc>
+      </w:tr>
+      <w:tr>
+        <w:tc>
+          <w:tcPr>
+            <w:tcW w:type="dxa" w:w="3061"/>
+          </w:tcPr>
+          <w:p>
+            <w:pPr>
+              <w:spacing w:line="252" w:lineRule="auto" w:after="80"/>
+            </w:pPr>
+            <w:r>
+              <w:rPr>
+                <w:b w:val="0"/>
+                <w:sz w:val="20"/>
+              </w:rPr>
+              <w:t>FR13</w:t>
+            </w:r>
+          </w:p>
+        </w:tc>
+        <w:tc>
+          <w:tcPr>
+            <w:tcW w:type="dxa" w:w="3061"/>
+          </w:tcPr>
+          <w:p>
+            <w:pPr>
+              <w:spacing w:line="252" w:lineRule="auto" w:after="80"/>
+            </w:pPr>
+            <w:r>
+              <w:rPr>
+                <w:b w:val="0"/>
+                <w:sz w:val="20"/>
+              </w:rPr>
+              <w:t>Khôi phục mật khẩu</w:t>
+            </w:r>
+          </w:p>
+        </w:tc>
+        <w:tc>
+          <w:tcPr>
+            <w:tcW w:type="dxa" w:w="3061"/>
+          </w:tcPr>
+          <w:p>
+            <w:pPr>
+              <w:spacing w:line="252" w:lineRule="auto" w:after="80"/>
+            </w:pPr>
+            <w:r>
+              <w:rPr>
+                <w:b w:val="0"/>
+                <w:sz w:val="20"/>
+              </w:rPr>
+              <w:t>Token 1 giờ, dùng một lần; không tiết lộ email tồn tại; local email/SMTP cấu hình</w:t>
+            </w:r>
+          </w:p>
+        </w:tc>
+      </w:tr>
+      <w:tr>
+        <w:tc>
+          <w:tcPr>
+            <w:tcW w:type="dxa" w:w="3061"/>
+          </w:tcPr>
+          <w:p>
+            <w:pPr>
+              <w:spacing w:line="252" w:lineRule="auto" w:after="80"/>
+            </w:pPr>
+            <w:r>
+              <w:rPr>
+                <w:b w:val="0"/>
+                <w:sz w:val="20"/>
+              </w:rPr>
+              <w:t>FR14</w:t>
+            </w:r>
+          </w:p>
+        </w:tc>
+        <w:tc>
+          <w:tcPr>
+            <w:tcW w:type="dxa" w:w="3061"/>
+          </w:tcPr>
+          <w:p>
+            <w:pPr>
+              <w:spacing w:line="252" w:lineRule="auto" w:after="80"/>
+            </w:pPr>
+            <w:r>
+              <w:rPr>
+                <w:b w:val="0"/>
+                <w:sz w:val="20"/>
+              </w:rPr>
+              <w:t>Thông báo đầy đủ</w:t>
+            </w:r>
+          </w:p>
+        </w:tc>
+        <w:tc>
+          <w:tcPr>
+            <w:tcW w:type="dxa" w:w="3061"/>
+          </w:tcPr>
+          <w:p>
+            <w:pPr>
+              <w:spacing w:line="252" w:lineRule="auto" w:after="80"/>
+            </w:pPr>
+            <w:r>
+              <w:rPr>
+                <w:b w:val="0"/>
+                <w:sz w:val="20"/>
+              </w:rPr>
+              <w:t>Lọc/phân trang, đọc một/tất cả chỉ POST, liên kết lịch và quyền sở hữu</w:t>
+            </w:r>
+          </w:p>
+        </w:tc>
+      </w:tr>
+      <w:tr>
+        <w:tc>
+          <w:tcPr>
+            <w:tcW w:type="dxa" w:w="3061"/>
+          </w:tcPr>
+          <w:p>
+            <w:pPr>
+              <w:spacing w:line="252" w:lineRule="auto" w:after="80"/>
+            </w:pPr>
+            <w:r>
+              <w:rPr>
+                <w:b w:val="0"/>
+                <w:sz w:val="20"/>
+              </w:rPr>
+              <w:t>FR15</w:t>
+            </w:r>
+          </w:p>
+        </w:tc>
+        <w:tc>
+          <w:tcPr>
+            <w:tcW w:type="dxa" w:w="3061"/>
+          </w:tcPr>
+          <w:p>
+            <w:pPr>
+              <w:spacing w:line="252" w:lineRule="auto" w:after="80"/>
+            </w:pPr>
+            <w:r>
+              <w:rPr>
+                <w:b w:val="0"/>
+                <w:sz w:val="20"/>
+              </w:rPr>
+              <w:t>Tra cứu nhật ký</w:t>
+            </w:r>
+          </w:p>
+        </w:tc>
+        <w:tc>
+          <w:tcPr>
+            <w:tcW w:type="dxa" w:w="3061"/>
+          </w:tcPr>
+          <w:p>
+            <w:pPr>
+              <w:spacing w:line="252" w:lineRule="auto" w:after="80"/>
+            </w:pPr>
+            <w:r>
+              <w:rPr>
+                <w:b w:val="0"/>
+                <w:sz w:val="20"/>
+              </w:rPr>
+              <w:t>Chỉ manager, lọc actor/ngày/nội dung/mã lịch, không sửa/xóa nhật ký</w:t>
+            </w:r>
+          </w:p>
+        </w:tc>
+      </w:tr>
+      <w:tr>
+        <w:tc>
+          <w:tcPr>
+            <w:tcW w:type="dxa" w:w="3061"/>
+          </w:tcPr>
+          <w:p>
+            <w:pPr>
+              <w:spacing w:line="252" w:lineRule="auto" w:after="80"/>
+            </w:pPr>
+            <w:r>
+              <w:rPr>
+                <w:b w:val="0"/>
+                <w:sz w:val="20"/>
+              </w:rPr>
+              <w:t>FR16</w:t>
+            </w:r>
+          </w:p>
+        </w:tc>
+        <w:tc>
+          <w:tcPr>
+            <w:tcW w:type="dxa" w:w="3061"/>
+          </w:tcPr>
+          <w:p>
+            <w:pPr>
+              <w:spacing w:line="252" w:lineRule="auto" w:after="80"/>
+            </w:pPr>
+            <w:r>
+              <w:rPr>
+                <w:b w:val="0"/>
+                <w:sz w:val="20"/>
+              </w:rPr>
+              <w:t>Lịch tuần</w:t>
+            </w:r>
+          </w:p>
+        </w:tc>
+        <w:tc>
+          <w:tcPr>
+            <w:tcW w:type="dxa" w:w="3061"/>
+          </w:tcPr>
+          <w:p>
+            <w:pPr>
+              <w:spacing w:line="252" w:lineRule="auto" w:after="80"/>
+            </w:pPr>
+            <w:r>
+              <w:rPr>
+                <w:b w:val="0"/>
+                <w:sz w:val="20"/>
+              </w:rPr>
+              <w:t>Bảy ngày, ca làm và lịch; lọc chi nhánh/stylist theo quyền</w:t>
+            </w:r>
+          </w:p>
+        </w:tc>
+      </w:tr>
+      <w:tr>
+        <w:tc>
+          <w:tcPr>
+            <w:tcW w:type="dxa" w:w="3061"/>
+          </w:tcPr>
+          <w:p>
+            <w:pPr>
+              <w:spacing w:line="252" w:lineRule="auto" w:after="80"/>
+            </w:pPr>
+            <w:r>
+              <w:rPr>
+                <w:b w:val="0"/>
+                <w:sz w:val="20"/>
+              </w:rPr>
+              <w:t>FR17</w:t>
+            </w:r>
+          </w:p>
+        </w:tc>
+        <w:tc>
+          <w:tcPr>
+            <w:tcW w:type="dxa" w:w="3061"/>
+          </w:tcPr>
+          <w:p>
+            <w:pPr>
+              <w:spacing w:line="252" w:lineRule="auto" w:after="80"/>
+            </w:pPr>
+            <w:r>
+              <w:rPr>
+                <w:b w:val="0"/>
+                <w:sz w:val="20"/>
+              </w:rPr>
+              <w:t>Hiệu quả hoạt động</w:t>
+            </w:r>
+          </w:p>
+        </w:tc>
+        <w:tc>
+          <w:tcPr>
+            <w:tcW w:type="dxa" w:w="3061"/>
+          </w:tcPr>
+          <w:p>
+            <w:pPr>
+              <w:spacing w:line="252" w:lineRule="auto" w:after="80"/>
+            </w:pPr>
+            <w:r>
+              <w:rPr>
+                <w:b w:val="0"/>
+                <w:sz w:val="20"/>
+              </w:rPr>
+              <w:t>So kỳ trước, tỷ lệ hủy/không đến, dịch vụ và stylist; doanh thu phân bổ khớp thực thu</w:t>
+            </w:r>
+          </w:p>
+        </w:tc>
+      </w:tr>
+      <w:tr>
+        <w:tc>
+          <w:tcPr>
+            <w:tcW w:type="dxa" w:w="3061"/>
+          </w:tcPr>
+          <w:p>
+            <w:pPr>
+              <w:spacing w:line="252" w:lineRule="auto" w:after="80"/>
+            </w:pPr>
+            <w:r>
+              <w:rPr>
+                <w:b w:val="0"/>
+                <w:sz w:val="20"/>
+              </w:rPr>
+              <w:t>FR18</w:t>
+            </w:r>
+          </w:p>
+        </w:tc>
+        <w:tc>
+          <w:tcPr>
+            <w:tcW w:type="dxa" w:w="3061"/>
+          </w:tcPr>
+          <w:p>
+            <w:pPr>
+              <w:spacing w:line="252" w:lineRule="auto" w:after="80"/>
+            </w:pPr>
+            <w:r>
+              <w:rPr>
+                <w:b w:val="0"/>
+                <w:sz w:val="20"/>
+              </w:rPr>
+              <w:t>Điểm tích lũy</w:t>
+            </w:r>
+          </w:p>
+        </w:tc>
+        <w:tc>
+          <w:tcPr>
+            <w:tcW w:type="dxa" w:w="3061"/>
+          </w:tcPr>
+          <w:p>
+            <w:pPr>
+              <w:spacing w:line="252" w:lineRule="auto" w:after="80"/>
+            </w:pPr>
+            <w:r>
+              <w:rPr>
+                <w:b w:val="0"/>
+                <w:sz w:val="20"/>
+              </w:rPr>
+              <w:t>1 điểm/10.000đ thực trả; đổi 1.000đ/điểm tối đa 20%; ledger, khóa số dư, không dùng trùng</w:t>
+            </w:r>
+          </w:p>
+        </w:tc>
+      </w:tr>
+      <w:tr>
+        <w:tc>
+          <w:tcPr>
+            <w:tcW w:type="dxa" w:w="3061"/>
+          </w:tcPr>
+          <w:p>
+            <w:pPr>
+              <w:spacing w:line="252" w:lineRule="auto" w:after="80"/>
+            </w:pPr>
+            <w:r>
+              <w:rPr>
+                <w:b w:val="0"/>
+                <w:sz w:val="20"/>
+              </w:rPr>
+              <w:t>FR19</w:t>
+            </w:r>
+          </w:p>
+        </w:tc>
+        <w:tc>
+          <w:tcPr>
+            <w:tcW w:type="dxa" w:w="3061"/>
+          </w:tcPr>
+          <w:p>
+            <w:pPr>
+              <w:spacing w:line="252" w:lineRule="auto" w:after="80"/>
+            </w:pPr>
+            <w:r>
+              <w:rPr>
+                <w:b w:val="0"/>
+                <w:sz w:val="20"/>
+              </w:rPr>
+              <w:t>Sao lưu/phục hồi</w:t>
+            </w:r>
+          </w:p>
+        </w:tc>
+        <w:tc>
+          <w:tcPr>
+            <w:tcW w:type="dxa" w:w="3061"/>
+          </w:tcPr>
+          <w:p>
+            <w:pPr>
+              <w:spacing w:line="252" w:lineRule="auto" w:after="80"/>
+            </w:pPr>
+            <w:r>
+              <w:rPr>
+                <w:b w:val="0"/>
+                <w:sz w:val="20"/>
+              </w:rPr>
+              <w:t>Dump cùng snapshot, SHA256, phục hồi database mới và đối chiếu số dòng</w:t>
+            </w:r>
+          </w:p>
+        </w:tc>
+      </w:tr>
+      <w:tr>
+        <w:tc>
+          <w:tcPr>
+            <w:tcW w:type="dxa" w:w="3061"/>
+          </w:tcPr>
+          <w:p>
+            <w:pPr>
+              <w:spacing w:line="252" w:lineRule="auto" w:after="80"/>
+            </w:pPr>
+            <w:r>
+              <w:rPr>
+                <w:b w:val="0"/>
+                <w:sz w:val="20"/>
+              </w:rPr>
+              <w:t>FR20</w:t>
+            </w:r>
+          </w:p>
+        </w:tc>
+        <w:tc>
+          <w:tcPr>
+            <w:tcW w:type="dxa" w:w="3061"/>
+          </w:tcPr>
+          <w:p>
+            <w:pPr>
+              <w:spacing w:line="252" w:lineRule="auto" w:after="80"/>
+            </w:pPr>
+            <w:r>
+              <w:rPr>
+                <w:b w:val="0"/>
+                <w:sz w:val="20"/>
+              </w:rPr>
+              <w:t>Đổi lịch và nhập/xuất</w:t>
+            </w:r>
+          </w:p>
+        </w:tc>
+        <w:tc>
+          <w:tcPr>
+            <w:tcW w:type="dxa" w:w="3061"/>
+          </w:tcPr>
+          <w:p>
+            <w:pPr>
+              <w:spacing w:line="252" w:lineRule="auto" w:after="80"/>
+            </w:pPr>
+            <w:r>
+              <w:rPr>
+                <w:b w:val="0"/>
+                <w:sz w:val="20"/>
+              </w:rPr>
+              <w:t>Giữ mã/giá snapshot khi đổi; Excel xem trước/xác nhận nguyên tử; lọc và phân trang</w:t>
             </w:r>
           </w:p>
         </w:tc>
@@ -1729,7 +2153,7 @@
         <w:jc w:val="both"/>
       </w:pPr>
       <w:r>
-        <w:t>Tiền điều kiện: lịch in_service. Lễ tân kiểm tra dịch vụ, chọn tiền mặt hoặc thẻ mô phỏng. Thẻ yêu cầu xác nhận rõ. Server khóa lịch, lấy tổng từ các dòng snapshot, tạo hóa đơn unique, cộng điểm, hoàn thành lịch và phát sự kiện. Bất kỳ bước nào lỗi đều rollback. Không thu thập số thẻ, OTP hoặc thông tin ngân hàng.</w:t>
+        <w:t>Tiền điều kiện: lịch in_service. Lễ tân kiểm tra dịch vụ, chọn tiền mặt hoặc thẻ mô phỏng. Thẻ yêu cầu xác nhận rõ. Server khóa lịch, lấy tổng từ các dòng snapshot, tạo hóa đơn unique, trừ điểm theo yêu cầu (tối đa 20%), cộng điểm từ thực thu, ghi ledger và hoàn thành lịch và phát sự kiện. Bất kỳ bước nào lỗi đều rollback. Không thu thập số thẻ, OTP hoặc thông tin ngân hàng.</w:t>
       </w:r>
     </w:p>
     <w:p>
@@ -1777,7 +2201,7 @@
         <w:jc w:val="both"/>
       </w:pPr>
       <w:r>
-        <w:t>Bao gồm website khách hàng, cổng điều hành, quản trị danh mục, database migration, dữ liệu mẫu, bộ kiểm thử, hướng dẫn chạy trực tiếp và tài liệu. Không bao gồm mobile native, mạng xã hội, SMS/email bên ngoài, thanh toán ngân hàng thật, sản phẩm kho, hoa hồng/lương, thuế, voucher, hoàn tiền, AI và HA. Các nội dung này là hướng phát triển sau, không được mô tả là đã thực hiện.</w:t>
+        <w:t>Bao gồm website khách hàng, cổng điều hành, quản trị danh mục, reset mật khẩu, nhật ký/thông báo/lịch tuần, phân tích hiệu quả, điểm tích lũy và công cụ sao lưu/phục hồi, database migration, dữ liệu mẫu, bộ kiểm thử, hướng dẫn chạy trực tiếp và tài liệu. Không bao gồm mobile native, mạng xã hội, SMS, cấu hình/kiểm chứng nhà cung cấp SMTP bên ngoài, thanh toán ngân hàng thật, sản phẩm kho, hoa hồng/lương, thuế, voucher, hoàn tiền, AI và HA. Các nội dung này là hướng phát triển sau, không được mô tả là đã thực hiện.</w:t>
       </w:r>
     </w:p>
     <w:p>
@@ -2319,7 +2743,7 @@
       <w:r>
         <w:drawing>
           <wp:inline xmlns:a="http://schemas.openxmlformats.org/drawingml/2006/main" xmlns:pic="http://schemas.openxmlformats.org/drawingml/2006/picture">
-            <wp:extent cx="5477589" cy="6840000"/>
+            <wp:extent cx="4883934" cy="6839999"/>
             <wp:docPr id="1" name="Picture 1"/>
             <wp:cNvGraphicFramePr>
               <a:graphicFrameLocks noChangeAspect="1"/>
@@ -2340,7 +2764,7 @@
                   <pic:spPr>
                     <a:xfrm>
                       <a:off x="0" y="0"/>
-                      <a:ext cx="5477589" cy="6840000"/>
+                      <a:ext cx="4883934" cy="6839999"/>
                     </a:xfrm>
                     <a:prstGeom prst="rect"/>
                   </pic:spPr>
@@ -2383,7 +2807,7 @@
       <w:r>
         <w:drawing>
           <wp:inline xmlns:a="http://schemas.openxmlformats.org/drawingml/2006/main" xmlns:pic="http://schemas.openxmlformats.org/drawingml/2006/picture">
-            <wp:extent cx="5760000" cy="3210612"/>
+            <wp:extent cx="5760000" cy="5113469"/>
             <wp:docPr id="2" name="Picture 2"/>
             <wp:cNvGraphicFramePr>
               <a:graphicFrameLocks noChangeAspect="1"/>
@@ -2404,7 +2828,7 @@
                   <pic:spPr>
                     <a:xfrm>
                       <a:off x="0" y="0"/>
-                      <a:ext cx="5760000" cy="3210612"/>
+                      <a:ext cx="5760000" cy="5113469"/>
                     </a:xfrm>
                     <a:prstGeom prst="rect"/>
                   </pic:spPr>
@@ -2962,7 +3386,7 @@
                 <w:b w:val="0"/>
                 <w:sz w:val="20"/>
               </w:rPr>
-              <w:t>mahoadon bigint, malichhen bigint unique, tongthanhtoan integer, phuongthucthanhtoan varchar(10), thoigianthanhtoan timestamptz, mathungan bigint</w:t>
+              <w:t>mahoadon bigint, malichhen bigint unique, tongthanhtoan integer, tiengiam integer, diemdadung integer, phuongthucthanhtoan varchar(10), thoigianthanhtoan timestamptz, mathungan bigint</w:t>
             </w:r>
           </w:p>
         </w:tc>
@@ -3068,7 +3492,7 @@
                 <w:b w:val="0"/>
                 <w:sz w:val="20"/>
               </w:rPr>
-              <w:t>mathongbao bigint, manguoinhan bigint, noidung varchar(250), ngaytao timestamptz</w:t>
+              <w:t>mathongbao bigint, manguoinhan bigint, malichhen bigint nullable, ngaydoc timestamptz nullable, noidung varchar(250), ngaytao timestamptz</w:t>
             </w:r>
           </w:p>
         </w:tc>
@@ -3818,7 +4242,7 @@
       <w:r>
         <w:drawing>
           <wp:inline xmlns:a="http://schemas.openxmlformats.org/drawingml/2006/main" xmlns:pic="http://schemas.openxmlformats.org/drawingml/2006/picture">
-            <wp:extent cx="5760000" cy="5789388"/>
+            <wp:extent cx="5557056" cy="6839999"/>
             <wp:docPr id="5" name="Picture 5"/>
             <wp:cNvGraphicFramePr>
               <a:graphicFrameLocks noChangeAspect="1"/>
@@ -3839,7 +4263,7 @@
                   <pic:spPr>
                     <a:xfrm>
                       <a:off x="0" y="0"/>
-                      <a:ext cx="5760000" cy="5789388"/>
+                      <a:ext cx="5557056" cy="6839999"/>
                     </a:xfrm>
                     <a:prstGeom prst="rect"/>
                   </pic:spPr>
@@ -4147,7 +4571,7 @@
                 <w:b w:val="0"/>
                 <w:sz w:val="20"/>
               </w:rPr>
-              <w:t>Lịch đang hoạt động, lịch sử 30 bản gần nhất, điểm và 5 thông báo gần nhất</w:t>
+              <w:t>Lịch có tìm kiếm/phân trang; liên kết thông báo đọc/chưa đọc và lịch sử điểm</w:t>
             </w:r>
           </w:p>
         </w:tc>
@@ -4291,7 +4715,7 @@
                 <w:b w:val="0"/>
                 <w:sz w:val="20"/>
               </w:rPr>
-              <w:t>Khoảng ngày, chi nhánh, tổng/đếm/trung bình, bảng hóa đơn, CSV</w:t>
+              <w:t>Khoảng ngày, chi nhánh, tổng/đếm/trung bình, bảng hóa đơn, Excel/PDF/CSV</w:t>
             </w:r>
           </w:p>
         </w:tc>
@@ -5146,7 +5570,7 @@
         <w:jc w:val="both"/>
       </w:pPr>
       <w:r>
-        <w:t>Lỗi nhập liệu render lại form có thông báo; quyền sai 403 hoặc đối tượng ngoài scope 404; API tham số sai 400. Các thay đổi trạng thái chỉ POST và kiểm tra CSRF. Export CSV áp dụng cùng scope với báo cáo HTML.</w:t>
+        <w:t>Lỗi nhập liệu render lại form có thông báo; quyền sai 403 hoặc đối tượng ngoài scope 404; API tham số sai 400. Các thay đổi trạng thái chỉ POST và kiểm tra CSRF. Export Excel/PDF/CSV áp dụng cùng scope với báo cáo HTML.</w:t>
       </w:r>
     </w:p>
     <w:p>
@@ -5163,6 +5587,54 @@
       </w:pPr>
       <w:r>
         <w:t>Màn hình /quan-ly/thiet-lap/ thay giao diện quản trị mặc định. manager_required kiểm tra vai trò ở mỗi request; profile chỉ cập nhật người đang đăng nhập. CRUD thay đổi trong transaction, khóa chi nhánh theo thứ tự và ghi audit. GET không xóa; POST yêu cầu CSRF và xác nhận. Chi tiết tại Quản trị riêng.</w:t>
+      </w:r>
+    </w:p>
+    <w:p>
+      <w:pPr>
+        <w:pStyle w:val="Heading2"/>
+      </w:pPr>
+      <w:r>
+        <w:t>10. Hoàn thiện vận hành</w:t>
+      </w:r>
+    </w:p>
+    <w:p>
+      <w:pPr>
+        <w:jc w:val="both"/>
+      </w:pPr>
+      <w:r>
+        <w:t>operations.py cung cấp trang thông báo, nhật ký, lịch tuần và hiệu quả; PasswordResetView/ConfirmView dùng token Django với timeout 1 giờ, local email trong DEBUG hoặc SMTP cấu hình. Notification thêm malichhen nullable và ngaydoc; chỉ người nhận được đánh dấu đọc qua POST.</w:t>
+      </w:r>
+    </w:p>
+    <w:p>
+      <w:pPr>
+        <w:jc w:val="both"/>
+      </w:pPr>
+      <w:r>
+        <w:t>Invoice thêm tiengiam, diemdadung; subtotal = total + discount. Database ràng buộc discount = points_used × 1.000 và discount ≤ subtotal/5. PointEntry là bảng thứ 13, ghi customer/invoice/kind/amount/balance/created_at; unique invoice+kind và một opening mỗi khách, số điểm redeemed âm và earned/opening không âm. Migration ghi số dư chuyển tiếp, không cộng lại tiền/điểm cũ. Thanh toán khóa Branch → Appointment → User; cập nhật hóa đơn/số dư/ledger cùng transaction.</w:t>
+      </w:r>
+    </w:p>
+    <w:p>
+      <w:pPr>
+        <w:jc w:val="both"/>
+      </w:pPr>
+      <w:r>
+        <w:t>Doanh thu theo ngày paid_at, số lịch/tỷ lệ hủy theo ngày start_at. So sánh kỳ trước có cùng độ dài. Doanh thu dịch vụ phân bổ thực thu theo tỷ trọng các dòng snapshot, phần dư làm tròn thuộc dòng cuối. Mọi query operator giữ scope chi nhánh.</w:t>
+      </w:r>
+    </w:p>
+    <w:p>
+      <w:pPr>
+        <w:jc w:val="both"/>
+      </w:pPr>
+      <w:r>
+        <w:t>Backup dùng pg_dump custom từ exported snapshot repeatable-read cùng số dòng metadata; restore kiểm SHA256, chỉ tạo database mới, single transaction và so số dòng. Không phục hồi qua HTTP hoặc tự đổi cấu hình database đang dùng.</w:t>
+      </w:r>
+    </w:p>
+    <w:p>
+      <w:pPr>
+        <w:jc w:val="both"/>
+      </w:pPr>
+      <w:r>
+        <w:t>Chi tiết đường dẫn, cấu hình và quy tắc: Hoàn thiện chức năng.</w:t>
       </w:r>
     </w:p>
     <w:p>
@@ -5767,6 +6239,22 @@
       </w:r>
     </w:p>
     <w:p>
+      <w:pPr>
+        <w:pStyle w:val="Heading2"/>
+      </w:pPr>
+      <w:r>
+        <w:t>Email, điểm và sao lưu</w:t>
+      </w:r>
+    </w:p>
+    <w:p>
+      <w:pPr>
+        <w:jc w:val="both"/>
+      </w:pPr>
+      <w:r>
+        <w:t>Bản mới cần migrate 0003/0004. Hướng dẫn SMTP/local email, lịch sử/sử dụng điểm, lịch tuần và lệnh backup/restore có đối chiếu tại Hoàn thiện chức năng. Không tự cài SMTP hoặc lịch sao lưu trên máy người dùng.</w:t>
+      </w:r>
+    </w:p>
+    <w:p>
       <w:r>
         <w:br w:type="page"/>
       </w:r>
@@ -6074,7 +6562,7 @@
                 <w:b w:val="0"/>
                 <w:sz w:val="20"/>
               </w:rPr>
-              <w:t>53 test đã thực thi, 0 failed, 0 errors, 0 skipped</w:t>
+              <w:t>114 test đã thực thi, 0 failed, 0 errors, 0 skipped</w:t>
             </w:r>
           </w:p>
         </w:tc>
@@ -6498,7 +6986,7 @@
                 <w:b w:val="0"/>
                 <w:sz w:val="20"/>
               </w:rPr>
-              <w:t>Không có migration mới; 80 tên cột tiếng Việt và kiểu dữ liệu giữ nguyên</w:t>
+              <w:t>0003/0004 thêm trường và ledger; 91 cột/13 bảng, cột cũ giữ nguyên kiểu</w:t>
             </w:r>
           </w:p>
         </w:tc>
@@ -6676,7 +7164,7 @@
                 <w:b w:val="0"/>
                 <w:sz w:val="20"/>
               </w:rPr>
-              <w:t>Thanh toán thật, SMS/email, tải lớn, restore production</w:t>
+              <w:t>Ngân hàng/SMS, SMTP thật, tải lớn, restore production</w:t>
             </w:r>
           </w:p>
         </w:tc>
@@ -6710,7 +7198,7 @@
                 <w:b w:val="0"/>
                 <w:sz w:val="20"/>
               </w:rPr>
-              <w:t>Ngoài phạm vi bản dựng</w:t>
+              <w:t>Email giả lập và restore database thử đã kiểm tra; tích hợp bên ngoài chưa cấu hình</w:t>
             </w:r>
           </w:p>
         </w:tc>
@@ -7952,6 +8440,30 @@
       </w:r>
     </w:p>
     <w:p>
+      <w:pPr>
+        <w:pStyle w:val="Heading2"/>
+      </w:pPr>
+      <w:r>
+        <w:t>8. Kiểm tra phần hoàn thiện</w:t>
+      </w:r>
+    </w:p>
+    <w:p>
+      <w:pPr>
+        <w:jc w:val="both"/>
+      </w:pPr>
+      <w:r>
+        <w:t>114 tests bao gồm reset mật khẩu (email giả lập, token hết hạn/dùng lại, CSRF, gộp yêu cầu), thông báo và lịch sử điểm đúng chủ sở hữu, nhật ký chỉ manager, lịch tuần/báo cáo đúng scope, phân bổ doanh thu sau giảm, ràng buộc database và hai chi nhánh thanh toán đồng thời không dùng trùng điểm. Migration opening giữ nguyên số dư cũ, không cộng lại hóa đơn.</w:t>
+      </w:r>
+    </w:p>
+    <w:p>
+      <w:pPr>
+        <w:jc w:val="both"/>
+      </w:pPr>
+      <w:r>
+        <w:t>Kiểm tra trình duyệt ở sáu chiều rộng trên bản mới bao phủ thêm thông báo, điểm, lịch tuần, hiệu quả, nhật ký và trang quên mật khẩu. Công cụ backup/restore đã chạy trên PostgreSQL native: 22 bảng phục hồi vào database thử mới có số dòng khớp snapshot, thử phục hồi lần hai bị từ chối; database thử được dọn sau kiểm tra, database nguồn giữ nguyên. Email SMTP thật và Windows Task Scheduler cần cấu hình trên máy triển khai, không được mô tả là đã xác minh trong phiên cloud.</w:t>
+      </w:r>
+    </w:p>
+    <w:p>
       <w:r>
         <w:br w:type="page"/>
       </w:r>
@@ -7969,7 +8481,7 @@
         <w:jc w:val="both"/>
       </w:pPr>
       <w:r>
-        <w:t>Các cột của 12 bảng nghiệp vụ dùng tiếng Việt viết liền không dấu, chữ thường, không có dấu gạch dưới. Tên bảng giữ nguyên. Các kiểu dữ liệu vẫn bằng tiếng Anh và giữ nguyên kiểu, độ dài, tính NULL, khóa chính/ngoại và ràng buộc của bản trước.</w:t>
+        <w:t>Các cột của 13 bảng nghiệp vụ dùng tiếng Việt viết liền không dấu, chữ thường, không có dấu gạch dưới. Tên bảng giữ nguyên. Các kiểu dữ liệu vẫn bằng tiếng Anh. Migration đổi tên cột giữ nguyên kiểu dữ liệu cũ; các trường và bảng bổ sung có kiểu/ràng buộc theo thiết kế hiện tại.</w:t>
       </w:r>
     </w:p>
     <w:p>
@@ -7985,7 +8497,7 @@
         <w:jc w:val="both"/>
       </w:pPr>
       <w:r>
-        <w:t>Đã có database: chạy python manage.py migrate --noinput để áp dụng migration 0002_vietnamese_column_names. Migration đổi tên cột, không xóa và tạo lại dữ liệu. Tệp 0001_initial.py được giữ nguyên để có thể nâng cấp và hoàn tác đúng lịch sử.</w:t>
+        <w:t>Đã có database: chạy python manage.py migrate --noinput để áp dụng migration 0002_vietnamese_column_names và các migration 0003/0004 bổ sung thông báo, giảm điểm, số dư chuyển tiếp. Migration đổi tên cột không xóa và tạo lại dữ liệu. Tệp 0001_initial.py được giữ nguyên để có thể nâng cấp và hoàn tác đúng lịch sử.</w:t>
       </w:r>
     </w:p>
     <w:p>
@@ -13246,6 +13758,146 @@
                 <w:b w:val="0"/>
                 <w:sz w:val="20"/>
               </w:rPr>
+              <w:t>discount</w:t>
+            </w:r>
+          </w:p>
+        </w:tc>
+        <w:tc>
+          <w:tcPr>
+            <w:tcW w:type="dxa" w:w="2296"/>
+          </w:tcPr>
+          <w:p>
+            <w:pPr>
+              <w:spacing w:line="252" w:lineRule="auto" w:after="80"/>
+            </w:pPr>
+            <w:r>
+              <w:rPr>
+                <w:b w:val="0"/>
+                <w:sz w:val="20"/>
+              </w:rPr>
+              <w:t>tiengiam</w:t>
+            </w:r>
+          </w:p>
+        </w:tc>
+        <w:tc>
+          <w:tcPr>
+            <w:tcW w:type="dxa" w:w="2296"/>
+          </w:tcPr>
+          <w:p>
+            <w:pPr>
+              <w:spacing w:line="252" w:lineRule="auto" w:after="80"/>
+            </w:pPr>
+            <w:r>
+              <w:rPr>
+                <w:b w:val="0"/>
+                <w:sz w:val="20"/>
+              </w:rPr>
+              <w:t>integer</w:t>
+            </w:r>
+          </w:p>
+        </w:tc>
+        <w:tc>
+          <w:tcPr>
+            <w:tcW w:type="dxa" w:w="2296"/>
+          </w:tcPr>
+          <w:p>
+            <w:pPr>
+              <w:spacing w:line="252" w:lineRule="auto" w:after="80"/>
+            </w:pPr>
+            <w:r>
+              <w:rPr>
+                <w:b w:val="0"/>
+                <w:sz w:val="20"/>
+              </w:rPr>
+              <w:t>NOT NULL</w:t>
+            </w:r>
+          </w:p>
+        </w:tc>
+      </w:tr>
+      <w:tr>
+        <w:tc>
+          <w:tcPr>
+            <w:tcW w:type="dxa" w:w="2296"/>
+          </w:tcPr>
+          <w:p>
+            <w:pPr>
+              <w:spacing w:line="252" w:lineRule="auto" w:after="80"/>
+            </w:pPr>
+            <w:r>
+              <w:rPr>
+                <w:b w:val="0"/>
+                <w:sz w:val="20"/>
+              </w:rPr>
+              <w:t>points_used</w:t>
+            </w:r>
+          </w:p>
+        </w:tc>
+        <w:tc>
+          <w:tcPr>
+            <w:tcW w:type="dxa" w:w="2296"/>
+          </w:tcPr>
+          <w:p>
+            <w:pPr>
+              <w:spacing w:line="252" w:lineRule="auto" w:after="80"/>
+            </w:pPr>
+            <w:r>
+              <w:rPr>
+                <w:b w:val="0"/>
+                <w:sz w:val="20"/>
+              </w:rPr>
+              <w:t>diemdadung</w:t>
+            </w:r>
+          </w:p>
+        </w:tc>
+        <w:tc>
+          <w:tcPr>
+            <w:tcW w:type="dxa" w:w="2296"/>
+          </w:tcPr>
+          <w:p>
+            <w:pPr>
+              <w:spacing w:line="252" w:lineRule="auto" w:after="80"/>
+            </w:pPr>
+            <w:r>
+              <w:rPr>
+                <w:b w:val="0"/>
+                <w:sz w:val="20"/>
+              </w:rPr>
+              <w:t>integer</w:t>
+            </w:r>
+          </w:p>
+        </w:tc>
+        <w:tc>
+          <w:tcPr>
+            <w:tcW w:type="dxa" w:w="2296"/>
+          </w:tcPr>
+          <w:p>
+            <w:pPr>
+              <w:spacing w:line="252" w:lineRule="auto" w:after="80"/>
+            </w:pPr>
+            <w:r>
+              <w:rPr>
+                <w:b w:val="0"/>
+                <w:sz w:val="20"/>
+              </w:rPr>
+              <w:t>NOT NULL</w:t>
+            </w:r>
+          </w:p>
+        </w:tc>
+      </w:tr>
+      <w:tr>
+        <w:tc>
+          <w:tcPr>
+            <w:tcW w:type="dxa" w:w="2296"/>
+          </w:tcPr>
+          <w:p>
+            <w:pPr>
+              <w:spacing w:line="252" w:lineRule="auto" w:after="80"/>
+            </w:pPr>
+            <w:r>
+              <w:rPr>
+                <w:b w:val="0"/>
+                <w:sz w:val="20"/>
+              </w:rPr>
               <w:t>method</w:t>
             </w:r>
           </w:p>
@@ -14130,6 +14782,146 @@
                 <w:b w:val="0"/>
                 <w:sz w:val="20"/>
               </w:rPr>
+              <w:t>appointment_id</w:t>
+            </w:r>
+          </w:p>
+        </w:tc>
+        <w:tc>
+          <w:tcPr>
+            <w:tcW w:type="dxa" w:w="2296"/>
+          </w:tcPr>
+          <w:p>
+            <w:pPr>
+              <w:spacing w:line="252" w:lineRule="auto" w:after="80"/>
+            </w:pPr>
+            <w:r>
+              <w:rPr>
+                <w:b w:val="0"/>
+                <w:sz w:val="20"/>
+              </w:rPr>
+              <w:t>malichhen</w:t>
+            </w:r>
+          </w:p>
+        </w:tc>
+        <w:tc>
+          <w:tcPr>
+            <w:tcW w:type="dxa" w:w="2296"/>
+          </w:tcPr>
+          <w:p>
+            <w:pPr>
+              <w:spacing w:line="252" w:lineRule="auto" w:after="80"/>
+            </w:pPr>
+            <w:r>
+              <w:rPr>
+                <w:b w:val="0"/>
+                <w:sz w:val="20"/>
+              </w:rPr>
+              <w:t>bigint</w:t>
+            </w:r>
+          </w:p>
+        </w:tc>
+        <w:tc>
+          <w:tcPr>
+            <w:tcW w:type="dxa" w:w="2296"/>
+          </w:tcPr>
+          <w:p>
+            <w:pPr>
+              <w:spacing w:line="252" w:lineRule="auto" w:after="80"/>
+            </w:pPr>
+            <w:r>
+              <w:rPr>
+                <w:b w:val="0"/>
+                <w:sz w:val="20"/>
+              </w:rPr>
+              <w:t>FK → salon_appointment.malichhen; NULL</w:t>
+            </w:r>
+          </w:p>
+        </w:tc>
+      </w:tr>
+      <w:tr>
+        <w:tc>
+          <w:tcPr>
+            <w:tcW w:type="dxa" w:w="2296"/>
+          </w:tcPr>
+          <w:p>
+            <w:pPr>
+              <w:spacing w:line="252" w:lineRule="auto" w:after="80"/>
+            </w:pPr>
+            <w:r>
+              <w:rPr>
+                <w:b w:val="0"/>
+                <w:sz w:val="20"/>
+              </w:rPr>
+              <w:t>read_at</w:t>
+            </w:r>
+          </w:p>
+        </w:tc>
+        <w:tc>
+          <w:tcPr>
+            <w:tcW w:type="dxa" w:w="2296"/>
+          </w:tcPr>
+          <w:p>
+            <w:pPr>
+              <w:spacing w:line="252" w:lineRule="auto" w:after="80"/>
+            </w:pPr>
+            <w:r>
+              <w:rPr>
+                <w:b w:val="0"/>
+                <w:sz w:val="20"/>
+              </w:rPr>
+              <w:t>ngaydoc</w:t>
+            </w:r>
+          </w:p>
+        </w:tc>
+        <w:tc>
+          <w:tcPr>
+            <w:tcW w:type="dxa" w:w="2296"/>
+          </w:tcPr>
+          <w:p>
+            <w:pPr>
+              <w:spacing w:line="252" w:lineRule="auto" w:after="80"/>
+            </w:pPr>
+            <w:r>
+              <w:rPr>
+                <w:b w:val="0"/>
+                <w:sz w:val="20"/>
+              </w:rPr>
+              <w:t>timestamptz</w:t>
+            </w:r>
+          </w:p>
+        </w:tc>
+        <w:tc>
+          <w:tcPr>
+            <w:tcW w:type="dxa" w:w="2296"/>
+          </w:tcPr>
+          <w:p>
+            <w:pPr>
+              <w:spacing w:line="252" w:lineRule="auto" w:after="80"/>
+            </w:pPr>
+            <w:r>
+              <w:rPr>
+                <w:b w:val="0"/>
+                <w:sz w:val="20"/>
+              </w:rPr>
+              <w:t>NULL</w:t>
+            </w:r>
+          </w:p>
+        </w:tc>
+      </w:tr>
+      <w:tr>
+        <w:tc>
+          <w:tcPr>
+            <w:tcW w:type="dxa" w:w="2296"/>
+          </w:tcPr>
+          <w:p>
+            <w:pPr>
+              <w:spacing w:line="252" w:lineRule="auto" w:after="80"/>
+            </w:pPr>
+            <w:r>
+              <w:rPr>
+                <w:b w:val="0"/>
+                <w:sz w:val="20"/>
+              </w:rPr>
               <w:t>message</w:t>
             </w:r>
           </w:p>
@@ -14607,6 +15399,588 @@
                 <w:sz w:val="20"/>
               </w:rPr>
               <w:t>varchar(100)</w:t>
+            </w:r>
+          </w:p>
+        </w:tc>
+        <w:tc>
+          <w:tcPr>
+            <w:tcW w:type="dxa" w:w="2296"/>
+          </w:tcPr>
+          <w:p>
+            <w:pPr>
+              <w:spacing w:line="252" w:lineRule="auto" w:after="80"/>
+            </w:pPr>
+            <w:r>
+              <w:rPr>
+                <w:b w:val="0"/>
+                <w:sz w:val="20"/>
+              </w:rPr>
+              <w:t>NOT NULL</w:t>
+            </w:r>
+          </w:p>
+        </w:tc>
+      </w:tr>
+      <w:tr>
+        <w:tc>
+          <w:tcPr>
+            <w:tcW w:type="dxa" w:w="2296"/>
+          </w:tcPr>
+          <w:p>
+            <w:pPr>
+              <w:spacing w:line="252" w:lineRule="auto" w:after="80"/>
+            </w:pPr>
+            <w:r>
+              <w:rPr>
+                <w:b w:val="0"/>
+                <w:sz w:val="20"/>
+              </w:rPr>
+              <w:t>created_at</w:t>
+            </w:r>
+          </w:p>
+        </w:tc>
+        <w:tc>
+          <w:tcPr>
+            <w:tcW w:type="dxa" w:w="2296"/>
+          </w:tcPr>
+          <w:p>
+            <w:pPr>
+              <w:spacing w:line="252" w:lineRule="auto" w:after="80"/>
+            </w:pPr>
+            <w:r>
+              <w:rPr>
+                <w:b w:val="0"/>
+                <w:sz w:val="20"/>
+              </w:rPr>
+              <w:t>ngaytao</w:t>
+            </w:r>
+          </w:p>
+        </w:tc>
+        <w:tc>
+          <w:tcPr>
+            <w:tcW w:type="dxa" w:w="2296"/>
+          </w:tcPr>
+          <w:p>
+            <w:pPr>
+              <w:spacing w:line="252" w:lineRule="auto" w:after="80"/>
+            </w:pPr>
+            <w:r>
+              <w:rPr>
+                <w:b w:val="0"/>
+                <w:sz w:val="20"/>
+              </w:rPr>
+              <w:t>timestamptz</w:t>
+            </w:r>
+          </w:p>
+        </w:tc>
+        <w:tc>
+          <w:tcPr>
+            <w:tcW w:type="dxa" w:w="2296"/>
+          </w:tcPr>
+          <w:p>
+            <w:pPr>
+              <w:spacing w:line="252" w:lineRule="auto" w:after="80"/>
+            </w:pPr>
+            <w:r>
+              <w:rPr>
+                <w:b w:val="0"/>
+                <w:sz w:val="20"/>
+              </w:rPr>
+              <w:t>NOT NULL</w:t>
+            </w:r>
+          </w:p>
+        </w:tc>
+      </w:tr>
+    </w:tbl>
+    <w:p/>
+    <w:p>
+      <w:pPr>
+        <w:pStyle w:val="Heading2"/>
+      </w:pPr>
+      <w:r>
+        <w:t>13. Bảng salon_pointentry</w:t>
+      </w:r>
+    </w:p>
+    <w:tbl>
+      <w:tblPr>
+        <w:tblStyle w:val="TableGrid"/>
+        <w:tblW w:type="auto" w:w="0"/>
+        <w:tblLook w:firstColumn="1" w:firstRow="1" w:lastColumn="0" w:lastRow="0" w:noHBand="0" w:noVBand="1" w:val="04A0"/>
+      </w:tblPr>
+      <w:tblGrid>
+        <w:gridCol w:w="2296"/>
+        <w:gridCol w:w="2296"/>
+        <w:gridCol w:w="2296"/>
+        <w:gridCol w:w="2296"/>
+      </w:tblGrid>
+      <w:tr>
+        <w:tc>
+          <w:tcPr>
+            <w:tcW w:type="dxa" w:w="2296"/>
+          </w:tcPr>
+          <w:p>
+            <w:pPr>
+              <w:spacing w:line="252" w:lineRule="auto" w:after="80"/>
+            </w:pPr>
+            <w:r>
+              <w:rPr>
+                <w:b/>
+                <w:sz w:val="20"/>
+              </w:rPr>
+              <w:t>Thuộc tính Python</w:t>
+            </w:r>
+          </w:p>
+        </w:tc>
+        <w:tc>
+          <w:tcPr>
+            <w:tcW w:type="dxa" w:w="2296"/>
+          </w:tcPr>
+          <w:p>
+            <w:pPr>
+              <w:spacing w:line="252" w:lineRule="auto" w:after="80"/>
+            </w:pPr>
+            <w:r>
+              <w:rPr>
+                <w:b/>
+                <w:sz w:val="20"/>
+              </w:rPr>
+              <w:t>Tên cột tiếng Việt</w:t>
+            </w:r>
+          </w:p>
+        </w:tc>
+        <w:tc>
+          <w:tcPr>
+            <w:tcW w:type="dxa" w:w="2296"/>
+          </w:tcPr>
+          <w:p>
+            <w:pPr>
+              <w:spacing w:line="252" w:lineRule="auto" w:after="80"/>
+            </w:pPr>
+            <w:r>
+              <w:rPr>
+                <w:b/>
+                <w:sz w:val="20"/>
+              </w:rPr>
+              <w:t>Kiểu dữ liệu</w:t>
+            </w:r>
+          </w:p>
+        </w:tc>
+        <w:tc>
+          <w:tcPr>
+            <w:tcW w:type="dxa" w:w="2296"/>
+          </w:tcPr>
+          <w:p>
+            <w:pPr>
+              <w:spacing w:line="252" w:lineRule="auto" w:after="80"/>
+            </w:pPr>
+            <w:r>
+              <w:rPr>
+                <w:b/>
+                <w:sz w:val="20"/>
+              </w:rPr>
+              <w:t>Ràng buộc chính</w:t>
+            </w:r>
+          </w:p>
+        </w:tc>
+      </w:tr>
+      <w:tr>
+        <w:tc>
+          <w:tcPr>
+            <w:tcW w:type="dxa" w:w="2296"/>
+          </w:tcPr>
+          <w:p>
+            <w:pPr>
+              <w:spacing w:line="252" w:lineRule="auto" w:after="80"/>
+            </w:pPr>
+            <w:r>
+              <w:rPr>
+                <w:b w:val="0"/>
+                <w:sz w:val="20"/>
+              </w:rPr>
+              <w:t>id</w:t>
+            </w:r>
+          </w:p>
+        </w:tc>
+        <w:tc>
+          <w:tcPr>
+            <w:tcW w:type="dxa" w:w="2296"/>
+          </w:tcPr>
+          <w:p>
+            <w:pPr>
+              <w:spacing w:line="252" w:lineRule="auto" w:after="80"/>
+            </w:pPr>
+            <w:r>
+              <w:rPr>
+                <w:b w:val="0"/>
+                <w:sz w:val="20"/>
+              </w:rPr>
+              <w:t>mabiendong</w:t>
+            </w:r>
+          </w:p>
+        </w:tc>
+        <w:tc>
+          <w:tcPr>
+            <w:tcW w:type="dxa" w:w="2296"/>
+          </w:tcPr>
+          <w:p>
+            <w:pPr>
+              <w:spacing w:line="252" w:lineRule="auto" w:after="80"/>
+            </w:pPr>
+            <w:r>
+              <w:rPr>
+                <w:b w:val="0"/>
+                <w:sz w:val="20"/>
+              </w:rPr>
+              <w:t>bigint</w:t>
+            </w:r>
+          </w:p>
+        </w:tc>
+        <w:tc>
+          <w:tcPr>
+            <w:tcW w:type="dxa" w:w="2296"/>
+          </w:tcPr>
+          <w:p>
+            <w:pPr>
+              <w:spacing w:line="252" w:lineRule="auto" w:after="80"/>
+            </w:pPr>
+            <w:r>
+              <w:rPr>
+                <w:b w:val="0"/>
+                <w:sz w:val="20"/>
+              </w:rPr>
+              <w:t>PK; NOT NULL</w:t>
+            </w:r>
+          </w:p>
+        </w:tc>
+      </w:tr>
+      <w:tr>
+        <w:tc>
+          <w:tcPr>
+            <w:tcW w:type="dxa" w:w="2296"/>
+          </w:tcPr>
+          <w:p>
+            <w:pPr>
+              <w:spacing w:line="252" w:lineRule="auto" w:after="80"/>
+            </w:pPr>
+            <w:r>
+              <w:rPr>
+                <w:b w:val="0"/>
+                <w:sz w:val="20"/>
+              </w:rPr>
+              <w:t>customer_id</w:t>
+            </w:r>
+          </w:p>
+        </w:tc>
+        <w:tc>
+          <w:tcPr>
+            <w:tcW w:type="dxa" w:w="2296"/>
+          </w:tcPr>
+          <w:p>
+            <w:pPr>
+              <w:spacing w:line="252" w:lineRule="auto" w:after="80"/>
+            </w:pPr>
+            <w:r>
+              <w:rPr>
+                <w:b w:val="0"/>
+                <w:sz w:val="20"/>
+              </w:rPr>
+              <w:t>makhachhang</w:t>
+            </w:r>
+          </w:p>
+        </w:tc>
+        <w:tc>
+          <w:tcPr>
+            <w:tcW w:type="dxa" w:w="2296"/>
+          </w:tcPr>
+          <w:p>
+            <w:pPr>
+              <w:spacing w:line="252" w:lineRule="auto" w:after="80"/>
+            </w:pPr>
+            <w:r>
+              <w:rPr>
+                <w:b w:val="0"/>
+                <w:sz w:val="20"/>
+              </w:rPr>
+              <w:t>bigint</w:t>
+            </w:r>
+          </w:p>
+        </w:tc>
+        <w:tc>
+          <w:tcPr>
+            <w:tcW w:type="dxa" w:w="2296"/>
+          </w:tcPr>
+          <w:p>
+            <w:pPr>
+              <w:spacing w:line="252" w:lineRule="auto" w:after="80"/>
+            </w:pPr>
+            <w:r>
+              <w:rPr>
+                <w:b w:val="0"/>
+                <w:sz w:val="20"/>
+              </w:rPr>
+              <w:t>FK → salon_user.manguoidung; NOT NULL</w:t>
+            </w:r>
+          </w:p>
+        </w:tc>
+      </w:tr>
+      <w:tr>
+        <w:tc>
+          <w:tcPr>
+            <w:tcW w:type="dxa" w:w="2296"/>
+          </w:tcPr>
+          <w:p>
+            <w:pPr>
+              <w:spacing w:line="252" w:lineRule="auto" w:after="80"/>
+            </w:pPr>
+            <w:r>
+              <w:rPr>
+                <w:b w:val="0"/>
+                <w:sz w:val="20"/>
+              </w:rPr>
+              <w:t>invoice_id</w:t>
+            </w:r>
+          </w:p>
+        </w:tc>
+        <w:tc>
+          <w:tcPr>
+            <w:tcW w:type="dxa" w:w="2296"/>
+          </w:tcPr>
+          <w:p>
+            <w:pPr>
+              <w:spacing w:line="252" w:lineRule="auto" w:after="80"/>
+            </w:pPr>
+            <w:r>
+              <w:rPr>
+                <w:b w:val="0"/>
+                <w:sz w:val="20"/>
+              </w:rPr>
+              <w:t>mahoadon</w:t>
+            </w:r>
+          </w:p>
+        </w:tc>
+        <w:tc>
+          <w:tcPr>
+            <w:tcW w:type="dxa" w:w="2296"/>
+          </w:tcPr>
+          <w:p>
+            <w:pPr>
+              <w:spacing w:line="252" w:lineRule="auto" w:after="80"/>
+            </w:pPr>
+            <w:r>
+              <w:rPr>
+                <w:b w:val="0"/>
+                <w:sz w:val="20"/>
+              </w:rPr>
+              <w:t>bigint</w:t>
+            </w:r>
+          </w:p>
+        </w:tc>
+        <w:tc>
+          <w:tcPr>
+            <w:tcW w:type="dxa" w:w="2296"/>
+          </w:tcPr>
+          <w:p>
+            <w:pPr>
+              <w:spacing w:line="252" w:lineRule="auto" w:after="80"/>
+            </w:pPr>
+            <w:r>
+              <w:rPr>
+                <w:b w:val="0"/>
+                <w:sz w:val="20"/>
+              </w:rPr>
+              <w:t>FK → salon_invoice.mahoadon; NULL</w:t>
+            </w:r>
+          </w:p>
+        </w:tc>
+      </w:tr>
+      <w:tr>
+        <w:tc>
+          <w:tcPr>
+            <w:tcW w:type="dxa" w:w="2296"/>
+          </w:tcPr>
+          <w:p>
+            <w:pPr>
+              <w:spacing w:line="252" w:lineRule="auto" w:after="80"/>
+            </w:pPr>
+            <w:r>
+              <w:rPr>
+                <w:b w:val="0"/>
+                <w:sz w:val="20"/>
+              </w:rPr>
+              <w:t>kind</w:t>
+            </w:r>
+          </w:p>
+        </w:tc>
+        <w:tc>
+          <w:tcPr>
+            <w:tcW w:type="dxa" w:w="2296"/>
+          </w:tcPr>
+          <w:p>
+            <w:pPr>
+              <w:spacing w:line="252" w:lineRule="auto" w:after="80"/>
+            </w:pPr>
+            <w:r>
+              <w:rPr>
+                <w:b w:val="0"/>
+                <w:sz w:val="20"/>
+              </w:rPr>
+              <w:t>loai</w:t>
+            </w:r>
+          </w:p>
+        </w:tc>
+        <w:tc>
+          <w:tcPr>
+            <w:tcW w:type="dxa" w:w="2296"/>
+          </w:tcPr>
+          <w:p>
+            <w:pPr>
+              <w:spacing w:line="252" w:lineRule="auto" w:after="80"/>
+            </w:pPr>
+            <w:r>
+              <w:rPr>
+                <w:b w:val="0"/>
+                <w:sz w:val="20"/>
+              </w:rPr>
+              <w:t>varchar(20)</w:t>
+            </w:r>
+          </w:p>
+        </w:tc>
+        <w:tc>
+          <w:tcPr>
+            <w:tcW w:type="dxa" w:w="2296"/>
+          </w:tcPr>
+          <w:p>
+            <w:pPr>
+              <w:spacing w:line="252" w:lineRule="auto" w:after="80"/>
+            </w:pPr>
+            <w:r>
+              <w:rPr>
+                <w:b w:val="0"/>
+                <w:sz w:val="20"/>
+              </w:rPr>
+              <w:t>NOT NULL</w:t>
+            </w:r>
+          </w:p>
+        </w:tc>
+      </w:tr>
+      <w:tr>
+        <w:tc>
+          <w:tcPr>
+            <w:tcW w:type="dxa" w:w="2296"/>
+          </w:tcPr>
+          <w:p>
+            <w:pPr>
+              <w:spacing w:line="252" w:lineRule="auto" w:after="80"/>
+            </w:pPr>
+            <w:r>
+              <w:rPr>
+                <w:b w:val="0"/>
+                <w:sz w:val="20"/>
+              </w:rPr>
+              <w:t>amount</w:t>
+            </w:r>
+          </w:p>
+        </w:tc>
+        <w:tc>
+          <w:tcPr>
+            <w:tcW w:type="dxa" w:w="2296"/>
+          </w:tcPr>
+          <w:p>
+            <w:pPr>
+              <w:spacing w:line="252" w:lineRule="auto" w:after="80"/>
+            </w:pPr>
+            <w:r>
+              <w:rPr>
+                <w:b w:val="0"/>
+                <w:sz w:val="20"/>
+              </w:rPr>
+              <w:t>sodiem</w:t>
+            </w:r>
+          </w:p>
+        </w:tc>
+        <w:tc>
+          <w:tcPr>
+            <w:tcW w:type="dxa" w:w="2296"/>
+          </w:tcPr>
+          <w:p>
+            <w:pPr>
+              <w:spacing w:line="252" w:lineRule="auto" w:after="80"/>
+            </w:pPr>
+            <w:r>
+              <w:rPr>
+                <w:b w:val="0"/>
+                <w:sz w:val="20"/>
+              </w:rPr>
+              <w:t>integer</w:t>
+            </w:r>
+          </w:p>
+        </w:tc>
+        <w:tc>
+          <w:tcPr>
+            <w:tcW w:type="dxa" w:w="2296"/>
+          </w:tcPr>
+          <w:p>
+            <w:pPr>
+              <w:spacing w:line="252" w:lineRule="auto" w:after="80"/>
+            </w:pPr>
+            <w:r>
+              <w:rPr>
+                <w:b w:val="0"/>
+                <w:sz w:val="20"/>
+              </w:rPr>
+              <w:t>NOT NULL</w:t>
+            </w:r>
+          </w:p>
+        </w:tc>
+      </w:tr>
+      <w:tr>
+        <w:tc>
+          <w:tcPr>
+            <w:tcW w:type="dxa" w:w="2296"/>
+          </w:tcPr>
+          <w:p>
+            <w:pPr>
+              <w:spacing w:line="252" w:lineRule="auto" w:after="80"/>
+            </w:pPr>
+            <w:r>
+              <w:rPr>
+                <w:b w:val="0"/>
+                <w:sz w:val="20"/>
+              </w:rPr>
+              <w:t>balance</w:t>
+            </w:r>
+          </w:p>
+        </w:tc>
+        <w:tc>
+          <w:tcPr>
+            <w:tcW w:type="dxa" w:w="2296"/>
+          </w:tcPr>
+          <w:p>
+            <w:pPr>
+              <w:spacing w:line="252" w:lineRule="auto" w:after="80"/>
+            </w:pPr>
+            <w:r>
+              <w:rPr>
+                <w:b w:val="0"/>
+                <w:sz w:val="20"/>
+              </w:rPr>
+              <w:t>sodusaubiendong</w:t>
+            </w:r>
+          </w:p>
+        </w:tc>
+        <w:tc>
+          <w:tcPr>
+            <w:tcW w:type="dxa" w:w="2296"/>
+          </w:tcPr>
+          <w:p>
+            <w:pPr>
+              <w:spacing w:line="252" w:lineRule="auto" w:after="80"/>
+            </w:pPr>
+            <w:r>
+              <w:rPr>
+                <w:b w:val="0"/>
+                <w:sz w:val="20"/>
+              </w:rPr>
+              <w:t>integer</w:t>
             </w:r>
           </w:p>
         </w:tc>
@@ -16002,6 +17376,769 @@
       </w:pPr>
       <w:r>
         <w:t>Ảnh mobile riêng ở screenshots/management-mobile.png và screenshots/profile-mobile.png. Dữ liệu trong ảnh là dữ liệu trình diễn.</w:t>
+      </w:r>
+    </w:p>
+    <w:p>
+      <w:r>
+        <w:br w:type="page"/>
+      </w:r>
+    </w:p>
+    <w:p>
+      <w:pPr>
+        <w:pStyle w:val="Heading1"/>
+      </w:pPr>
+      <w:r>
+        <w:t>Hoàn thiện các phần tiếp theo</w:t>
+      </w:r>
+    </w:p>
+    <w:p>
+      <w:pPr>
+        <w:jc w:val="both"/>
+      </w:pPr>
+      <w:r>
+        <w:t>Bản này bổ sung quên mật khẩu, trang thông báo, nhật ký quản trị, lịch tuần, phân tích hiệu quả, sao lưu/phục hồi và lịch sử/sử dụng điểm. Giữ giao diện quản trị riêng, chạy PostgreSQL trực tiếp, không cần Docker.</w:t>
+      </w:r>
+    </w:p>
+    <w:p>
+      <w:pPr>
+        <w:pStyle w:val="Heading2"/>
+      </w:pPr>
+      <w:r>
+        <w:t>Cập nhật từ bản hiện tại</w:t>
+      </w:r>
+    </w:p>
+    <w:p>
+      <w:pPr>
+        <w:jc w:val="both"/>
+      </w:pPr>
+      <w:r>
+        <w:t>Dừng server. Trong thư mục chứa manage.py:</w:t>
+      </w:r>
+    </w:p>
+    <w:p>
+      <w:pPr>
+        <w:spacing w:line="252" w:lineRule="auto"/>
+        <w:ind w:left="170"/>
+      </w:pPr>
+      <w:r>
+        <w:rPr>
+          <w:rFonts w:ascii="Consolas" w:hAnsi="Consolas"/>
+          <w:sz w:val="18"/>
+        </w:rPr>
+        <w:t>Invoke-WebRequest -Uri "https://raw.githubusercontent.com/tunato2807-del/ptpmhdtuong/main/scripts/cap_nhat_du_an.py" -OutFile ".\scripts\cap_nhat_du_an.py"</w:t>
+        <w:br/>
+        <w:t>.\.venv\Scripts\python.exe .\scripts\cap_nhat_du_an.py</w:t>
+        <w:br/>
+        <w:t>.\.venv\Scripts\python.exe -m pip install -r requirements.txt</w:t>
+        <w:br/>
+        <w:t>.\.venv\Scripts\python.exe manage.py migrate</w:t>
+        <w:br/>
+        <w:t>.\.venv\Scripts\python.exe manage.py check</w:t>
+        <w:br/>
+        <w:t>.\.venv\Scripts\python.exe manage.py collectstatic --noinput</w:t>
+        <w:br/>
+        <w:t>.\.venv\Scripts\python.exe manage.py runserver</w:t>
+      </w:r>
+    </w:p>
+    <w:p>
+      <w:pPr>
+        <w:jc w:val="both"/>
+      </w:pPr>
+      <w:r>
+        <w:t>Phải chạy migrate trước khi mở trang mới. Migration 0003 thêm trường thông báo/giảm điểm và bảng lịch sử điểm; 0004 ghi số dư chuyển tiếp từ điểm đang có, không cộng lại hóa đơn cũ, không sửa tổng tiền hóa đơn đã thanh toán. Không chạy lại seed khi cập nhật. Mã và tài liệu cũ được sao lưu; .env, .venv, database giữ nguyên. Script cũng đồng bộ tài liệu và báo cáo Word cập nhật vào docs/.</w:t>
+      </w:r>
+    </w:p>
+    <w:p>
+      <w:pPr>
+        <w:jc w:val="both"/>
+      </w:pPr>
+      <w:r>
+        <w:t>Nếu copy thủ công, toàn bộ mã có trên GitHub: operations.py, models.py, services.py, events.py, views.py, features.py, urls.py, checks.py, settings.py, migration, templates/operations, templates/auth, các template base/hồ sơ/hóa đơn/chi tiết, CSS quản trị, JS app. Copy trọn bộ cùng phiên bản để không thiếu template.</w:t>
+      </w:r>
+    </w:p>
+    <w:p>
+      <w:pPr>
+        <w:pStyle w:val="Heading2"/>
+      </w:pPr>
+      <w:r>
+        <w:t>Vị trí các chức năng</w:t>
+      </w:r>
+    </w:p>
+    <w:tbl>
+      <w:tblPr>
+        <w:tblStyle w:val="TableGrid"/>
+        <w:tblW w:type="auto" w:w="0"/>
+        <w:tblLook w:firstColumn="1" w:firstRow="1" w:lastColumn="0" w:lastRow="0" w:noHBand="0" w:noVBand="1" w:val="04A0"/>
+      </w:tblPr>
+      <w:tblGrid>
+        <w:gridCol w:w="3061"/>
+        <w:gridCol w:w="3061"/>
+        <w:gridCol w:w="3061"/>
+      </w:tblGrid>
+      <w:tr>
+        <w:tc>
+          <w:tcPr>
+            <w:tcW w:type="dxa" w:w="3061"/>
+          </w:tcPr>
+          <w:p>
+            <w:pPr>
+              <w:spacing w:line="252" w:lineRule="auto" w:after="80"/>
+            </w:pPr>
+            <w:r>
+              <w:rPr>
+                <w:b/>
+                <w:sz w:val="20"/>
+              </w:rPr>
+              <w:t>Đường dẫn</w:t>
+            </w:r>
+          </w:p>
+        </w:tc>
+        <w:tc>
+          <w:tcPr>
+            <w:tcW w:type="dxa" w:w="3061"/>
+          </w:tcPr>
+          <w:p>
+            <w:pPr>
+              <w:spacing w:line="252" w:lineRule="auto" w:after="80"/>
+            </w:pPr>
+            <w:r>
+              <w:rPr>
+                <w:b/>
+                <w:sz w:val="20"/>
+              </w:rPr>
+              <w:t>Hành vi</w:t>
+            </w:r>
+          </w:p>
+        </w:tc>
+        <w:tc>
+          <w:tcPr>
+            <w:tcW w:type="dxa" w:w="3061"/>
+          </w:tcPr>
+          <w:p>
+            <w:pPr>
+              <w:spacing w:line="252" w:lineRule="auto" w:after="80"/>
+            </w:pPr>
+            <w:r>
+              <w:rPr>
+                <w:b/>
+                <w:sz w:val="20"/>
+              </w:rPr>
+              <w:t>Quyền</w:t>
+            </w:r>
+          </w:p>
+        </w:tc>
+      </w:tr>
+      <w:tr>
+        <w:tc>
+          <w:tcPr>
+            <w:tcW w:type="dxa" w:w="3061"/>
+          </w:tcPr>
+          <w:p>
+            <w:pPr>
+              <w:spacing w:line="252" w:lineRule="auto" w:after="80"/>
+            </w:pPr>
+            <w:r>
+              <w:rPr>
+                <w:b w:val="0"/>
+                <w:sz w:val="20"/>
+              </w:rPr>
+              <w:t>/quen-mat-khau/</w:t>
+            </w:r>
+          </w:p>
+        </w:tc>
+        <w:tc>
+          <w:tcPr>
+            <w:tcW w:type="dxa" w:w="3061"/>
+          </w:tcPr>
+          <w:p>
+            <w:pPr>
+              <w:spacing w:line="252" w:lineRule="auto" w:after="80"/>
+            </w:pPr>
+            <w:r>
+              <w:rPr>
+                <w:b w:val="0"/>
+                <w:sz w:val="20"/>
+              </w:rPr>
+              <w:t>Gửi liên kết đặt lại, token hiệu lực 1 giờ; dùng một lần sau khi đổi thành công</w:t>
+            </w:r>
+          </w:p>
+        </w:tc>
+        <w:tc>
+          <w:tcPr>
+            <w:tcW w:type="dxa" w:w="3061"/>
+          </w:tcPr>
+          <w:p>
+            <w:pPr>
+              <w:spacing w:line="252" w:lineRule="auto" w:after="80"/>
+            </w:pPr>
+            <w:r>
+              <w:rPr>
+                <w:b w:val="0"/>
+                <w:sz w:val="20"/>
+              </w:rPr>
+              <w:t>Công khai</w:t>
+            </w:r>
+          </w:p>
+        </w:tc>
+      </w:tr>
+      <w:tr>
+        <w:tc>
+          <w:tcPr>
+            <w:tcW w:type="dxa" w:w="3061"/>
+          </w:tcPr>
+          <w:p>
+            <w:pPr>
+              <w:spacing w:line="252" w:lineRule="auto" w:after="80"/>
+            </w:pPr>
+            <w:r>
+              <w:rPr>
+                <w:b w:val="0"/>
+                <w:sz w:val="20"/>
+              </w:rPr>
+              <w:t>/thong-bao/</w:t>
+            </w:r>
+          </w:p>
+        </w:tc>
+        <w:tc>
+          <w:tcPr>
+            <w:tcW w:type="dxa" w:w="3061"/>
+          </w:tcPr>
+          <w:p>
+            <w:pPr>
+              <w:spacing w:line="252" w:lineRule="auto" w:after="80"/>
+            </w:pPr>
+            <w:r>
+              <w:rPr>
+                <w:b w:val="0"/>
+                <w:sz w:val="20"/>
+              </w:rPr>
+              <w:t>Lọc đọc/chưa đọc, phân trang, xem lịch, đánh dấu một/tất cả đã đọc</w:t>
+            </w:r>
+          </w:p>
+        </w:tc>
+        <w:tc>
+          <w:tcPr>
+            <w:tcW w:type="dxa" w:w="3061"/>
+          </w:tcPr>
+          <w:p>
+            <w:pPr>
+              <w:spacing w:line="252" w:lineRule="auto" w:after="80"/>
+            </w:pPr>
+            <w:r>
+              <w:rPr>
+                <w:b w:val="0"/>
+                <w:sz w:val="20"/>
+              </w:rPr>
+              <w:t>Chỉ thông báo của mình</w:t>
+            </w:r>
+          </w:p>
+        </w:tc>
+      </w:tr>
+      <w:tr>
+        <w:tc>
+          <w:tcPr>
+            <w:tcW w:type="dxa" w:w="3061"/>
+          </w:tcPr>
+          <w:p>
+            <w:pPr>
+              <w:spacing w:line="252" w:lineRule="auto" w:after="80"/>
+            </w:pPr>
+            <w:r>
+              <w:rPr>
+                <w:b w:val="0"/>
+                <w:sz w:val="20"/>
+              </w:rPr>
+              <w:t>/diem-tich-luy/</w:t>
+            </w:r>
+          </w:p>
+        </w:tc>
+        <w:tc>
+          <w:tcPr>
+            <w:tcW w:type="dxa" w:w="3061"/>
+          </w:tcPr>
+          <w:p>
+            <w:pPr>
+              <w:spacing w:line="252" w:lineRule="auto" w:after="80"/>
+            </w:pPr>
+            <w:r>
+              <w:rPr>
+                <w:b w:val="0"/>
+                <w:sz w:val="20"/>
+              </w:rPr>
+              <w:t>Quy tắc và lịch sử điểm, số dư sau từng biến động, liên kết hóa đơn</w:t>
+            </w:r>
+          </w:p>
+        </w:tc>
+        <w:tc>
+          <w:tcPr>
+            <w:tcW w:type="dxa" w:w="3061"/>
+          </w:tcPr>
+          <w:p>
+            <w:pPr>
+              <w:spacing w:line="252" w:lineRule="auto" w:after="80"/>
+            </w:pPr>
+            <w:r>
+              <w:rPr>
+                <w:b w:val="0"/>
+                <w:sz w:val="20"/>
+              </w:rPr>
+              <w:t>Chỉ điểm của mình</w:t>
+            </w:r>
+          </w:p>
+        </w:tc>
+      </w:tr>
+      <w:tr>
+        <w:tc>
+          <w:tcPr>
+            <w:tcW w:type="dxa" w:w="3061"/>
+          </w:tcPr>
+          <w:p>
+            <w:pPr>
+              <w:spacing w:line="252" w:lineRule="auto" w:after="80"/>
+            </w:pPr>
+            <w:r>
+              <w:rPr>
+                <w:b w:val="0"/>
+                <w:sz w:val="20"/>
+              </w:rPr>
+              <w:t>/quan-ly/nhat-ky/</w:t>
+            </w:r>
+          </w:p>
+        </w:tc>
+        <w:tc>
+          <w:tcPr>
+            <w:tcW w:type="dxa" w:w="3061"/>
+          </w:tcPr>
+          <w:p>
+            <w:pPr>
+              <w:spacing w:line="252" w:lineRule="auto" w:after="80"/>
+            </w:pPr>
+            <w:r>
+              <w:rPr>
+                <w:b w:val="0"/>
+                <w:sz w:val="20"/>
+              </w:rPr>
+              <w:t>Tra cứu người thao tác, ngày, nội dung/mã lịch; chỉ đọc</w:t>
+            </w:r>
+          </w:p>
+        </w:tc>
+        <w:tc>
+          <w:tcPr>
+            <w:tcW w:type="dxa" w:w="3061"/>
+          </w:tcPr>
+          <w:p>
+            <w:pPr>
+              <w:spacing w:line="252" w:lineRule="auto" w:after="80"/>
+            </w:pPr>
+            <w:r>
+              <w:rPr>
+                <w:b w:val="0"/>
+                <w:sz w:val="20"/>
+              </w:rPr>
+              <w:t>Quản trị</w:t>
+            </w:r>
+          </w:p>
+        </w:tc>
+      </w:tr>
+      <w:tr>
+        <w:tc>
+          <w:tcPr>
+            <w:tcW w:type="dxa" w:w="3061"/>
+          </w:tcPr>
+          <w:p>
+            <w:pPr>
+              <w:spacing w:line="252" w:lineRule="auto" w:after="80"/>
+            </w:pPr>
+            <w:r>
+              <w:rPr>
+                <w:b w:val="0"/>
+                <w:sz w:val="20"/>
+              </w:rPr>
+              <w:t>/quan-ly/lich-tuan/</w:t>
+            </w:r>
+          </w:p>
+        </w:tc>
+        <w:tc>
+          <w:tcPr>
+            <w:tcW w:type="dxa" w:w="3061"/>
+          </w:tcPr>
+          <w:p>
+            <w:pPr>
+              <w:spacing w:line="252" w:lineRule="auto" w:after="80"/>
+            </w:pPr>
+            <w:r>
+              <w:rPr>
+                <w:b w:val="0"/>
+                <w:sz w:val="20"/>
+              </w:rPr>
+              <w:t>Bảy ngày từ thứ Hai; tuần trước/sau; lọc chi nhánh, stylist; xem ca và mở lịch</w:t>
+            </w:r>
+          </w:p>
+        </w:tc>
+        <w:tc>
+          <w:tcPr>
+            <w:tcW w:type="dxa" w:w="3061"/>
+          </w:tcPr>
+          <w:p>
+            <w:pPr>
+              <w:spacing w:line="252" w:lineRule="auto" w:after="80"/>
+            </w:pPr>
+            <w:r>
+              <w:rPr>
+                <w:b w:val="0"/>
+                <w:sz w:val="20"/>
+              </w:rPr>
+              <w:t>Operator trong phạm vi chi nhánh</w:t>
+            </w:r>
+          </w:p>
+        </w:tc>
+      </w:tr>
+      <w:tr>
+        <w:tc>
+          <w:tcPr>
+            <w:tcW w:type="dxa" w:w="3061"/>
+          </w:tcPr>
+          <w:p>
+            <w:pPr>
+              <w:spacing w:line="252" w:lineRule="auto" w:after="80"/>
+            </w:pPr>
+            <w:r>
+              <w:rPr>
+                <w:b w:val="0"/>
+                <w:sz w:val="20"/>
+              </w:rPr>
+              <w:t>/quan-ly/hieu-qua/</w:t>
+            </w:r>
+          </w:p>
+        </w:tc>
+        <w:tc>
+          <w:tcPr>
+            <w:tcW w:type="dxa" w:w="3061"/>
+          </w:tcPr>
+          <w:p>
+            <w:pPr>
+              <w:spacing w:line="252" w:lineRule="auto" w:after="80"/>
+            </w:pPr>
+            <w:r>
+              <w:rPr>
+                <w:b w:val="0"/>
+                <w:sz w:val="20"/>
+              </w:rPr>
+              <w:t>Doanh thu kỳ này/kỳ trước, dịch vụ, stylist, hủy/không đến; Excel/PDF</w:t>
+            </w:r>
+          </w:p>
+        </w:tc>
+        <w:tc>
+          <w:tcPr>
+            <w:tcW w:type="dxa" w:w="3061"/>
+          </w:tcPr>
+          <w:p>
+            <w:pPr>
+              <w:spacing w:line="252" w:lineRule="auto" w:after="80"/>
+            </w:pPr>
+            <w:r>
+              <w:rPr>
+                <w:b w:val="0"/>
+                <w:sz w:val="20"/>
+              </w:rPr>
+              <w:t>Operator trong phạm vi chi nhánh</w:t>
+            </w:r>
+          </w:p>
+        </w:tc>
+      </w:tr>
+    </w:tbl>
+    <w:p/>
+    <w:p>
+      <w:pPr>
+        <w:jc w:val="both"/>
+      </w:pPr>
+      <w:r>
+        <w:t>Các liên kết mới nằm trong menu quản trị, thanh điều hướng khách và hồ sơ. Thông báo cũ vẫn được giữ; chỉ thông báo phát sinh sau cập nhật có FK lịch để dẫn tới chi tiết.</w:t>
+      </w:r>
+    </w:p>
+    <w:p>
+      <w:pPr>
+        <w:pStyle w:val="Heading2"/>
+      </w:pPr>
+      <w:r>
+        <w:t>Email khôi phục mật khẩu</w:t>
+      </w:r>
+    </w:p>
+    <w:p>
+      <w:pPr>
+        <w:jc w:val="both"/>
+      </w:pPr>
+      <w:r>
+        <w:t>Mặc định khi DEBUG=1, email được lưu thành file trong .local/emails để demo trên máy, không gửi ra hộp thư thật. Mở file mới nhất để xem liên kết. Không công khai thư mục này hoặc chia sẻ liên kết đặt lại. Tài khoản cần có email, đang hoạt động và có mật khẩu; tài khoản nhập Excel chưa được đặt mật khẩu sẽ không nhận luồng reset cho tới khi quản trị đặt mật khẩu.</w:t>
+      </w:r>
+    </w:p>
+    <w:p>
+      <w:pPr>
+        <w:jc w:val="both"/>
+      </w:pPr>
+      <w:r>
+        <w:t>Để gửi thật, thêm thông tin SMTP của bạn vào .env (không commit mật khẩu):</w:t>
+      </w:r>
+    </w:p>
+    <w:p>
+      <w:pPr>
+        <w:spacing w:line="252" w:lineRule="auto"/>
+        <w:ind w:left="170"/>
+      </w:pPr>
+      <w:r>
+        <w:rPr>
+          <w:rFonts w:ascii="Consolas" w:hAnsi="Consolas"/>
+          <w:sz w:val="18"/>
+        </w:rPr>
+        <w:t>EMAIL_BACKEND=django.core.mail.backends.smtp.EmailBackend</w:t>
+        <w:br/>
+        <w:t>EMAIL_HOST=smtp.example.com</w:t>
+        <w:br/>
+        <w:t>EMAIL_PORT=587</w:t>
+        <w:br/>
+        <w:t>EMAIL_USE_TLS=1</w:t>
+        <w:br/>
+        <w:t>EMAIL_HOST_USER=YOUR_EMAIL</w:t>
+        <w:br/>
+        <w:t>EMAIL_HOST_PASSWORD=YOUR_APP_PASSWORD</w:t>
+        <w:br/>
+        <w:t>DEFAULT_FROM_EMAIL=Gentleman &lt;YOUR_EMAIL&gt;</w:t>
+      </w:r>
+    </w:p>
+    <w:p>
+      <w:pPr>
+        <w:jc w:val="both"/>
+      </w:pPr>
+      <w:r>
+        <w:t>Thay giá trị bằng dịch vụ email thực tế rồi khởi động lại. Liên kết dùng domain đang truy cập website; localhost chỉ mở được trên chính máy đó. Các bài kiểm thử dùng email backend trong bộ nhớ, không gửi thư ra ngoài. Cấu hình SMTP cần được xác minh với nhà cung cấp email trên máy triển khai.</w:t>
+      </w:r>
+    </w:p>
+    <w:p>
+      <w:pPr>
+        <w:jc w:val="both"/>
+      </w:pPr>
+      <w:r>
+        <w:t>Yêu cầu lặp cùng email trong một phút được gộp qua cache mặc định của Django (cache cục bộ theo process). Đưa lên nhiều worker cần dùng cache chung để giới hạn thống nhất. Kết quả không tiết lộ email có tồn tại; token hết hạn/đã dùng bị từ chối, mật khẩu mới đi qua các validator Django.</w:t>
+      </w:r>
+    </w:p>
+    <w:p>
+      <w:pPr>
+        <w:pStyle w:val="Heading2"/>
+      </w:pPr>
+      <w:r>
+        <w:t>Điểm và số tiền thanh toán</w:t>
+      </w:r>
+    </w:p>
+    <w:p>
+      <w:pPr>
+        <w:pStyle w:val="ListBullet"/>
+      </w:pPr>
+      <w:r>
+        <w:t>Mỗi 10.000đ thực trả sau giảm được 1 điểm, làm tròn xuống.</w:t>
+      </w:r>
+    </w:p>
+    <w:p>
+      <w:pPr>
+        <w:pStyle w:val="ListBullet"/>
+      </w:pPr>
+      <w:r>
+        <w:t>1 điểm giảm 1.000đ; giảm tối đa 20% giá dịch vụ trên lịch.</w:t>
+      </w:r>
+    </w:p>
+    <w:p>
+      <w:pPr>
+        <w:pStyle w:val="ListBullet"/>
+      </w:pPr>
+      <w:r>
+        <w:t>Chỉ dùng điểm đang có trước giao dịch. Lễ tân nhập số điểm theo yêu cầu của khách khi thanh toán; màn hình tính trước số tiền cần thu, server kiểm tra lại.</w:t>
+      </w:r>
+    </w:p>
+    <w:p>
+      <w:pPr>
+        <w:pStyle w:val="ListBullet"/>
+      </w:pPr>
+      <w:r>
+        <w:t>Khóa số dư khách trong transaction, không cho hai chi nhánh dùng trùng điểm. Hóa đơn, trừ/cộng điểm, lịch sử điểm và trạng thái lịch cùng thành công hoặc cùng hoàn tác.</w:t>
+      </w:r>
+    </w:p>
+    <w:p>
+      <w:pPr>
+        <w:pStyle w:val="ListBullet"/>
+      </w:pPr>
+      <w:r>
+        <w:t>Hóa đơn in/PDF có tiền dịch vụ, giảm điểm và thực thu. Báo cáo sử dụng thực thu. Doanh thu theo dịch vụ phân bổ theo tỷ trọng giá snapshot, phần làm tròn được đưa vào dòng cuối để tổng khớp hóa đơn.</w:t>
+      </w:r>
+    </w:p>
+    <w:p>
+      <w:pPr>
+        <w:pStyle w:val="ListBullet"/>
+      </w:pPr>
+      <w:r>
+        <w:t>Lịch sử điểm chỉ đọc. Số dư chuyển tiếp là điểm trước nâng cấp; không dựng lại lịch sử từng hóa đơn mà không có dữ liệu xác nhận.</w:t>
+      </w:r>
+    </w:p>
+    <w:p>
+      <w:pPr>
+        <w:pStyle w:val="Heading2"/>
+      </w:pPr>
+      <w:r>
+        <w:t>Sao lưu và phục hồi PostgreSQL</w:t>
+      </w:r>
+    </w:p>
+    <w:p>
+      <w:pPr>
+        <w:jc w:val="both"/>
+      </w:pPr>
+      <w:r>
+        <w:t>Chạy trên terminal, không mở chức năng khôi phục qua web. Cần pg_dump/pg_restore của phiên bản PostgreSQL phù hợp và tài khoản có quyền đọc nguồn; thử phục hồi cần quyền CREATEDB.</w:t>
+      </w:r>
+    </w:p>
+    <w:p>
+      <w:pPr>
+        <w:jc w:val="both"/>
+      </w:pPr>
+      <w:r>
+        <w:t>Nếu lệnh không tìm thấy công cụ, thêm vào .env đúng phiên bản đã cài, ví dụ:</w:t>
+      </w:r>
+    </w:p>
+    <w:p>
+      <w:pPr>
+        <w:spacing w:line="252" w:lineRule="auto"/>
+        <w:ind w:left="170"/>
+      </w:pPr>
+      <w:r>
+        <w:rPr>
+          <w:rFonts w:ascii="Consolas" w:hAnsi="Consolas"/>
+          <w:sz w:val="18"/>
+        </w:rPr>
+        <w:t>POSTGRES_BIN=C:/Program Files/PostgreSQL/17/bin</w:t>
+      </w:r>
+    </w:p>
+    <w:p>
+      <w:pPr>
+        <w:jc w:val="both"/>
+      </w:pPr>
+      <w:r>
+        <w:t>Sao lưu tạo file .dump và .dump.json cùng thư mục. Metadata ghi SHA256 và số dòng từng bảng; hai phần lấy cùng snapshot PostgreSQL để không lệch khi có giao dịch mới.</w:t>
+      </w:r>
+    </w:p>
+    <w:p>
+      <w:pPr>
+        <w:spacing w:line="252" w:lineRule="auto"/>
+        <w:ind w:left="170"/>
+      </w:pPr>
+      <w:r>
+        <w:rPr>
+          <w:rFonts w:ascii="Consolas" w:hAnsi="Consolas"/>
+          <w:sz w:val="18"/>
+        </w:rPr>
+        <w:t>.\.venv\Scripts\python.exe manage.py backup_database</w:t>
+      </w:r>
+    </w:p>
+    <w:p>
+      <w:pPr>
+        <w:jc w:val="both"/>
+      </w:pPr>
+      <w:r>
+        <w:t>Hoặc chọn tên mới cho lần sao lưu:</w:t>
+      </w:r>
+    </w:p>
+    <w:p>
+      <w:pPr>
+        <w:spacing w:line="252" w:lineRule="auto"/>
+        <w:ind w:left="170"/>
+      </w:pPr>
+      <w:r>
+        <w:rPr>
+          <w:rFonts w:ascii="Consolas" w:hAnsi="Consolas"/>
+          <w:sz w:val="18"/>
+        </w:rPr>
+        <w:t>.\.venv\Scripts\python.exe manage.py backup_database --output .local/backups/truoc-cap-nhat.dump</w:t>
+      </w:r>
+    </w:p>
+    <w:p>
+      <w:pPr>
+        <w:jc w:val="both"/>
+      </w:pPr>
+      <w:r>
+        <w:t>Giữ cả hai file, sao chép tới nơi lưu trữ riêng. Bản sao lưu chứa dữ liệu ứng dụng và hash mật khẩu nên không đưa lên GitHub. File đích đã tồn tại không bị ghi đè.</w:t>
+      </w:r>
+    </w:p>
+    <w:p>
+      <w:pPr>
+        <w:jc w:val="both"/>
+      </w:pPr>
+      <w:r>
+        <w:t>Thử phục hồi vào database mới, chưa tồn tại:</w:t>
+      </w:r>
+    </w:p>
+    <w:p>
+      <w:pPr>
+        <w:spacing w:line="252" w:lineRule="auto"/>
+        <w:ind w:left="170"/>
+      </w:pPr>
+      <w:r>
+        <w:rPr>
+          <w:rFonts w:ascii="Consolas" w:hAnsi="Consolas"/>
+          <w:sz w:val="18"/>
+        </w:rPr>
+        <w:t>.\.venv\Scripts\python.exe manage.py restore_database --file .local/backups/truoc-cap-nhat.dump --target-db gentleman_phuchoi_thu --confirm gentleman_phuchoi_thu</w:t>
+      </w:r>
+    </w:p>
+    <w:p>
+      <w:pPr>
+        <w:jc w:val="both"/>
+      </w:pPr>
+      <w:r>
+        <w:t>Lệnh từ chối tên database đang dùng, database hệ thống, database đích đã tồn tại hoặc tên xác nhận không khớp. Trước khi phục hồi, đối chiếu SHA256; sau khi phục hồi, đối chiếu số dòng tất cả bảng. Không tự chuyển .env sang database mới. Bạn có thể kiểm tra bản phục hồi bằng pgAdmin; chỉ khi đã xác minh mới tự chọn database đó trong cấu hình. Nếu phục hồi lỗi, database gốc giữ nguyên, database thử được giữ để kiểm tra.</w:t>
+      </w:r>
+    </w:p>
+    <w:p>
+      <w:pPr>
+        <w:jc w:val="both"/>
+      </w:pPr>
+      <w:r>
+        <w:t>Có thể dùng Windows Task Scheduler để chạy backup_database theo ngày bằng đường dẫn tuyệt đối của .venv/Scripts/python.exe và manage.py; đặt Start in là thư mục dự án. Lịch tự chạy trên máy người dùng chưa được cài trong phiên làm việc này.</w:t>
+      </w:r>
+    </w:p>
+    <w:p>
+      <w:pPr>
+        <w:pStyle w:val="Heading2"/>
+      </w:pPr>
+      <w:r>
+        <w:t>Bằng chứng kiểm tra và tài liệu</w:t>
+      </w:r>
+    </w:p>
+    <w:p>
+      <w:pPr>
+        <w:pStyle w:val="ListBullet"/>
+      </w:pPr>
+      <w:r>
+        <w:t>Kết quả kiểm tra bản hoàn thiện: 114 tests, 342 lượt trang/kích thước, kiểm tra trình duyệt và phục hồi thử.</w:t>
+      </w:r>
+    </w:p>
+    <w:p>
+      <w:pPr>
+        <w:pStyle w:val="ListBullet"/>
+      </w:pPr>
+      <w:r>
+        <w:t>Màn hình hiệu quả và lịch sử điểm chụp với dữ liệu demo/fixture kiểm thử.</w:t>
+      </w:r>
+    </w:p>
+    <w:p>
+      <w:pPr>
+        <w:pStyle w:val="ListBullet"/>
+      </w:pPr>
+      <w:r>
+        <w:t>Báo cáo Word cập nhật, phân tích, thiết kế, từ điển dữ liệu.</w:t>
+      </w:r>
+    </w:p>
+    <w:p>
+      <w:pPr>
+        <w:jc w:val="both"/>
+      </w:pPr>
+      <w:r>
+        <w:t>Kiểm tra tùy chọn bằng scripts/operations_smoke.py sau khi cài Playwright theo README; chỉ chạy trên local DEBUG, script tạo và dọn đúng dữ liệu thử của nó.</w:t>
       </w:r>
     </w:p>
     <w:sectPr>

</xml_diff>

<commit_message>
chore: integrate pinned Agent Skills and repeatable quality gates
</commit_message>
<xml_diff>
--- a/docs/BAO_CAO_PHAN_TICH_THIET_KE.docx
+++ b/docs/BAO_CAO_PHAN_TICH_THIET_KE.docx
@@ -5930,6 +5930,30 @@
       </w:r>
     </w:p>
     <w:p>
+      <w:pPr>
+        <w:pStyle w:val="Heading2"/>
+      </w:pPr>
+      <w:r>
+        <w:t>11. Rà soát bằng Agent Skills</w:t>
+      </w:r>
+    </w:p>
+    <w:p>
+      <w:pPr>
+        <w:jc w:val="both"/>
+      </w:pPr>
+      <w:r>
+        <w:t>Bổ sung bảng kỹ thuật AuthRateBucket (makhoa varchar(64) PK HMAC, thoigianhethan timestamptz có index, solan integer không âm), nâng tổng số model ứng dụng lên 26. Các khóa chính nghiệp vụ vẫn là bigint; bộ đếm xác thực dùng khóa băm. Refund thêm diemhoandadoitru integer, PointEntry thêm loại debt_recovery để lưu đối trừ có kiểm toán. Migration 0008–0010 và chính sách email/đặt lại mật khẩu được trình bày ở tài liệu 14.</w:t>
+      </w:r>
+    </w:p>
+    <w:p>
+      <w:pPr>
+        <w:jc w:val="both"/>
+      </w:pPr>
+      <w:r>
+        <w:t>Các bản ghi điểm và hóa đơn được giữ lại. Quyền và phân công được đọc lại sau khóa chi nhánh; reset mật khẩu chỉ ghi trường password sau khóa user. Tổng hợp chi nhánh tách nhóm theo từng bảng để tránh nhân doanh thu do join; lịch sử xử lý đọc 20 dòng/trang.</w:t>
+      </w:r>
+    </w:p>
+    <w:p>
       <w:r>
         <w:br w:type="page"/>
       </w:r>
@@ -6563,6 +6587,22 @@
       </w:r>
     </w:p>
     <w:p>
+      <w:pPr>
+        <w:pStyle w:val="Heading2"/>
+      </w:pPr>
+      <w:r>
+        <w:t>Cập nhật Agent Skills và hardening</w:t>
+      </w:r>
+    </w:p>
+    <w:p>
+      <w:pPr>
+        <w:jc w:val="both"/>
+      </w:pPr>
+      <w:r>
+        <w:t>Chạy sao lưu trước, cập nhật mã, cài requirements, migrate đến 0010 và collectstatic. Bộ đếm giới hạn xác thực dùng PostgreSQL, tự dọn có giới hạn khi có yêu cầu mới; có thể lên lịch manage.py prune_auth_limits mỗi ngày. Không thay .env hoặc tạo lại database. Xem tài liệu 14 để dùng skill, kiểm tra lint/audit/trình duyệt và tìm lỗi bằng X-Request-ID.</w:t>
+      </w:r>
+    </w:p>
+    <w:p>
       <w:r>
         <w:br w:type="page"/>
       </w:r>
@@ -6870,7 +6910,7 @@
                 <w:b w:val="0"/>
                 <w:sz w:val="20"/>
               </w:rPr>
-              <w:t>160 test đã thực thi, 0 failed, 0 errors, 0 skipped</w:t>
+              <w:t>179 test đã thực thi, 0 failed, 0 errors, 0 skipped</w:t>
             </w:r>
           </w:p>
         </w:tc>
@@ -8812,6 +8852,22 @@
       </w:r>
     </w:p>
     <w:p>
+      <w:pPr>
+        <w:pStyle w:val="Heading2"/>
+      </w:pPr>
+      <w:r>
+        <w:t>Rà soát Agent Skills</w:t>
+      </w:r>
+    </w:p>
+    <w:p>
+      <w:pPr>
+        <w:jc w:val="both"/>
+      </w:pPr>
+      <w:r>
+        <w:t>Bộ kiểm tra mới có 179 test PostgreSQL đạt, gồm phân quyền sau khóa, tài khoản/khôi phục mật khẩu, hoàn điểm theo cả hai thứ tự, nâng cấp số dư cũ, bộ đếm xác thực đồng thời và ngân sách truy vấn. 342 kiểm tra route/viewport và 48 màn hình vận hành đạt. Quét axe gồm 22 cặp trang/kích thước ở desktop/mobile, 0 vi phạm trong các quy tắc đã chạy. Định dạng 61 file Python có AST giống trước/sau; lint/build đạt. Chi tiết giới hạn và số đo CDP xem tài liệu 14, bằng chứng tại validation/14-AGENT-SKILLS.txt.</w:t>
+      </w:r>
+    </w:p>
+    <w:p>
       <w:r>
         <w:br w:type="page"/>
       </w:r>
@@ -8829,7 +8885,7 @@
         <w:jc w:val="both"/>
       </w:pPr>
       <w:r>
-        <w:t>Các cột của 25 bảng nghiệp vụ dùng tiếng Việt viết liền không dấu, chữ thường, không có dấu gạch dưới. Tên bảng giữ nguyên. Các kiểu dữ liệu vẫn bằng tiếng Anh. Migration đổi tên cột giữ nguyên kiểu dữ liệu cũ; các trường và bảng bổ sung có kiểu/ràng buộc theo thiết kế hiện tại.</w:t>
+        <w:t>Các cột của 26 bảng ứng dụng (25 nghiệp vụ và bộ đếm xác thực) dùng tiếng Việt viết liền không dấu, chữ thường, không có dấu gạch dưới. Tên bảng giữ nguyên. Các kiểu dữ liệu vẫn bằng tiếng Anh. Migration đổi tên cột giữ nguyên kiểu dữ liệu cũ; các trường và bảng bổ sung có kiểu/ràng buộc theo thiết kế hiện tại.</w:t>
       </w:r>
     </w:p>
     <w:p>
@@ -8845,7 +8901,7 @@
         <w:jc w:val="both"/>
       </w:pPr>
       <w:r>
-        <w:t>Đã có database: chạy python manage.py migrate --noinput để áp dụng migration 0002_vietnamese_column_names và các migration 0003–0007 bổ sung vận hành, kho, đối soát và lịch sử. Migration đổi tên cột không xóa và tạo lại dữ liệu. Tệp 0001_initial.py được giữ nguyên để có thể nâng cấp và hoàn tác đúng lịch sử.</w:t>
+        <w:t>Đã có database: chạy python manage.py migrate --noinput để áp dụng migration 0002_vietnamese_column_names và các migration 0003–0010 bổ sung vận hành, kho, đối soát, lịch sử, hoàn điểm và giới hạn xác thực. Migration đổi tên cột không xóa và tạo lại dữ liệu. Tệp 0001_initial.py được giữ nguyên để có thể nâng cấp và hoàn tác đúng lịch sử.</w:t>
       </w:r>
     </w:p>
     <w:p>
@@ -23676,6 +23732,76 @@
                 <w:b w:val="0"/>
                 <w:sz w:val="20"/>
               </w:rPr>
+              <w:t>points_debt_repaid</w:t>
+            </w:r>
+          </w:p>
+        </w:tc>
+        <w:tc>
+          <w:tcPr>
+            <w:tcW w:type="dxa" w:w="2296"/>
+          </w:tcPr>
+          <w:p>
+            <w:pPr>
+              <w:spacing w:line="252" w:lineRule="auto" w:after="80"/>
+            </w:pPr>
+            <w:r>
+              <w:rPr>
+                <w:b w:val="0"/>
+                <w:sz w:val="20"/>
+              </w:rPr>
+              <w:t>diemhoandadoitru</w:t>
+            </w:r>
+          </w:p>
+        </w:tc>
+        <w:tc>
+          <w:tcPr>
+            <w:tcW w:type="dxa" w:w="2296"/>
+          </w:tcPr>
+          <w:p>
+            <w:pPr>
+              <w:spacing w:line="252" w:lineRule="auto" w:after="80"/>
+            </w:pPr>
+            <w:r>
+              <w:rPr>
+                <w:b w:val="0"/>
+                <w:sz w:val="20"/>
+              </w:rPr>
+              <w:t>integer</w:t>
+            </w:r>
+          </w:p>
+        </w:tc>
+        <w:tc>
+          <w:tcPr>
+            <w:tcW w:type="dxa" w:w="2296"/>
+          </w:tcPr>
+          <w:p>
+            <w:pPr>
+              <w:spacing w:line="252" w:lineRule="auto" w:after="80"/>
+            </w:pPr>
+            <w:r>
+              <w:rPr>
+                <w:b w:val="0"/>
+                <w:sz w:val="20"/>
+              </w:rPr>
+              <w:t>NOT NULL</w:t>
+            </w:r>
+          </w:p>
+        </w:tc>
+      </w:tr>
+      <w:tr>
+        <w:tc>
+          <w:tcPr>
+            <w:tcW w:type="dxa" w:w="2296"/>
+          </w:tcPr>
+          <w:p>
+            <w:pPr>
+              <w:spacing w:line="252" w:lineRule="auto" w:after="80"/>
+            </w:pPr>
+            <w:r>
+              <w:rPr>
+                <w:b w:val="0"/>
+                <w:sz w:val="20"/>
+              </w:rPr>
               <w:t>reason</w:t>
             </w:r>
           </w:p>
@@ -23879,7 +24005,309 @@
         <w:pStyle w:val="Heading2"/>
       </w:pPr>
       <w:r>
-        <w:t>25. Bảng salon_dailyclosing</w:t>
+        <w:t>25. Bảng salon_authratebucket</w:t>
+      </w:r>
+    </w:p>
+    <w:tbl>
+      <w:tblPr>
+        <w:tblStyle w:val="TableGrid"/>
+        <w:tblW w:type="auto" w:w="0"/>
+        <w:tblLook w:firstColumn="1" w:firstRow="1" w:lastColumn="0" w:lastRow="0" w:noHBand="0" w:noVBand="1" w:val="04A0"/>
+      </w:tblPr>
+      <w:tblGrid>
+        <w:gridCol w:w="2296"/>
+        <w:gridCol w:w="2296"/>
+        <w:gridCol w:w="2296"/>
+        <w:gridCol w:w="2296"/>
+      </w:tblGrid>
+      <w:tr>
+        <w:tc>
+          <w:tcPr>
+            <w:tcW w:type="dxa" w:w="2296"/>
+          </w:tcPr>
+          <w:p>
+            <w:pPr>
+              <w:spacing w:line="252" w:lineRule="auto" w:after="80"/>
+            </w:pPr>
+            <w:r>
+              <w:rPr>
+                <w:b/>
+                <w:sz w:val="20"/>
+              </w:rPr>
+              <w:t>Thuộc tính Python</w:t>
+            </w:r>
+          </w:p>
+        </w:tc>
+        <w:tc>
+          <w:tcPr>
+            <w:tcW w:type="dxa" w:w="2296"/>
+          </w:tcPr>
+          <w:p>
+            <w:pPr>
+              <w:spacing w:line="252" w:lineRule="auto" w:after="80"/>
+            </w:pPr>
+            <w:r>
+              <w:rPr>
+                <w:b/>
+                <w:sz w:val="20"/>
+              </w:rPr>
+              <w:t>Tên cột tiếng Việt</w:t>
+            </w:r>
+          </w:p>
+        </w:tc>
+        <w:tc>
+          <w:tcPr>
+            <w:tcW w:type="dxa" w:w="2296"/>
+          </w:tcPr>
+          <w:p>
+            <w:pPr>
+              <w:spacing w:line="252" w:lineRule="auto" w:after="80"/>
+            </w:pPr>
+            <w:r>
+              <w:rPr>
+                <w:b/>
+                <w:sz w:val="20"/>
+              </w:rPr>
+              <w:t>Kiểu dữ liệu</w:t>
+            </w:r>
+          </w:p>
+        </w:tc>
+        <w:tc>
+          <w:tcPr>
+            <w:tcW w:type="dxa" w:w="2296"/>
+          </w:tcPr>
+          <w:p>
+            <w:pPr>
+              <w:spacing w:line="252" w:lineRule="auto" w:after="80"/>
+            </w:pPr>
+            <w:r>
+              <w:rPr>
+                <w:b/>
+                <w:sz w:val="20"/>
+              </w:rPr>
+              <w:t>Ràng buộc chính</w:t>
+            </w:r>
+          </w:p>
+        </w:tc>
+      </w:tr>
+      <w:tr>
+        <w:tc>
+          <w:tcPr>
+            <w:tcW w:type="dxa" w:w="2296"/>
+          </w:tcPr>
+          <w:p>
+            <w:pPr>
+              <w:spacing w:line="252" w:lineRule="auto" w:after="80"/>
+            </w:pPr>
+            <w:r>
+              <w:rPr>
+                <w:b w:val="0"/>
+                <w:sz w:val="20"/>
+              </w:rPr>
+              <w:t>key</w:t>
+            </w:r>
+          </w:p>
+        </w:tc>
+        <w:tc>
+          <w:tcPr>
+            <w:tcW w:type="dxa" w:w="2296"/>
+          </w:tcPr>
+          <w:p>
+            <w:pPr>
+              <w:spacing w:line="252" w:lineRule="auto" w:after="80"/>
+            </w:pPr>
+            <w:r>
+              <w:rPr>
+                <w:b w:val="0"/>
+                <w:sz w:val="20"/>
+              </w:rPr>
+              <w:t>makhoa</w:t>
+            </w:r>
+          </w:p>
+        </w:tc>
+        <w:tc>
+          <w:tcPr>
+            <w:tcW w:type="dxa" w:w="2296"/>
+          </w:tcPr>
+          <w:p>
+            <w:pPr>
+              <w:spacing w:line="252" w:lineRule="auto" w:after="80"/>
+            </w:pPr>
+            <w:r>
+              <w:rPr>
+                <w:b w:val="0"/>
+                <w:sz w:val="20"/>
+              </w:rPr>
+              <w:t>varchar(64)</w:t>
+            </w:r>
+          </w:p>
+        </w:tc>
+        <w:tc>
+          <w:tcPr>
+            <w:tcW w:type="dxa" w:w="2296"/>
+          </w:tcPr>
+          <w:p>
+            <w:pPr>
+              <w:spacing w:line="252" w:lineRule="auto" w:after="80"/>
+            </w:pPr>
+            <w:r>
+              <w:rPr>
+                <w:b w:val="0"/>
+                <w:sz w:val="20"/>
+              </w:rPr>
+              <w:t>PK; NOT NULL</w:t>
+            </w:r>
+          </w:p>
+        </w:tc>
+      </w:tr>
+      <w:tr>
+        <w:tc>
+          <w:tcPr>
+            <w:tcW w:type="dxa" w:w="2296"/>
+          </w:tcPr>
+          <w:p>
+            <w:pPr>
+              <w:spacing w:line="252" w:lineRule="auto" w:after="80"/>
+            </w:pPr>
+            <w:r>
+              <w:rPr>
+                <w:b w:val="0"/>
+                <w:sz w:val="20"/>
+              </w:rPr>
+              <w:t>expires_at</w:t>
+            </w:r>
+          </w:p>
+        </w:tc>
+        <w:tc>
+          <w:tcPr>
+            <w:tcW w:type="dxa" w:w="2296"/>
+          </w:tcPr>
+          <w:p>
+            <w:pPr>
+              <w:spacing w:line="252" w:lineRule="auto" w:after="80"/>
+            </w:pPr>
+            <w:r>
+              <w:rPr>
+                <w:b w:val="0"/>
+                <w:sz w:val="20"/>
+              </w:rPr>
+              <w:t>thoigianhethan</w:t>
+            </w:r>
+          </w:p>
+        </w:tc>
+        <w:tc>
+          <w:tcPr>
+            <w:tcW w:type="dxa" w:w="2296"/>
+          </w:tcPr>
+          <w:p>
+            <w:pPr>
+              <w:spacing w:line="252" w:lineRule="auto" w:after="80"/>
+            </w:pPr>
+            <w:r>
+              <w:rPr>
+                <w:b w:val="0"/>
+                <w:sz w:val="20"/>
+              </w:rPr>
+              <w:t>timestamptz</w:t>
+            </w:r>
+          </w:p>
+        </w:tc>
+        <w:tc>
+          <w:tcPr>
+            <w:tcW w:type="dxa" w:w="2296"/>
+          </w:tcPr>
+          <w:p>
+            <w:pPr>
+              <w:spacing w:line="252" w:lineRule="auto" w:after="80"/>
+            </w:pPr>
+            <w:r>
+              <w:rPr>
+                <w:b w:val="0"/>
+                <w:sz w:val="20"/>
+              </w:rPr>
+              <w:t>NOT NULL</w:t>
+            </w:r>
+          </w:p>
+        </w:tc>
+      </w:tr>
+      <w:tr>
+        <w:tc>
+          <w:tcPr>
+            <w:tcW w:type="dxa" w:w="2296"/>
+          </w:tcPr>
+          <w:p>
+            <w:pPr>
+              <w:spacing w:line="252" w:lineRule="auto" w:after="80"/>
+            </w:pPr>
+            <w:r>
+              <w:rPr>
+                <w:b w:val="0"/>
+                <w:sz w:val="20"/>
+              </w:rPr>
+              <w:t>count</w:t>
+            </w:r>
+          </w:p>
+        </w:tc>
+        <w:tc>
+          <w:tcPr>
+            <w:tcW w:type="dxa" w:w="2296"/>
+          </w:tcPr>
+          <w:p>
+            <w:pPr>
+              <w:spacing w:line="252" w:lineRule="auto" w:after="80"/>
+            </w:pPr>
+            <w:r>
+              <w:rPr>
+                <w:b w:val="0"/>
+                <w:sz w:val="20"/>
+              </w:rPr>
+              <w:t>solan</w:t>
+            </w:r>
+          </w:p>
+        </w:tc>
+        <w:tc>
+          <w:tcPr>
+            <w:tcW w:type="dxa" w:w="2296"/>
+          </w:tcPr>
+          <w:p>
+            <w:pPr>
+              <w:spacing w:line="252" w:lineRule="auto" w:after="80"/>
+            </w:pPr>
+            <w:r>
+              <w:rPr>
+                <w:b w:val="0"/>
+                <w:sz w:val="20"/>
+              </w:rPr>
+              <w:t>integer</w:t>
+            </w:r>
+          </w:p>
+        </w:tc>
+        <w:tc>
+          <w:tcPr>
+            <w:tcW w:type="dxa" w:w="2296"/>
+          </w:tcPr>
+          <w:p>
+            <w:pPr>
+              <w:spacing w:line="252" w:lineRule="auto" w:after="80"/>
+            </w:pPr>
+            <w:r>
+              <w:rPr>
+                <w:b w:val="0"/>
+                <w:sz w:val="20"/>
+              </w:rPr>
+              <w:t>NOT NULL</w:t>
+            </w:r>
+          </w:p>
+        </w:tc>
+      </w:tr>
+    </w:tbl>
+    <w:p/>
+    <w:p>
+      <w:pPr>
+        <w:pStyle w:val="Heading2"/>
+      </w:pPr>
+      <w:r>
+        <w:t>26. Bảng salon_dailyclosing</w:t>
       </w:r>
     </w:p>
     <w:tbl>
@@ -29623,6 +30051,1130 @@
           <w:sz w:val="20"/>
         </w:rPr>
         <w:t>Hoa hồng theo hóa đơn kiểm thử</w:t>
+      </w:r>
+    </w:p>
+    <w:p>
+      <w:r>
+        <w:br w:type="page"/>
+      </w:r>
+    </w:p>
+    <w:p>
+      <w:pPr>
+        <w:pStyle w:val="Heading1"/>
+      </w:pPr>
+      <w:r>
+        <w:t>Áp dụng Agent Skills vào GENTLEMAN</w:t>
+      </w:r>
+    </w:p>
+    <w:p>
+      <w:pPr>
+        <w:pStyle w:val="Heading2"/>
+      </w:pPr>
+      <w:r>
+        <w:t>1. Nguồn và cách dùng trong VS Code</w:t>
+      </w:r>
+    </w:p>
+    <w:p>
+      <w:pPr>
+        <w:jc w:val="both"/>
+      </w:pPr>
+      <w:r>
+        <w:t>Đã tích hợp đầy đủ 25 skill của addyosmani/agent-skills, cố định ở commit aeac41d4d005999432bb7312f7ff06383a91d59d. Bản sao có giấy phép MIT, mã kiểm tra SHA256 và các tài liệu tham chiếu đi kèm. Đây là hướng dẫn cho công cụ lập trình; website chạy bằng Django như trước, không cần cài một ứng dụng AI để khách đặt lịch.</w:t>
+      </w:r>
+    </w:p>
+    <w:p>
+      <w:pPr>
+        <w:pStyle w:val="ListBullet"/>
+      </w:pPr>
+      <w:r>
+        <w:t>AGENTS.md: bối cảnh riêng của dự án, lệnh chạy, phân quyền chi nhánh và quy tắc giữ dữ liệu.</w:t>
+      </w:r>
+    </w:p>
+    <w:p>
+      <w:pPr>
+        <w:pStyle w:val="ListBullet"/>
+      </w:pPr>
+      <w:r>
+        <w:t>.github/copilot-instructions.md: hướng dẫn cho Copilot trong VS Code.</w:t>
+      </w:r>
+    </w:p>
+    <w:p>
+      <w:pPr>
+        <w:pStyle w:val="ListBullet"/>
+      </w:pPr>
+      <w:r>
+        <w:t>.agents/skills/&lt;tên&gt;/SKILL.md: quy trình chi tiết, đọc khi công việc cần tới.</w:t>
+      </w:r>
+    </w:p>
+    <w:p>
+      <w:pPr>
+        <w:pStyle w:val="ListBullet"/>
+      </w:pPr>
+      <w:r>
+        <w:t>.agents/references/: checklist hỗ trợ; .agents/agent-skills-source.json ghi nguồn và mã kiểm tra.</w:t>
+      </w:r>
+    </w:p>
+    <w:p>
+      <w:pPr>
+        <w:pStyle w:val="ListBullet"/>
+      </w:pPr>
+      <w:r>
+        <w:t>docs/quality/spec.md, plan.md: phạm vi và sổ theo dõi lượt rà soát này.</w:t>
+      </w:r>
+    </w:p>
+    <w:p>
+      <w:pPr>
+        <w:jc w:val="both"/>
+      </w:pPr>
+      <w:r>
+        <w:t>Ví dụ yêu cầu trong VS Code: “Đọc AGENTS.md, dùng test-driven-development và security-and-hardening để sửa chức năng đổi lịch; tái hiện lỗi trước khi sửa, kiểm tra đúng phạm vi chi nhánh”. Khả năng tự nhận tên $skill tùy tiện ích; luôn có thể yêu cầu đọc trực tiếp đường dẫn SKILL.md. Không cần nạp toàn bộ 25 tài liệu vào mỗi lần làm việc.</w:t>
+      </w:r>
+    </w:p>
+    <w:p>
+      <w:pPr>
+        <w:pStyle w:val="Heading2"/>
+      </w:pPr>
+      <w:r>
+        <w:t>2. Những thay đổi thực tế</w:t>
+      </w:r>
+    </w:p>
+    <w:p>
+      <w:pPr>
+        <w:pStyle w:val="Heading3"/>
+      </w:pPr>
+      <w:r>
+        <w:t>Tài khoản và phân quyền</w:t>
+      </w:r>
+    </w:p>
+    <w:p>
+      <w:pPr>
+        <w:jc w:val="both"/>
+      </w:pPr>
+      <w:r>
+        <w:t>Email nhận liên kết khôi phục là một phần của danh tính đăng nhập. Lễ tân/quản lý chi nhánh không được thay email của khách đã có mật khẩu, đã có email hoặc có hồ sơ tại chi nhánh khác. Chi nhánh chỉ có thể điền email lần đầu cho khách tại quầy chưa kích hoạt, chưa có email và chỉ có lịch ở chi nhánh đó; vẫn phải xác minh và đánh dấu khách đồng ý. Chủ tài khoản cập nhật liên hệ ở hồ sơ cá nhân; quản trị chuỗi có quyền quản lý tài khoản toàn chuỗi.</w:t>
+      </w:r>
+    </w:p>
+    <w:p>
+      <w:pPr>
+        <w:jc w:val="both"/>
+      </w:pPr>
+      <w:r>
+        <w:t>Đặt lại mật khẩu khóa và đọc lại tài khoản, kiểm tra lại token và trạng thái hoạt động, sau đó chỉ ghi cột mật khẩu. Thao tác này không ghi đè vai trò, điểm hay thông tin vừa được cập nhật bởi giao dịch khác. Thao tác quản trị chuỗi, tiếp nhận tại quầy và stylist đều kiểm tra lại quyền/phân công sau khi chờ khóa.</w:t>
+      </w:r>
+    </w:p>
+    <w:p>
+      <w:pPr>
+        <w:jc w:val="both"/>
+      </w:pPr>
+      <w:r>
+        <w:t>Đăng nhập giới hạn 10 lần/15 phút theo IP và tên đăng nhập đã chuẩn hóa khoảng trắng; các biểu mẫu tạo/khôi phục/kích hoạt tài khoản có giới hạn riêng và giới hạn chung 100 yêu cầu xác thực/IP/15 phút. Bộ đếm dùng PostgreSQL nên được chia sẻ giữa các tiến trình, không tin X-Forwarded-For tự gửi từ trình duyệt. Khi chạy qua proxy, cấu hình địa chỉ khách ở tầng máy chủ; không bật tin mọi header chuyển tiếp. Yêu cầu email khôi phục cùng địa chỉ có thời gian chờ 60 giây và phản hồi chung cho địa chỉ có/không tồn tại.</w:t>
+      </w:r>
+    </w:p>
+    <w:p>
+      <w:pPr>
+        <w:pStyle w:val="Heading3"/>
+      </w:pPr>
+      <w:r>
+        <w:t>Hoàn tiền và điểm</w:t>
+      </w:r>
+    </w:p>
+    <w:p>
+      <w:pPr>
+        <w:jc w:val="both"/>
+      </w:pPr>
+      <w:r>
+        <w:t>Ví dụ hóa đơn A tích 10 điểm, hóa đơn B dùng 10 điểm: hoàn A rồi B hay B rồi A đều về cùng số dư/điểm cần thu hồi. Điểm được trả lại sẽ bù phần cần thu hồi trước khi trở thành điểm có thể dùng. Phiếu hoàn ghi riêng điểm cần thu hồi phát sinh và điểm đã đối trừ; sổ điểm giữ biến động thực tế.</w:t>
+      </w:r>
+    </w:p>
+    <w:p>
+      <w:pPr>
+        <w:jc w:val="both"/>
+      </w:pPr>
+      <w:r>
+        <w:t>Migration 0008 bổ sung trường/ràng buộc; 0009 đối trừ hồ sơ cũ đang đồng thời có điểm khả dụng và điểm cần thu hồi, kèm một bút toán debt_recovery. Giá trị ròng được giữ nguyên, không viết lại hóa đơn hoặc bút toán cũ. Chạy lại không cộng/trừ lần hai khi số dư đã chuẩn hóa. 0010 tạo bộ đếm xác thực. Không hoàn tác dữ liệu tài chính bằng cách xóa lịch sử.</w:t>
+      </w:r>
+    </w:p>
+    <w:p>
+      <w:pPr>
+        <w:pStyle w:val="Heading3"/>
+      </w:pPr>
+      <w:r>
+        <w:t>Truy vấn, giao diện và quan sát lỗi</w:t>
+      </w:r>
+    </w:p>
+    <w:tbl>
+      <w:tblPr>
+        <w:tblStyle w:val="TableGrid"/>
+        <w:tblW w:type="auto" w:w="0"/>
+        <w:tblLook w:firstColumn="1" w:firstRow="1" w:lastColumn="0" w:lastRow="0" w:noHBand="0" w:noVBand="1" w:val="04A0"/>
+      </w:tblPr>
+      <w:tblGrid>
+        <w:gridCol w:w="3061"/>
+        <w:gridCol w:w="3061"/>
+        <w:gridCol w:w="3061"/>
+      </w:tblGrid>
+      <w:tr>
+        <w:tc>
+          <w:tcPr>
+            <w:tcW w:type="dxa" w:w="3061"/>
+          </w:tcPr>
+          <w:p>
+            <w:pPr>
+              <w:spacing w:line="252" w:lineRule="auto" w:after="80"/>
+            </w:pPr>
+            <w:r>
+              <w:rPr>
+                <w:b/>
+                <w:sz w:val="20"/>
+              </w:rPr>
+              <w:t>Trang / dữ liệu kiểm tra</w:t>
+            </w:r>
+          </w:p>
+        </w:tc>
+        <w:tc>
+          <w:tcPr>
+            <w:tcW w:type="dxa" w:w="3061"/>
+          </w:tcPr>
+          <w:p>
+            <w:pPr>
+              <w:spacing w:line="252" w:lineRule="auto" w:after="80"/>
+            </w:pPr>
+            <w:r>
+              <w:rPr>
+                <w:b/>
+                <w:sz w:val="20"/>
+              </w:rPr>
+              <w:t>Trước</w:t>
+            </w:r>
+          </w:p>
+        </w:tc>
+        <w:tc>
+          <w:tcPr>
+            <w:tcW w:type="dxa" w:w="3061"/>
+          </w:tcPr>
+          <w:p>
+            <w:pPr>
+              <w:spacing w:line="252" w:lineRule="auto" w:after="80"/>
+            </w:pPr>
+            <w:r>
+              <w:rPr>
+                <w:b/>
+                <w:sz w:val="20"/>
+              </w:rPr>
+              <w:t>Sau</w:t>
+            </w:r>
+          </w:p>
+        </w:tc>
+      </w:tr>
+      <w:tr>
+        <w:tc>
+          <w:tcPr>
+            <w:tcW w:type="dxa" w:w="3061"/>
+          </w:tcPr>
+          <w:p>
+            <w:pPr>
+              <w:spacing w:line="252" w:lineRule="auto" w:after="80"/>
+            </w:pPr>
+            <w:r>
+              <w:rPr>
+                <w:b w:val="0"/>
+                <w:sz w:val="20"/>
+              </w:rPr>
+              <w:t>Điều hành 12 chi nhánh</w:t>
+            </w:r>
+          </w:p>
+        </w:tc>
+        <w:tc>
+          <w:tcPr>
+            <w:tcW w:type="dxa" w:w="3061"/>
+          </w:tcPr>
+          <w:p>
+            <w:pPr>
+              <w:spacing w:line="252" w:lineRule="auto" w:after="80"/>
+            </w:pPr>
+            <w:r>
+              <w:rPr>
+                <w:b w:val="0"/>
+                <w:sz w:val="20"/>
+              </w:rPr>
+              <w:t>101 truy vấn</w:t>
+            </w:r>
+          </w:p>
+        </w:tc>
+        <w:tc>
+          <w:tcPr>
+            <w:tcW w:type="dxa" w:w="3061"/>
+          </w:tcPr>
+          <w:p>
+            <w:pPr>
+              <w:spacing w:line="252" w:lineRule="auto" w:after="80"/>
+            </w:pPr>
+            <w:r>
+              <w:rPr>
+                <w:b w:val="0"/>
+                <w:sz w:val="20"/>
+              </w:rPr>
+              <w:t>11 truy vấn</w:t>
+            </w:r>
+          </w:p>
+        </w:tc>
+      </w:tr>
+      <w:tr>
+        <w:tc>
+          <w:tcPr>
+            <w:tcW w:type="dxa" w:w="3061"/>
+          </w:tcPr>
+          <w:p>
+            <w:pPr>
+              <w:spacing w:line="252" w:lineRule="auto" w:after="80"/>
+            </w:pPr>
+            <w:r>
+              <w:rPr>
+                <w:b w:val="0"/>
+                <w:sz w:val="20"/>
+              </w:rPr>
+              <w:t>Danh sách 12 stylist</w:t>
+            </w:r>
+          </w:p>
+        </w:tc>
+        <w:tc>
+          <w:tcPr>
+            <w:tcW w:type="dxa" w:w="3061"/>
+          </w:tcPr>
+          <w:p>
+            <w:pPr>
+              <w:spacing w:line="252" w:lineRule="auto" w:after="80"/>
+            </w:pPr>
+            <w:r>
+              <w:rPr>
+                <w:b w:val="0"/>
+                <w:sz w:val="20"/>
+              </w:rPr>
+              <w:t>16</w:t>
+            </w:r>
+          </w:p>
+        </w:tc>
+        <w:tc>
+          <w:tcPr>
+            <w:tcW w:type="dxa" w:w="3061"/>
+          </w:tcPr>
+          <w:p>
+            <w:pPr>
+              <w:spacing w:line="252" w:lineRule="auto" w:after="80"/>
+            </w:pPr>
+            <w:r>
+              <w:rPr>
+                <w:b w:val="0"/>
+                <w:sz w:val="20"/>
+              </w:rPr>
+              <w:t>4</w:t>
+            </w:r>
+          </w:p>
+        </w:tc>
+      </w:tr>
+      <w:tr>
+        <w:tc>
+          <w:tcPr>
+            <w:tcW w:type="dxa" w:w="3061"/>
+          </w:tcPr>
+          <w:p>
+            <w:pPr>
+              <w:spacing w:line="252" w:lineRule="auto" w:after="80"/>
+            </w:pPr>
+            <w:r>
+              <w:rPr>
+                <w:b w:val="0"/>
+                <w:sz w:val="20"/>
+              </w:rPr>
+              <w:t>Lịch làm việc 12 stylist</w:t>
+            </w:r>
+          </w:p>
+        </w:tc>
+        <w:tc>
+          <w:tcPr>
+            <w:tcW w:type="dxa" w:w="3061"/>
+          </w:tcPr>
+          <w:p>
+            <w:pPr>
+              <w:spacing w:line="252" w:lineRule="auto" w:after="80"/>
+            </w:pPr>
+            <w:r>
+              <w:rPr>
+                <w:b w:val="0"/>
+                <w:sz w:val="20"/>
+              </w:rPr>
+              <w:t>28</w:t>
+            </w:r>
+          </w:p>
+        </w:tc>
+        <w:tc>
+          <w:tcPr>
+            <w:tcW w:type="dxa" w:w="3061"/>
+          </w:tcPr>
+          <w:p>
+            <w:pPr>
+              <w:spacing w:line="252" w:lineRule="auto" w:after="80"/>
+            </w:pPr>
+            <w:r>
+              <w:rPr>
+                <w:b w:val="0"/>
+                <w:sz w:val="20"/>
+              </w:rPr>
+              <w:t>6</w:t>
+            </w:r>
+          </w:p>
+        </w:tc>
+      </w:tr>
+      <w:tr>
+        <w:tc>
+          <w:tcPr>
+            <w:tcW w:type="dxa" w:w="3061"/>
+          </w:tcPr>
+          <w:p>
+            <w:pPr>
+              <w:spacing w:line="252" w:lineRule="auto" w:after="80"/>
+            </w:pPr>
+            <w:r>
+              <w:rPr>
+                <w:b w:val="0"/>
+                <w:sz w:val="20"/>
+              </w:rPr>
+              <w:t>Chi tiết có 30 lần xử lý</w:t>
+            </w:r>
+          </w:p>
+        </w:tc>
+        <w:tc>
+          <w:tcPr>
+            <w:tcW w:type="dxa" w:w="3061"/>
+          </w:tcPr>
+          <w:p>
+            <w:pPr>
+              <w:spacing w:line="252" w:lineRule="auto" w:after="80"/>
+            </w:pPr>
+            <w:r>
+              <w:rPr>
+                <w:b w:val="0"/>
+                <w:sz w:val="20"/>
+              </w:rPr>
+              <w:t>37</w:t>
+            </w:r>
+          </w:p>
+        </w:tc>
+        <w:tc>
+          <w:tcPr>
+            <w:tcW w:type="dxa" w:w="3061"/>
+          </w:tcPr>
+          <w:p>
+            <w:pPr>
+              <w:spacing w:line="252" w:lineRule="auto" w:after="80"/>
+            </w:pPr>
+            <w:r>
+              <w:rPr>
+                <w:b w:val="0"/>
+                <w:sz w:val="20"/>
+              </w:rPr>
+              <w:t>7</w:t>
+            </w:r>
+          </w:p>
+        </w:tc>
+      </w:tr>
+    </w:tbl>
+    <w:p/>
+    <w:p>
+      <w:pPr>
+        <w:jc w:val="both"/>
+      </w:pPr>
+      <w:r>
+        <w:t>Các tổng hợp đọc riêng theo nhóm, tránh nhân số tiền khi ghép nhiều bảng. Lịch sử xử lý có phân trang 20 dòng, tải kèm người thao tác. Không thêm cache vào quyết định sức chứa, quyền hay số dư.</w:t>
+      </w:r>
+    </w:p>
+    <w:p>
+      <w:pPr>
+        <w:jc w:val="both"/>
+      </w:pPr>
+      <w:r>
+        <w:t>Màu chữ phụ, nút và nhãn được chỉnh theo kết quả đo tương phản. Bảng cuộn có thể nhận focus bằng bàn phím. Font trang trí vẫn giới hạn theo thành phần. Menu điện thoại có trạng thái ban đầu ổn định và phương án khi tắt JavaScript; trình chiếu ưu tiên ảnh đầu, nạp ảnh phụ sau khi trang tải xong, giữ nút dừng/chuyển tay và chế độ giảm chuyển động.</w:t>
+      </w:r>
+    </w:p>
+    <w:p>
+      <w:pPr>
+        <w:jc w:val="both"/>
+      </w:pPr>
+      <w:r>
+        <w:t>Response có CSP (script chỉ từ cùng nguồn), chống nhúng iframe, giới hạn quyền camera/micro và mã yêu cầu X-Request-ID. Trang động dùng private, no-store. Nhật ký JSON chứa mã yêu cầu, route mẫu, phương thức, trạng thái và thời gian; không ghi tham số URL, token reset, nội dung form, cookie hoặc thông tin liên hệ. Log lỗi framework chỉ ghi loại lỗi/trạng thái, không ghi thông điệp có thể chứa dữ liệu SQL. Chưa nối dịch vụ telemetry bên ngoài.</w:t>
+      </w:r>
+    </w:p>
+    <w:p>
+      <w:pPr>
+        <w:pStyle w:val="Heading2"/>
+      </w:pPr>
+      <w:r>
+        <w:t>3. Skill nào đã áp dụng</w:t>
+      </w:r>
+    </w:p>
+    <w:tbl>
+      <w:tblPr>
+        <w:tblStyle w:val="TableGrid"/>
+        <w:tblW w:type="auto" w:w="0"/>
+        <w:tblLook w:firstColumn="1" w:firstRow="1" w:lastColumn="0" w:lastRow="0" w:noHBand="0" w:noVBand="1" w:val="04A0"/>
+      </w:tblPr>
+      <w:tblGrid>
+        <w:gridCol w:w="4592"/>
+        <w:gridCol w:w="4592"/>
+      </w:tblGrid>
+      <w:tr>
+        <w:tc>
+          <w:tcPr>
+            <w:tcW w:type="dxa" w:w="4592"/>
+          </w:tcPr>
+          <w:p>
+            <w:pPr>
+              <w:spacing w:line="252" w:lineRule="auto" w:after="80"/>
+            </w:pPr>
+            <w:r>
+              <w:rPr>
+                <w:b/>
+                <w:sz w:val="20"/>
+              </w:rPr>
+              <w:t>Skill / nhóm</w:t>
+            </w:r>
+          </w:p>
+        </w:tc>
+        <w:tc>
+          <w:tcPr>
+            <w:tcW w:type="dxa" w:w="4592"/>
+          </w:tcPr>
+          <w:p>
+            <w:pPr>
+              <w:spacing w:line="252" w:lineRule="auto" w:after="80"/>
+            </w:pPr>
+            <w:r>
+              <w:rPr>
+                <w:b/>
+                <w:sz w:val="20"/>
+              </w:rPr>
+              <w:t>Cách áp dụng trong lượt này</w:t>
+            </w:r>
+          </w:p>
+        </w:tc>
+      </w:tr>
+      <w:tr>
+        <w:tc>
+          <w:tcPr>
+            <w:tcW w:type="dxa" w:w="4592"/>
+          </w:tcPr>
+          <w:p>
+            <w:pPr>
+              <w:spacing w:line="252" w:lineRule="auto" w:after="80"/>
+            </w:pPr>
+            <w:r>
+              <w:rPr>
+                <w:b w:val="0"/>
+                <w:sz w:val="20"/>
+              </w:rPr>
+              <w:t>using-agent-skills, context-engineering</w:t>
+            </w:r>
+          </w:p>
+        </w:tc>
+        <w:tc>
+          <w:tcPr>
+            <w:tcW w:type="dxa" w:w="4592"/>
+          </w:tcPr>
+          <w:p>
+            <w:pPr>
+              <w:spacing w:line="252" w:lineRule="auto" w:after="80"/>
+            </w:pPr>
+            <w:r>
+              <w:rPr>
+                <w:b w:val="0"/>
+                <w:sz w:val="20"/>
+              </w:rPr>
+              <w:t>Định tuyến theo việc, AGENTS riêng, nguồn cố định, không tải tất cả vào ngữ cảnh</w:t>
+            </w:r>
+          </w:p>
+        </w:tc>
+      </w:tr>
+      <w:tr>
+        <w:tc>
+          <w:tcPr>
+            <w:tcW w:type="dxa" w:w="4592"/>
+          </w:tcPr>
+          <w:p>
+            <w:pPr>
+              <w:spacing w:line="252" w:lineRule="auto" w:after="80"/>
+            </w:pPr>
+            <w:r>
+              <w:rPr>
+                <w:b w:val="0"/>
+                <w:sz w:val="20"/>
+              </w:rPr>
+              <w:t>spec-driven-development, constraint-driven-development, planning-and-task-breakdown</w:t>
+            </w:r>
+          </w:p>
+        </w:tc>
+        <w:tc>
+          <w:tcPr>
+            <w:tcW w:type="dxa" w:w="4592"/>
+          </w:tcPr>
+          <w:p>
+            <w:pPr>
+              <w:spacing w:line="252" w:lineRule="auto" w:after="80"/>
+            </w:pPr>
+            <w:r>
+              <w:rPr>
+                <w:b w:val="0"/>
+                <w:sz w:val="20"/>
+              </w:rPr>
+              <w:t>Spec/phạm vi/tiêu chí và kế hoạch; giữ Django/PostgreSQL, Windows, dữ liệu, font cục bộ</w:t>
+            </w:r>
+          </w:p>
+        </w:tc>
+      </w:tr>
+      <w:tr>
+        <w:tc>
+          <w:tcPr>
+            <w:tcW w:type="dxa" w:w="4592"/>
+          </w:tcPr>
+          <w:p>
+            <w:pPr>
+              <w:spacing w:line="252" w:lineRule="auto" w:after="80"/>
+            </w:pPr>
+            <w:r>
+              <w:rPr>
+                <w:b w:val="0"/>
+                <w:sz w:val="20"/>
+              </w:rPr>
+              <w:t>incremental-implementation, test-driven-development, debugging-and-error-recovery</w:t>
+            </w:r>
+          </w:p>
+        </w:tc>
+        <w:tc>
+          <w:tcPr>
+            <w:tcW w:type="dxa" w:w="4592"/>
+          </w:tcPr>
+          <w:p>
+            <w:pPr>
+              <w:spacing w:line="252" w:lineRule="auto" w:after="80"/>
+            </w:pPr>
+            <w:r>
+              <w:rPr>
+                <w:b w:val="0"/>
+                <w:sz w:val="20"/>
+              </w:rPr>
+              <w:t>Tái hiện lỗi RED, sửa nhỏ, chạy GREEN; kiểm tra lỗi nghiệp vụ và giao dịch đồng thời</w:t>
+            </w:r>
+          </w:p>
+        </w:tc>
+      </w:tr>
+      <w:tr>
+        <w:tc>
+          <w:tcPr>
+            <w:tcW w:type="dxa" w:w="4592"/>
+          </w:tcPr>
+          <w:p>
+            <w:pPr>
+              <w:spacing w:line="252" w:lineRule="auto" w:after="80"/>
+            </w:pPr>
+            <w:r>
+              <w:rPr>
+                <w:b w:val="0"/>
+                <w:sz w:val="20"/>
+              </w:rPr>
+              <w:t>source-driven-development</w:t>
+            </w:r>
+          </w:p>
+        </w:tc>
+        <w:tc>
+          <w:tcPr>
+            <w:tcW w:type="dxa" w:w="4592"/>
+          </w:tcPr>
+          <w:p>
+            <w:pPr>
+              <w:spacing w:line="252" w:lineRule="auto" w:after="80"/>
+            </w:pPr>
+            <w:r>
+              <w:rPr>
+                <w:b w:val="0"/>
+                <w:sz w:val="20"/>
+              </w:rPr>
+              <w:t>Đọc mã và API Django đang cài; lưu nguồn upstream/SHA256, không coi hướng dẫn ngoài là quyền thao tác hệ thống</w:t>
+            </w:r>
+          </w:p>
+        </w:tc>
+      </w:tr>
+      <w:tr>
+        <w:tc>
+          <w:tcPr>
+            <w:tcW w:type="dxa" w:w="4592"/>
+          </w:tcPr>
+          <w:p>
+            <w:pPr>
+              <w:spacing w:line="252" w:lineRule="auto" w:after="80"/>
+            </w:pPr>
+            <w:r>
+              <w:rPr>
+                <w:b w:val="0"/>
+                <w:sz w:val="20"/>
+              </w:rPr>
+              <w:t>doubt-driven-development, code-review-and-quality</w:t>
+            </w:r>
+          </w:p>
+        </w:tc>
+        <w:tc>
+          <w:tcPr>
+            <w:tcW w:type="dxa" w:w="4592"/>
+          </w:tcPr>
+          <w:p>
+            <w:pPr>
+              <w:spacing w:line="252" w:lineRule="auto" w:after="80"/>
+            </w:pPr>
+            <w:r>
+              <w:rPr>
+                <w:b w:val="0"/>
+                <w:sz w:val="20"/>
+              </w:rPr>
+              <w:t>Hai lượt rà soát độc lập theo bối cảnh tách biệt; đối chiếu bằng kiểm tra, thử bỏ điều kiện để chứng minh test bắt được lỗi</w:t>
+            </w:r>
+          </w:p>
+        </w:tc>
+      </w:tr>
+      <w:tr>
+        <w:tc>
+          <w:tcPr>
+            <w:tcW w:type="dxa" w:w="4592"/>
+          </w:tcPr>
+          <w:p>
+            <w:pPr>
+              <w:spacing w:line="252" w:lineRule="auto" w:after="80"/>
+            </w:pPr>
+            <w:r>
+              <w:rPr>
+                <w:b w:val="0"/>
+                <w:sz w:val="20"/>
+              </w:rPr>
+              <w:t>security-and-hardening, api-and-interface-design</w:t>
+            </w:r>
+          </w:p>
+        </w:tc>
+        <w:tc>
+          <w:tcPr>
+            <w:tcW w:type="dxa" w:w="4592"/>
+          </w:tcPr>
+          <w:p>
+            <w:pPr>
+              <w:spacing w:line="252" w:lineRule="auto" w:after="80"/>
+            </w:pPr>
+            <w:r>
+              <w:rPr>
+                <w:b w:val="0"/>
+                <w:sz w:val="20"/>
+              </w:rPr>
+              <w:t>Khôi phục tài khoản, phạm vi chi nhánh, POST/CSRF, giới hạn xác thực, header và hợp đồng dữ liệu hiện có</w:t>
+            </w:r>
+          </w:p>
+        </w:tc>
+      </w:tr>
+      <w:tr>
+        <w:tc>
+          <w:tcPr>
+            <w:tcW w:type="dxa" w:w="4592"/>
+          </w:tcPr>
+          <w:p>
+            <w:pPr>
+              <w:spacing w:line="252" w:lineRule="auto" w:after="80"/>
+            </w:pPr>
+            <w:r>
+              <w:rPr>
+                <w:b w:val="0"/>
+                <w:sz w:val="20"/>
+              </w:rPr>
+              <w:t>performance-optimization, code-simplification</w:t>
+            </w:r>
+          </w:p>
+        </w:tc>
+        <w:tc>
+          <w:tcPr>
+            <w:tcW w:type="dxa" w:w="4592"/>
+          </w:tcPr>
+          <w:p>
+            <w:pPr>
+              <w:spacing w:line="252" w:lineRule="auto" w:after="80"/>
+            </w:pPr>
+            <w:r>
+              <w:rPr>
+                <w:b w:val="0"/>
+                <w:sz w:val="20"/>
+              </w:rPr>
+              <w:t>Đo truy vấn trước/sau; gom đọc theo nhóm, bỏ truy vấn trong vòng lặp; không tách lớp hình thức</w:t>
+            </w:r>
+          </w:p>
+        </w:tc>
+      </w:tr>
+      <w:tr>
+        <w:tc>
+          <w:tcPr>
+            <w:tcW w:type="dxa" w:w="4592"/>
+          </w:tcPr>
+          <w:p>
+            <w:pPr>
+              <w:spacing w:line="252" w:lineRule="auto" w:after="80"/>
+            </w:pPr>
+            <w:r>
+              <w:rPr>
+                <w:b w:val="0"/>
+                <w:sz w:val="20"/>
+              </w:rPr>
+              <w:t>frontend-ui-engineering, browser-testing-with-devtools</w:t>
+            </w:r>
+          </w:p>
+        </w:tc>
+        <w:tc>
+          <w:tcPr>
+            <w:tcW w:type="dxa" w:w="4592"/>
+          </w:tcPr>
+          <w:p>
+            <w:pPr>
+              <w:spacing w:line="252" w:lineRule="auto" w:after="80"/>
+            </w:pPr>
+            <w:r>
+              <w:rPr>
+                <w:b w:val="0"/>
+                <w:sz w:val="20"/>
+              </w:rPr>
+              <w:t>Kiểm tra trình duyệt, bàn phím/tương phản/reduced motion và menu/ảnh; dùng Playwright + Chromium CDP vì không có Chrome DevTools MCP trong phiên</w:t>
+            </w:r>
+          </w:p>
+        </w:tc>
+      </w:tr>
+      <w:tr>
+        <w:tc>
+          <w:tcPr>
+            <w:tcW w:type="dxa" w:w="4592"/>
+          </w:tcPr>
+          <w:p>
+            <w:pPr>
+              <w:spacing w:line="252" w:lineRule="auto" w:after="80"/>
+            </w:pPr>
+            <w:r>
+              <w:rPr>
+                <w:b w:val="0"/>
+                <w:sz w:val="20"/>
+              </w:rPr>
+              <w:t>ci-cd-and-automation, git-workflow-and-versioning</w:t>
+            </w:r>
+          </w:p>
+        </w:tc>
+        <w:tc>
+          <w:tcPr>
+            <w:tcW w:type="dxa" w:w="4592"/>
+          </w:tcPr>
+          <w:p>
+            <w:pPr>
+              <w:spacing w:line="252" w:lineRule="auto" w:after="80"/>
+            </w:pPr>
+            <w:r>
+              <w:rPr>
+                <w:b w:val="0"/>
+                <w:sz w:val="20"/>
+              </w:rPr>
+              <w:t>Lint/format, audit dependencies, PostgreSQL tests, kiểm tra trình duyệt trong workflow; updater khóa theo commit</w:t>
+            </w:r>
+          </w:p>
+        </w:tc>
+      </w:tr>
+      <w:tr>
+        <w:tc>
+          <w:tcPr>
+            <w:tcW w:type="dxa" w:w="4592"/>
+          </w:tcPr>
+          <w:p>
+            <w:pPr>
+              <w:spacing w:line="252" w:lineRule="auto" w:after="80"/>
+            </w:pPr>
+            <w:r>
+              <w:rPr>
+                <w:b w:val="0"/>
+                <w:sz w:val="20"/>
+              </w:rPr>
+              <w:t>documentation-and-adrs, observability-and-instrumentation</w:t>
+            </w:r>
+          </w:p>
+        </w:tc>
+        <w:tc>
+          <w:tcPr>
+            <w:tcW w:type="dxa" w:w="4592"/>
+          </w:tcPr>
+          <w:p>
+            <w:pPr>
+              <w:spacing w:line="252" w:lineRule="auto" w:after="80"/>
+            </w:pPr>
+            <w:r>
+              <w:rPr>
+                <w:b w:val="0"/>
+                <w:sz w:val="20"/>
+              </w:rPr>
+              <w:t>Cập nhật hướng dẫn, báo cáo, từ điển dữ liệu; request ID và nhật ký an toàn, runbook</w:t>
+            </w:r>
+          </w:p>
+        </w:tc>
+      </w:tr>
+      <w:tr>
+        <w:tc>
+          <w:tcPr>
+            <w:tcW w:type="dxa" w:w="4592"/>
+          </w:tcPr>
+          <w:p>
+            <w:pPr>
+              <w:spacing w:line="252" w:lineRule="auto" w:after="80"/>
+            </w:pPr>
+            <w:r>
+              <w:rPr>
+                <w:b w:val="0"/>
+                <w:sz w:val="20"/>
+              </w:rPr>
+              <w:t>interview-me, idea-refine</w:t>
+            </w:r>
+          </w:p>
+        </w:tc>
+        <w:tc>
+          <w:tcPr>
+            <w:tcW w:type="dxa" w:w="4592"/>
+          </w:tcPr>
+          <w:p>
+            <w:pPr>
+              <w:spacing w:line="252" w:lineRule="auto" w:after="80"/>
+            </w:pPr>
+            <w:r>
+              <w:rPr>
+                <w:b w:val="0"/>
+                <w:sz w:val="20"/>
+              </w:rPr>
+              <w:t>Có sẵn cho yêu cầu mới; không tổ chức lại phỏng vấn vì phạm vi dự án đã được xác nhận</w:t>
+            </w:r>
+          </w:p>
+        </w:tc>
+      </w:tr>
+      <w:tr>
+        <w:tc>
+          <w:tcPr>
+            <w:tcW w:type="dxa" w:w="4592"/>
+          </w:tcPr>
+          <w:p>
+            <w:pPr>
+              <w:spacing w:line="252" w:lineRule="auto" w:after="80"/>
+            </w:pPr>
+            <w:r>
+              <w:rPr>
+                <w:b w:val="0"/>
+                <w:sz w:val="20"/>
+              </w:rPr>
+              <w:t>deprecation-and-migration</w:t>
+            </w:r>
+          </w:p>
+        </w:tc>
+        <w:tc>
+          <w:tcPr>
+            <w:tcW w:type="dxa" w:w="4592"/>
+          </w:tcPr>
+          <w:p>
+            <w:pPr>
+              <w:spacing w:line="252" w:lineRule="auto" w:after="80"/>
+            </w:pPr>
+            <w:r>
+              <w:rPr>
+                <w:b w:val="0"/>
+                <w:sz w:val="20"/>
+              </w:rPr>
+              <w:t>Nâng cấp tương thích qua migration, giữ lịch sử; không loại bỏ API/tính năng đang dùng</w:t>
+            </w:r>
+          </w:p>
+        </w:tc>
+      </w:tr>
+      <w:tr>
+        <w:tc>
+          <w:tcPr>
+            <w:tcW w:type="dxa" w:w="4592"/>
+          </w:tcPr>
+          <w:p>
+            <w:pPr>
+              <w:spacing w:line="252" w:lineRule="auto" w:after="80"/>
+            </w:pPr>
+            <w:r>
+              <w:rPr>
+                <w:b w:val="0"/>
+                <w:sz w:val="20"/>
+              </w:rPr>
+              <w:t>shipping-and-launch</w:t>
+            </w:r>
+          </w:p>
+        </w:tc>
+        <w:tc>
+          <w:tcPr>
+            <w:tcW w:type="dxa" w:w="4592"/>
+          </w:tcPr>
+          <w:p>
+            <w:pPr>
+              <w:spacing w:line="252" w:lineRule="auto" w:after="80"/>
+            </w:pPr>
+            <w:r>
+              <w:rPr>
+                <w:b w:val="0"/>
+                <w:sz w:val="20"/>
+              </w:rPr>
+              <w:t>Kiểm tra build/cập nhật mã và hướng dẫn vận hành; không thực hiện triển khai công khai hoặc tự gửi email thật</w:t>
+            </w:r>
+          </w:p>
+        </w:tc>
+      </w:tr>
+    </w:tbl>
+    <w:p/>
+    <w:p>
+      <w:pPr>
+        <w:jc w:val="both"/>
+      </w:pPr>
+      <w:r>
+        <w:t>Người dùng đã chọn tiếp tục với hai lượt rà soát hiện có, không bổ sung một lượt chạy bằng mô hình/CLI ngoài. Hai người rà soát thuộc cùng họ mô hình; đây không phải đánh giá bởi hai nhà cung cấp mô hình khác nhau. Việc cài đủ thư viện không có nghĩa mọi quy trình đều đã chạy đầy đủ hoặc hệ thống đã đạt chứng nhận bảo mật.</w:t>
+      </w:r>
+    </w:p>
+    <w:p>
+      <w:pPr>
+        <w:pStyle w:val="Heading2"/>
+      </w:pPr>
+      <w:r>
+        <w:t>4. Cập nhật trên máy Windows hiện có</w:t>
+      </w:r>
+    </w:p>
+    <w:p>
+      <w:pPr>
+        <w:jc w:val="both"/>
+      </w:pPr>
+      <w:r>
+        <w:t>Dừng server đang chạy trong VS Code. Cập nhật các file từ GitHub bằng công cụ cập nhật mã đang có (hoặc copy từng file), giữ .env, .venv, .local và database. Bản updater mới mang theo các file ẩn .agents, .github, AGENTS và cấu hình kiểm tra; bản updater cũ nên được thay bằng bản mới trước.</w:t>
+      </w:r>
+    </w:p>
+    <w:p>
+      <w:pPr>
+        <w:spacing w:line="252" w:lineRule="auto"/>
+        <w:ind w:left="170"/>
+      </w:pPr>
+      <w:r>
+        <w:rPr>
+          <w:rFonts w:ascii="Consolas" w:hAnsi="Consolas"/>
+          <w:sz w:val="18"/>
+        </w:rPr>
+        <w:t>.\.venv\Scripts\python.exe -m pip install --upgrade pip==26.2</w:t>
+        <w:br/>
+        <w:t>.\.venv\Scripts\python.exe -m pip install -r requirements.txt</w:t>
+        <w:br/>
+        <w:t>.\.venv\Scripts\python.exe manage.py backup_database</w:t>
+        <w:br/>
+        <w:t>.\.venv\Scripts\python.exe manage.py migrate --noinput</w:t>
+        <w:br/>
+        <w:t>.\.venv\Scripts\python.exe manage.py collectstatic --noinput</w:t>
+        <w:br/>
+        <w:t>.\.venv\Scripts\python.exe manage.py check</w:t>
+        <w:br/>
+        <w:t>.\.venv\Scripts\python.exe manage.py runserver</w:t>
+      </w:r>
+    </w:p>
+    <w:p>
+      <w:pPr>
+        <w:jc w:val="both"/>
+      </w:pPr>
+      <w:r>
+        <w:t>Nếu sao lưu chưa tìm thấy pg_dump, thêm vào .env đúng thư mục PostgreSQL đã xác định trên máy bạn:</w:t>
+      </w:r>
+    </w:p>
+    <w:p>
+      <w:pPr>
+        <w:spacing w:line="252" w:lineRule="auto"/>
+        <w:ind w:left="170"/>
+      </w:pPr>
+      <w:r>
+        <w:rPr>
+          <w:rFonts w:ascii="Consolas" w:hAnsi="Consolas"/>
+          <w:sz w:val="18"/>
+        </w:rPr>
+        <w:t>POSTGRES_BIN=D:/LTGISMAIN/PostgreSQL/18/bin</w:t>
+      </w:r>
+    </w:p>
+    <w:p>
+      <w:pPr>
+        <w:jc w:val="both"/>
+      </w:pPr>
+      <w:r>
+        <w:t>Mở http://127.0.0.1:8000/, nhấn Ctrl+F5 để nhận CSS/JS mới. Không cần Docker. Chỉ cài requirements-quality.txt khi muốn chạy bộ kiểm tra lập trình; Node/npm và axe chỉ dùng để kiểm tra trình duyệt, không cần cho việc chạy website thông thường.</w:t>
+      </w:r>
+    </w:p>
+    <w:p>
+      <w:pPr>
+        <w:pStyle w:val="Heading2"/>
+      </w:pPr>
+      <w:r>
+        <w:t>5. Kiểm tra và giới hạn bằng chứng</w:t>
+      </w:r>
+    </w:p>
+    <w:p>
+      <w:pPr>
+        <w:spacing w:line="252" w:lineRule="auto"/>
+        <w:ind w:left="170"/>
+      </w:pPr>
+      <w:r>
+        <w:rPr>
+          <w:rFonts w:ascii="Consolas" w:hAnsi="Consolas"/>
+          <w:sz w:val="18"/>
+        </w:rPr>
+        <w:t>.\.venv\Scripts\python.exe -m pip install -r requirements-quality.txt</w:t>
+        <w:br/>
+        <w:t>.\.venv\Scripts\python.exe -m ruff check salon config scripts</w:t>
+        <w:br/>
+        <w:t>.\.venv\Scripts\python.exe -m ruff format --check salon config scripts</w:t>
+        <w:br/>
+        <w:t>.\.venv\Scripts\python.exe -m pip_audit -r requirements.txt</w:t>
+        <w:br/>
+        <w:t>.\.venv\Scripts\python.exe scripts/verify_agent_skills.py</w:t>
+        <w:br/>
+        <w:t>.\.venv\Scripts\python.exe scripts/dev.py check</w:t>
+      </w:r>
+    </w:p>
+    <w:p>
+      <w:pPr>
+        <w:jc w:val="both"/>
+      </w:pPr>
+      <w:r>
+        <w:t>Để chạy kiểm tra truy cập trình duyệt: npm ci --ignore-scripts --prefix scripts/browser-audit, cài Chromium bằng Playwright, mở server local rồi chạy python scripts/quality_browser.py. Công cụ dùng tài khoản/session kiểm thử riêng, chỉ kết nối localhost, tự dọn dữ liệu mình tạo. Kết quả chỉ lưu route, selector và số đo; không lưu HTML có thông tin khách.</w:t>
+      </w:r>
+    </w:p>
+    <w:p>
+      <w:pPr>
+        <w:jc w:val="both"/>
+      </w:pPr>
+      <w:r>
+        <w:t>Xem bằng chứng cuối cùng trong docs/validation/14-AGENT-SKILLS.txt và các file JSON đi kèm. Đã chạy 179 test PostgreSQL và đối chiếu toàn bộ trường/dòng cũ trong 27 bảng cũ có tiền tố salon_ (gồm cả bảng nối phân quyền) với bản sao lưu đã phục hồi riêng (chỉ bỏ qua last_login do đăng nhập kiểm thử). Đã kiểm tra thực tế trên Python 3.12/PostgreSQL native. CI có cấu hình thêm Python 3.14; chỉ coi job GitHub Actions đạt khi đã xem kết quả chạy đó. Số đo LCP/CLS là phòng thử nghiệm CDP, không phải dữ liệu người dùng thật hoặc INP. Quét axe chỉ bao phủ các route/trạng thái đã ghi, không thay thế kiểm tra thủ công toàn bộ khả năng truy cập. Audit dependency chỉ phát hiện lỗ hổng đã công bố.</w:t>
+      </w:r>
+    </w:p>
+    <w:p>
+      <w:pPr>
+        <w:pStyle w:val="Heading2"/>
+      </w:pPr>
+      <w:r>
+        <w:t>6. Vận hành khi cần tìm lỗi</w:t>
+      </w:r>
+    </w:p>
+    <w:p>
+      <w:pPr>
+        <w:jc w:val="both"/>
+      </w:pPr>
+      <w:r>
+        <w:t>Ba câu hỏi nhật ký trả lời: route nào trả lỗi, mã yêu cầu nào cần tra, và thời gian xử lý có tăng không. Khi gặp lỗi, giữ X-Request-ID ở Network trong trình duyệt rồi tìm cùng mã trong terminal/log server; không dán password, cookie hay URL đặt lại mật khẩu. Nếu lỗi database, kiểm tra manage.py check_database; nếu lỗi sau nâng cấp, kiểm tra migration và static trước. Hóa đơn/hoàn tiền cần đối chiếu sổ, không thử gửi lại thanh toán liên tục.</w:t>
+      </w:r>
+    </w:p>
+    <w:p>
+      <w:pPr>
+        <w:jc w:val="both"/>
+      </w:pPr>
+      <w:r>
+        <w:t>Bộ đếm chỉ lưu HMAC và số lần/thời hạn; tự dọn tối đa 200 mục hết hạn khi tạo khóa mới. Có thể lên lịch hằng ngày manage.py prune_auth_limits để dọn hết mục hết hạn khi ít truy cập. Lệnh này không xóa tài khoản hoặc dữ liệu nghiệp vụ. Log xuất stdout; nếu lưu file, người vận hành đặt rotation/retention phù hợp. Email demo vẫn lưu ở .local/emails; không công khai thư mục này, dọn thư thử nghiệm và bảo quản bản sao lưu như dữ liệu riêng tư. Chứng từ tài chính vẫn được bảo toàn; lượt cập nhật này không tự xóa/anonymize hồ sơ khách hoặc đặt chính sách lưu chứng từ thay chủ hệ thống.</w:t>
       </w:r>
     </w:p>
     <w:sectPr>

</xml_diff>

<commit_message>
docs: record verified upgrade and data preservation evidence
</commit_message>
<xml_diff>
--- a/docs/BAO_CAO_PHAN_TICH_THIET_KE.docx
+++ b/docs/BAO_CAO_PHAN_TICH_THIET_KE.docx
@@ -31034,6 +31034,14 @@
       </w:pPr>
       <w:r>
         <w:t>Người dùng đã chọn tiếp tục với hai lượt rà soát hiện có, không bổ sung một lượt chạy bằng mô hình/CLI ngoài. Hai người rà soát thuộc cùng họ mô hình; đây không phải đánh giá bởi hai nhà cung cấp mô hình khác nhau. Việc cài đủ thư viện không có nghĩa mọi quy trình đều đã chạy đầy đủ hoặc hệ thống đã đạt chứng nhận bảo mật.</w:t>
+      </w:r>
+    </w:p>
+    <w:p>
+      <w:pPr>
+        <w:jc w:val="both"/>
+      </w:pPr>
+      <w:r>
+        <w:t>Danh sách từng file thay đổi để mở và copy: GitHub Compare.</w:t>
       </w:r>
     </w:p>
     <w:p>

</xml_diff>